<commit_message>
Continue thickening oral scripts toward full lecture length.
Add another round of speakable prose for all lessons and sync web/Word.
</commit_message>
<xml_diff>
--- a/各课具体教学内容.docx
+++ b/各课具体教学内容.docx
@@ -1267,6 +1267,227 @@
     </w:p>
     <w:p>
       <w:pPr>
+        <w:spacing w:after="120" w:line="324" w:lineRule="auto"/>
+      </w:pPr>
+      <w:r>
+        <w:rPr>
+          <w:rFonts w:ascii="微软雅黑" w:hAnsi="微软雅黑" w:eastAsia="微软雅黑"/>
+          <w:b/>
+          <w:sz w:val="26"/>
+        </w:rPr>
+        <w:t>续讲口述：Python 基本功再练一轮</w:t>
+      </w:r>
+    </w:p>
+    <w:p>
+      <w:pPr>
+        <w:spacing w:after="80" w:line="324" w:lineRule="auto"/>
+      </w:pPr>
+      <w:r>
+        <w:rPr>
+          <w:rFonts w:ascii="微软雅黑" w:hAnsi="微软雅黑" w:eastAsia="微软雅黑"/>
+          <w:b/>
+          <w:sz w:val="24"/>
+        </w:rPr>
+        <w:t>续讲点 1</w:t>
+      </w:r>
+    </w:p>
+    <w:p>
+      <w:pPr>
+        <w:spacing w:after="80" w:line="324" w:lineRule="auto"/>
+      </w:pPr>
+      <w:r>
+        <w:rPr>
+          <w:rFonts w:ascii="微软雅黑" w:hAnsi="微软雅黑" w:eastAsia="微软雅黑"/>
+          <w:b w:val="0"/>
+          <w:sz w:val="22"/>
+        </w:rPr>
+        <w:t>我们把打印纪律练成条件反射。写完赋值就打印，写完条件就打印，写完筛选就打印行数。很多人不是不会模型，是变量里装的东西和心里想的不一样。布尔条件写反，后面所有筛选都会学错样本。课上我故意把及格线写成小于六十，请你们从打印结果里把错误找出来，再改回大于等于六十。</w:t>
+      </w:r>
+    </w:p>
+    <w:p>
+      <w:pPr>
+        <w:spacing w:after="80" w:line="324" w:lineRule="auto"/>
+      </w:pPr>
+      <w:r>
+        <w:rPr>
+          <w:rFonts w:ascii="微软雅黑" w:hAnsi="微软雅黑" w:eastAsia="微软雅黑"/>
+          <w:b w:val="0"/>
+          <w:sz w:val="22"/>
+        </w:rPr>
+        <w:t>讲到这里先不要翻页。请用自己的话复述刚才三分钟的核心：输入是什么，输出是什么，最容易错在哪一步。复述不求漂亮，只求意思对。意思对了，才允许继续往下写代码。若你只能重复术语，说明还停留在名词层，我会再用大白话讲一遍。</w:t>
+      </w:r>
+    </w:p>
+    <w:p>
+      <w:pPr>
+        <w:spacing w:after="80" w:line="324" w:lineRule="auto"/>
+      </w:pPr>
+      <w:r>
+        <w:rPr>
+          <w:rFonts w:ascii="微软雅黑" w:hAnsi="微软雅黑" w:eastAsia="微软雅黑"/>
+          <w:b/>
+          <w:sz w:val="24"/>
+        </w:rPr>
+        <w:t>续讲点 2</w:t>
+      </w:r>
+    </w:p>
+    <w:p>
+      <w:pPr>
+        <w:spacing w:after="80" w:line="324" w:lineRule="auto"/>
+      </w:pPr>
+      <w:r>
+        <w:rPr>
+          <w:rFonts w:ascii="微软雅黑" w:hAnsi="微软雅黑" w:eastAsia="微软雅黑"/>
+          <w:b w:val="0"/>
+          <w:sz w:val="22"/>
+        </w:rPr>
+        <w:t>列表下标从零开始，请当成体能训练。我现场报五个分数，你们快速回答第零个、第二个、负一、切片二到四。答错立刻上机验证。机器学习取错行取错列，程序往往不报错，只是结果离谱，比语法错误更危险。列表还能改：append 之后长度变化，两个名字若指向同一对象，改一个另一个也变，先怀疑引用。</w:t>
+      </w:r>
+    </w:p>
+    <w:p>
+      <w:pPr>
+        <w:spacing w:after="80" w:line="324" w:lineRule="auto"/>
+      </w:pPr>
+      <w:r>
+        <w:rPr>
+          <w:rFonts w:ascii="微软雅黑" w:hAnsi="微软雅黑" w:eastAsia="微软雅黑"/>
+          <w:b w:val="0"/>
+          <w:sz w:val="22"/>
+        </w:rPr>
+        <w:t>讲到这里先不要翻页。请用自己的话复述刚才三分钟的核心：输入是什么，输出是什么，最容易错在哪一步。复述不求漂亮，只求意思对。意思对了，才允许继续往下写代码。若你只能重复术语，说明还停留在名词层，我会再用大白话讲一遍。</w:t>
+      </w:r>
+    </w:p>
+    <w:p>
+      <w:pPr>
+        <w:spacing w:after="80" w:line="324" w:lineRule="auto"/>
+      </w:pPr>
+      <w:r>
+        <w:rPr>
+          <w:rFonts w:ascii="微软雅黑" w:hAnsi="微软雅黑" w:eastAsia="微软雅黑"/>
+          <w:b/>
+          <w:sz w:val="24"/>
+        </w:rPr>
+        <w:t>续讲点 3</w:t>
+      </w:r>
+    </w:p>
+    <w:p>
+      <w:pPr>
+        <w:spacing w:after="80" w:line="324" w:lineRule="auto"/>
+      </w:pPr>
+      <w:r>
+        <w:rPr>
+          <w:rFonts w:ascii="微软雅黑" w:hAnsi="微软雅黑" w:eastAsia="微软雅黑"/>
+          <w:b w:val="0"/>
+          <w:sz w:val="22"/>
+        </w:rPr>
+        <w:t>字典按名字取字段。Pandas 一行像字典，一张表像很多字典排队。键不存在时用 get 给默认值，避免中断；但默认值也是假设，填零和填中位数故事不同。今天建立意识：默认不是随便写，是决策。</w:t>
+      </w:r>
+    </w:p>
+    <w:p>
+      <w:pPr>
+        <w:spacing w:after="80" w:line="324" w:lineRule="auto"/>
+      </w:pPr>
+      <w:r>
+        <w:rPr>
+          <w:rFonts w:ascii="微软雅黑" w:hAnsi="微软雅黑" w:eastAsia="微软雅黑"/>
+          <w:b w:val="0"/>
+          <w:sz w:val="22"/>
+        </w:rPr>
+        <w:t>讲到这里先不要翻页。请用自己的话复述刚才三分钟的核心：输入是什么，输出是什么，最容易错在哪一步。复述不求漂亮，只求意思对。意思对了，才允许继续往下写代码。若你只能重复术语，说明还停留在名词层，我会再用大白话讲一遍。</w:t>
+      </w:r>
+    </w:p>
+    <w:p>
+      <w:pPr>
+        <w:spacing w:after="80" w:line="324" w:lineRule="auto"/>
+      </w:pPr>
+      <w:r>
+        <w:rPr>
+          <w:rFonts w:ascii="微软雅黑" w:hAnsi="微软雅黑" w:eastAsia="微软雅黑"/>
+          <w:b/>
+          <w:sz w:val="24"/>
+        </w:rPr>
+        <w:t>续讲点 4</w:t>
+      </w:r>
+    </w:p>
+    <w:p>
+      <w:pPr>
+        <w:spacing w:after="80" w:line="324" w:lineRule="auto"/>
+      </w:pPr>
+      <w:r>
+        <w:rPr>
+          <w:rFonts w:ascii="微软雅黑" w:hAnsi="微软雅黑" w:eastAsia="微软雅黑"/>
+          <w:b w:val="0"/>
+          <w:sz w:val="22"/>
+        </w:rPr>
+        <w:t>函数用来反熵。清洗逻辑复制五份，改一处漏四处，训练集测试集就会不一致。写成函数，两边走同一入口。空列表、空表的返回值课上讨论清楚，培养边界意识。</w:t>
+      </w:r>
+    </w:p>
+    <w:p>
+      <w:pPr>
+        <w:spacing w:after="80" w:line="324" w:lineRule="auto"/>
+      </w:pPr>
+      <w:r>
+        <w:rPr>
+          <w:rFonts w:ascii="微软雅黑" w:hAnsi="微软雅黑" w:eastAsia="微软雅黑"/>
+          <w:b w:val="0"/>
+          <w:sz w:val="22"/>
+        </w:rPr>
+        <w:t>讲到这里先不要翻页。请用自己的话复述刚才三分钟的核心：输入是什么，输出是什么，最容易错在哪一步。复述不求漂亮，只求意思对。意思对了，才允许继续往下写代码。若你只能重复术语，说明还停留在名词层，我会再用大白话讲一遍。</w:t>
+      </w:r>
+    </w:p>
+    <w:p>
+      <w:pPr>
+        <w:spacing w:after="80" w:line="324" w:lineRule="auto"/>
+      </w:pPr>
+      <w:r>
+        <w:rPr>
+          <w:rFonts w:ascii="微软雅黑" w:hAnsi="微软雅黑" w:eastAsia="微软雅黑"/>
+          <w:b/>
+          <w:sz w:val="24"/>
+        </w:rPr>
+        <w:t>续讲点 5</w:t>
+      </w:r>
+    </w:p>
+    <w:p>
+      <w:pPr>
+        <w:spacing w:after="80" w:line="324" w:lineRule="auto"/>
+      </w:pPr>
+      <w:r>
+        <w:rPr>
+          <w:rFonts w:ascii="微软雅黑" w:hAnsi="微软雅黑" w:eastAsia="微软雅黑"/>
+          <w:b w:val="0"/>
+          <w:sz w:val="22"/>
+        </w:rPr>
+        <w:t>Pandas 四件套连做两遍：shape、head、info、describe。info 看类型，数字列若是字符串要用 to_numeric。describe 看极端值。筛选复合条件加括号，筛完立刻 head。综合练习：筛低分且高缺勤，写三段观察：看见什么、怀疑什么、下一步验证什么。</w:t>
+      </w:r>
+    </w:p>
+    <w:p>
+      <w:pPr>
+        <w:spacing w:after="80" w:line="324" w:lineRule="auto"/>
+      </w:pPr>
+      <w:r>
+        <w:rPr>
+          <w:rFonts w:ascii="微软雅黑" w:hAnsi="微软雅黑" w:eastAsia="微软雅黑"/>
+          <w:b w:val="0"/>
+          <w:sz w:val="22"/>
+        </w:rPr>
+        <w:t>讲到这里先不要翻页。请用自己的话复述刚才三分钟的核心：输入是什么，输出是什么，最容易错在哪一步。复述不求漂亮，只求意思对。意思对了，才允许继续往下写代码。若你只能重复术语，说明还停留在名词层，我会再用大白话讲一遍。</w:t>
+      </w:r>
+    </w:p>
+    <w:p>
+      <w:pPr>
+        <w:spacing w:after="80" w:line="324" w:lineRule="auto"/>
+      </w:pPr>
+      <w:r>
+        <w:rPr>
+          <w:rFonts w:ascii="微软雅黑" w:hAnsi="微软雅黑" w:eastAsia="微软雅黑"/>
+          <w:b w:val="0"/>
+          <w:sz w:val="22"/>
+        </w:rPr>
+        <w:t>本段续讲结束时，请在笔记本首页补三条：今日必会、今日易错、回家必做。下节课我会抽查这三条。抽查不是为难，是防止听过等于会了。</w:t>
+      </w:r>
+    </w:p>
+    <w:p>
+      <w:pPr>
         <w:spacing w:after="200" w:line="324" w:lineRule="auto"/>
       </w:pPr>
       <w:r>
@@ -2437,6 +2658,227 @@
     </w:p>
     <w:p>
       <w:pPr>
+        <w:spacing w:after="120" w:line="324" w:lineRule="auto"/>
+      </w:pPr>
+      <w:r>
+        <w:rPr>
+          <w:rFonts w:ascii="微软雅黑" w:hAnsi="微软雅黑" w:eastAsia="微软雅黑"/>
+          <w:b/>
+          <w:sz w:val="26"/>
+        </w:rPr>
+        <w:t>续讲口述：环境从能跑到稳跑</w:t>
+      </w:r>
+    </w:p>
+    <w:p>
+      <w:pPr>
+        <w:spacing w:after="80" w:line="324" w:lineRule="auto"/>
+      </w:pPr>
+      <w:r>
+        <w:rPr>
+          <w:rFonts w:ascii="微软雅黑" w:hAnsi="微软雅黑" w:eastAsia="微软雅黑"/>
+          <w:b/>
+          <w:sz w:val="24"/>
+        </w:rPr>
+        <w:t>续讲点 1</w:t>
+      </w:r>
+    </w:p>
+    <w:p>
+      <w:pPr>
+        <w:spacing w:after="80" w:line="324" w:lineRule="auto"/>
+      </w:pPr>
+      <w:r>
+        <w:rPr>
+          <w:rFonts w:ascii="微软雅黑" w:hAnsi="微软雅黑" w:eastAsia="微软雅黑"/>
+          <w:b w:val="0"/>
+          <w:sz w:val="22"/>
+        </w:rPr>
+        <w:t>环境课验收标准不是装完截图，是能稳定复现。教室电脑、自己的笔记本、云端三者不一致时，老师能跑你不能跑。目标是：固定创建、固定激活、固定关键包。把「能跑一次」升级成「换一天还能跑」，才叫环境过关。</w:t>
+      </w:r>
+    </w:p>
+    <w:p>
+      <w:pPr>
+        <w:spacing w:after="80" w:line="324" w:lineRule="auto"/>
+      </w:pPr>
+      <w:r>
+        <w:rPr>
+          <w:rFonts w:ascii="微软雅黑" w:hAnsi="微软雅黑" w:eastAsia="微软雅黑"/>
+          <w:b w:val="0"/>
+          <w:sz w:val="22"/>
+        </w:rPr>
+        <w:t>讲到这里先不要翻页。请用自己的话复述刚才三分钟的核心：输入是什么，输出是什么，最容易错在哪一步。复述不求漂亮，只求意思对。意思对了，才允许继续往下写代码。若你只能重复术语，说明还停留在名词层，我会再用大白话讲一遍。</w:t>
+      </w:r>
+    </w:p>
+    <w:p>
+      <w:pPr>
+        <w:spacing w:after="80" w:line="324" w:lineRule="auto"/>
+      </w:pPr>
+      <w:r>
+        <w:rPr>
+          <w:rFonts w:ascii="微软雅黑" w:hAnsi="微软雅黑" w:eastAsia="微软雅黑"/>
+          <w:b/>
+          <w:sz w:val="24"/>
+        </w:rPr>
+        <w:t>续讲点 2</w:t>
+      </w:r>
+    </w:p>
+    <w:p>
+      <w:pPr>
+        <w:spacing w:after="80" w:line="324" w:lineRule="auto"/>
+      </w:pPr>
+      <w:r>
+        <w:rPr>
+          <w:rFonts w:ascii="微软雅黑" w:hAnsi="微软雅黑" w:eastAsia="微软雅黑"/>
+          <w:b w:val="0"/>
+          <w:sz w:val="22"/>
+        </w:rPr>
+        <w:t>解释器对质：Notebook 打印 sys.executable，终端同一环境再核对。不一致就先对齐再装包。装错环境等于装给空气。故意不激活就 pip，再 import 失败，演完假成功再纠正。VS Code 用户尤其要盯右下角解释器路径。</w:t>
+      </w:r>
+    </w:p>
+    <w:p>
+      <w:pPr>
+        <w:spacing w:after="80" w:line="324" w:lineRule="auto"/>
+      </w:pPr>
+      <w:r>
+        <w:rPr>
+          <w:rFonts w:ascii="微软雅黑" w:hAnsi="微软雅黑" w:eastAsia="微软雅黑"/>
+          <w:b w:val="0"/>
+          <w:sz w:val="22"/>
+        </w:rPr>
+        <w:t>讲到这里先不要翻页。请用自己的话复述刚才三分钟的核心：输入是什么，输出是什么，最容易错在哪一步。复述不求漂亮，只求意思对。意思对了，才允许继续往下写代码。若你只能重复术语，说明还停留在名词层，我会再用大白话讲一遍。</w:t>
+      </w:r>
+    </w:p>
+    <w:p>
+      <w:pPr>
+        <w:spacing w:after="80" w:line="324" w:lineRule="auto"/>
+      </w:pPr>
+      <w:r>
+        <w:rPr>
+          <w:rFonts w:ascii="微软雅黑" w:hAnsi="微软雅黑" w:eastAsia="微软雅黑"/>
+          <w:b/>
+          <w:sz w:val="24"/>
+        </w:rPr>
+        <w:t>续讲点 3</w:t>
+      </w:r>
+    </w:p>
+    <w:p>
+      <w:pPr>
+        <w:spacing w:after="80" w:line="324" w:lineRule="auto"/>
+      </w:pPr>
+      <w:r>
+        <w:rPr>
+          <w:rFonts w:ascii="微软雅黑" w:hAnsi="微软雅黑" w:eastAsia="微软雅黑"/>
+          <w:b w:val="0"/>
+          <w:sz w:val="22"/>
+        </w:rPr>
+        <w:t>Jupyter 单元格乱序会制造假成功。提交前 Restart Kernel 再 Run All。Markdown 写结论，代码做计算。内核卡住就重启，不要连环点运行。输出截图不能替代可运行文件，老师要的是能复现的笔记本。</w:t>
+      </w:r>
+    </w:p>
+    <w:p>
+      <w:pPr>
+        <w:spacing w:after="80" w:line="324" w:lineRule="auto"/>
+      </w:pPr>
+      <w:r>
+        <w:rPr>
+          <w:rFonts w:ascii="微软雅黑" w:hAnsi="微软雅黑" w:eastAsia="微软雅黑"/>
+          <w:b w:val="0"/>
+          <w:sz w:val="22"/>
+        </w:rPr>
+        <w:t>讲到这里先不要翻页。请用自己的话复述刚才三分钟的核心：输入是什么，输出是什么，最容易错在哪一步。复述不求漂亮，只求意思对。意思对了，才允许继续往下写代码。若你只能重复术语，说明还停留在名词层，我会再用大白话讲一遍。</w:t>
+      </w:r>
+    </w:p>
+    <w:p>
+      <w:pPr>
+        <w:spacing w:after="80" w:line="324" w:lineRule="auto"/>
+      </w:pPr>
+      <w:r>
+        <w:rPr>
+          <w:rFonts w:ascii="微软雅黑" w:hAnsi="微软雅黑" w:eastAsia="微软雅黑"/>
+          <w:b/>
+          <w:sz w:val="24"/>
+        </w:rPr>
+        <w:t>续讲点 4</w:t>
+      </w:r>
+    </w:p>
+    <w:p>
+      <w:pPr>
+        <w:spacing w:after="80" w:line="324" w:lineRule="auto"/>
+      </w:pPr>
+      <w:r>
+        <w:rPr>
+          <w:rFonts w:ascii="微软雅黑" w:hAnsi="微软雅黑" w:eastAsia="微软雅黑"/>
+          <w:b w:val="0"/>
+          <w:sz w:val="22"/>
+        </w:rPr>
+        <w:t>路径、编码、工作目录解释一半报错。中文路径偶发坑，课程项目尽量英文目录。CSV 试 utf-8-sig。随机种子写第一格，库版本写进说明，方便作业互评复现。原始数据与清洗数据分开命名，避免把 raw 覆盖掉。</w:t>
+      </w:r>
+    </w:p>
+    <w:p>
+      <w:pPr>
+        <w:spacing w:after="80" w:line="324" w:lineRule="auto"/>
+      </w:pPr>
+      <w:r>
+        <w:rPr>
+          <w:rFonts w:ascii="微软雅黑" w:hAnsi="微软雅黑" w:eastAsia="微软雅黑"/>
+          <w:b w:val="0"/>
+          <w:sz w:val="22"/>
+        </w:rPr>
+        <w:t>讲到这里先不要翻页。请用自己的话复述刚才三分钟的核心：输入是什么，输出是什么，最容易错在哪一步。复述不求漂亮，只求意思对。意思对了，才允许继续往下写代码。若你只能重复术语，说明还停留在名词层，我会再用大白话讲一遍。</w:t>
+      </w:r>
+    </w:p>
+    <w:p>
+      <w:pPr>
+        <w:spacing w:after="80" w:line="324" w:lineRule="auto"/>
+      </w:pPr>
+      <w:r>
+        <w:rPr>
+          <w:rFonts w:ascii="微软雅黑" w:hAnsi="微软雅黑" w:eastAsia="微软雅黑"/>
+          <w:b/>
+          <w:sz w:val="24"/>
+        </w:rPr>
+        <w:t>续讲点 5</w:t>
+      </w:r>
+    </w:p>
+    <w:p>
+      <w:pPr>
+        <w:spacing w:after="80" w:line="324" w:lineRule="auto"/>
+      </w:pPr>
+      <w:r>
+        <w:rPr>
+          <w:rFonts w:ascii="微软雅黑" w:hAnsi="微软雅黑" w:eastAsia="微软雅黑"/>
+          <w:b w:val="0"/>
+          <w:sz w:val="22"/>
+        </w:rPr>
+        <w:t>排障分层：不能 import 看环境；找不到文件看路径；图不显示看是否执行绘图格。下课前两人一组，一人报错一人排障，用清单走通。会排障，后面算法课才快。环境问题今天清零，注意力才能留给模型。</w:t>
+      </w:r>
+    </w:p>
+    <w:p>
+      <w:pPr>
+        <w:spacing w:after="80" w:line="324" w:lineRule="auto"/>
+      </w:pPr>
+      <w:r>
+        <w:rPr>
+          <w:rFonts w:ascii="微软雅黑" w:hAnsi="微软雅黑" w:eastAsia="微软雅黑"/>
+          <w:b w:val="0"/>
+          <w:sz w:val="22"/>
+        </w:rPr>
+        <w:t>讲到这里先不要翻页。请用自己的话复述刚才三分钟的核心：输入是什么，输出是什么，最容易错在哪一步。复述不求漂亮，只求意思对。意思对了，才允许继续往下写代码。若你只能重复术语，说明还停留在名词层，我会再用大白话讲一遍。</w:t>
+      </w:r>
+    </w:p>
+    <w:p>
+      <w:pPr>
+        <w:spacing w:after="80" w:line="324" w:lineRule="auto"/>
+      </w:pPr>
+      <w:r>
+        <w:rPr>
+          <w:rFonts w:ascii="微软雅黑" w:hAnsi="微软雅黑" w:eastAsia="微软雅黑"/>
+          <w:b w:val="0"/>
+          <w:sz w:val="22"/>
+        </w:rPr>
+        <w:t>本段续讲结束时，请在笔记本首页补三条：今日必会、今日易错、回家必做。下节课我会抽查这三条。抽查不是为难，是防止听过等于会了。</w:t>
+      </w:r>
+    </w:p>
+    <w:p>
+      <w:pPr>
         <w:spacing w:after="200" w:line="324" w:lineRule="auto"/>
       </w:pPr>
       <w:r>
@@ -3633,6 +4075,227 @@
     </w:p>
     <w:p>
       <w:pPr>
+        <w:spacing w:after="120" w:line="324" w:lineRule="auto"/>
+      </w:pPr>
+      <w:r>
+        <w:rPr>
+          <w:rFonts w:ascii="微软雅黑" w:hAnsi="微软雅黑" w:eastAsia="微软雅黑"/>
+          <w:b/>
+          <w:sz w:val="26"/>
+        </w:rPr>
+        <w:t>续讲口述：可视化把看图说话练熟</w:t>
+      </w:r>
+    </w:p>
+    <w:p>
+      <w:pPr>
+        <w:spacing w:after="80" w:line="324" w:lineRule="auto"/>
+      </w:pPr>
+      <w:r>
+        <w:rPr>
+          <w:rFonts w:ascii="微软雅黑" w:hAnsi="微软雅黑" w:eastAsia="微软雅黑"/>
+          <w:b/>
+          <w:sz w:val="24"/>
+        </w:rPr>
+        <w:t>续讲点 1</w:t>
+      </w:r>
+    </w:p>
+    <w:p>
+      <w:pPr>
+        <w:spacing w:after="80" w:line="324" w:lineRule="auto"/>
+      </w:pPr>
+      <w:r>
+        <w:rPr>
+          <w:rFonts w:ascii="微软雅黑" w:hAnsi="微软雅黑" w:eastAsia="微软雅黑"/>
+          <w:b w:val="0"/>
+          <w:sz w:val="22"/>
+        </w:rPr>
+        <w:t>每张图必须回答问题：偏态？失衡？同向？离群？没有问题的图是装饰。限时训练：三十秒说峰、偏、尾巴，禁止空话「挺好的」。</w:t>
+      </w:r>
+    </w:p>
+    <w:p>
+      <w:pPr>
+        <w:spacing w:after="80" w:line="324" w:lineRule="auto"/>
+      </w:pPr>
+      <w:r>
+        <w:rPr>
+          <w:rFonts w:ascii="微软雅黑" w:hAnsi="微软雅黑" w:eastAsia="微软雅黑"/>
+          <w:b w:val="0"/>
+          <w:sz w:val="22"/>
+        </w:rPr>
+        <w:t>讲到这里先不要翻页。请用自己的话复述刚才三分钟的核心：输入是什么，输出是什么，最容易错在哪一步。复述不求漂亮，只求意思对。意思对了，才允许继续往下写代码。若你只能重复术语，说明还停留在名词层，我会再用大白话讲一遍。</w:t>
+      </w:r>
+    </w:p>
+    <w:p>
+      <w:pPr>
+        <w:spacing w:after="80" w:line="324" w:lineRule="auto"/>
+      </w:pPr>
+      <w:r>
+        <w:rPr>
+          <w:rFonts w:ascii="微软雅黑" w:hAnsi="微软雅黑" w:eastAsia="微软雅黑"/>
+          <w:b/>
+          <w:sz w:val="24"/>
+        </w:rPr>
+        <w:t>续讲点 2</w:t>
+      </w:r>
+    </w:p>
+    <w:p>
+      <w:pPr>
+        <w:spacing w:after="80" w:line="324" w:lineRule="auto"/>
+      </w:pPr>
+      <w:r>
+        <w:rPr>
+          <w:rFonts w:ascii="微软雅黑" w:hAnsi="微软雅黑" w:eastAsia="微软雅黑"/>
+          <w:b w:val="0"/>
+          <w:sz w:val="22"/>
+        </w:rPr>
+        <w:t>散点看趋势与离群。删点必须有理由：录入错误可以删，真实大客户慎删。相关不是因果，每次念一遍。点太多加透明度或抽样，抽样固定种子。</w:t>
+      </w:r>
+    </w:p>
+    <w:p>
+      <w:pPr>
+        <w:spacing w:after="80" w:line="324" w:lineRule="auto"/>
+      </w:pPr>
+      <w:r>
+        <w:rPr>
+          <w:rFonts w:ascii="微软雅黑" w:hAnsi="微软雅黑" w:eastAsia="微软雅黑"/>
+          <w:b w:val="0"/>
+          <w:sz w:val="22"/>
+        </w:rPr>
+        <w:t>讲到这里先不要翻页。请用自己的话复述刚才三分钟的核心：输入是什么，输出是什么，最容易错在哪一步。复述不求漂亮，只求意思对。意思对了，才允许继续往下写代码。若你只能重复术语，说明还停留在名词层，我会再用大白话讲一遍。</w:t>
+      </w:r>
+    </w:p>
+    <w:p>
+      <w:pPr>
+        <w:spacing w:after="80" w:line="324" w:lineRule="auto"/>
+      </w:pPr>
+      <w:r>
+        <w:rPr>
+          <w:rFonts w:ascii="微软雅黑" w:hAnsi="微软雅黑" w:eastAsia="微软雅黑"/>
+          <w:b/>
+          <w:sz w:val="24"/>
+        </w:rPr>
+        <w:t>续讲点 3</w:t>
+      </w:r>
+    </w:p>
+    <w:p>
+      <w:pPr>
+        <w:spacing w:after="80" w:line="324" w:lineRule="auto"/>
+      </w:pPr>
+      <w:r>
+        <w:rPr>
+          <w:rFonts w:ascii="微软雅黑" w:hAnsi="微软雅黑" w:eastAsia="微软雅黑"/>
+          <w:b w:val="0"/>
+          <w:sz w:val="22"/>
+        </w:rPr>
+        <w:t>坏图找茬：截断纵轴、双轴乱加、饼图类别过多、无标题无单位。指出问题并给改法。诚实优先于刺激。</w:t>
+      </w:r>
+    </w:p>
+    <w:p>
+      <w:pPr>
+        <w:spacing w:after="80" w:line="324" w:lineRule="auto"/>
+      </w:pPr>
+      <w:r>
+        <w:rPr>
+          <w:rFonts w:ascii="微软雅黑" w:hAnsi="微软雅黑" w:eastAsia="微软雅黑"/>
+          <w:b w:val="0"/>
+          <w:sz w:val="22"/>
+        </w:rPr>
+        <w:t>讲到这里先不要翻页。请用自己的话复述刚才三分钟的核心：输入是什么，输出是什么，最容易错在哪一步。复述不求漂亮，只求意思对。意思对了，才允许继续往下写代码。若你只能重复术语，说明还停留在名词层，我会再用大白话讲一遍。</w:t>
+      </w:r>
+    </w:p>
+    <w:p>
+      <w:pPr>
+        <w:spacing w:after="80" w:line="324" w:lineRule="auto"/>
+      </w:pPr>
+      <w:r>
+        <w:rPr>
+          <w:rFonts w:ascii="微软雅黑" w:hAnsi="微软雅黑" w:eastAsia="微软雅黑"/>
+          <w:b/>
+          <w:sz w:val="24"/>
+        </w:rPr>
+        <w:t>续讲点 4</w:t>
+      </w:r>
+    </w:p>
+    <w:p>
+      <w:pPr>
+        <w:spacing w:after="80" w:line="324" w:lineRule="auto"/>
+      </w:pPr>
+      <w:r>
+        <w:rPr>
+          <w:rFonts w:ascii="微软雅黑" w:hAnsi="微软雅黑" w:eastAsia="微软雅黑"/>
+          <w:b w:val="0"/>
+          <w:sz w:val="22"/>
+        </w:rPr>
+        <w:t>面向建模：失衡则分类别只报准确率；共线则线性模型系数不稳；缺失热力指导删填。可视化是预处理导航。</w:t>
+      </w:r>
+    </w:p>
+    <w:p>
+      <w:pPr>
+        <w:spacing w:after="80" w:line="324" w:lineRule="auto"/>
+      </w:pPr>
+      <w:r>
+        <w:rPr>
+          <w:rFonts w:ascii="微软雅黑" w:hAnsi="微软雅黑" w:eastAsia="微软雅黑"/>
+          <w:b w:val="0"/>
+          <w:sz w:val="22"/>
+        </w:rPr>
+        <w:t>讲到这里先不要翻页。请用自己的话复述刚才三分钟的核心：输入是什么，输出是什么，最容易错在哪一步。复述不求漂亮，只求意思对。意思对了，才允许继续往下写代码。若你只能重复术语，说明还停留在名词层，我会再用大白话讲一遍。</w:t>
+      </w:r>
+    </w:p>
+    <w:p>
+      <w:pPr>
+        <w:spacing w:after="80" w:line="324" w:lineRule="auto"/>
+      </w:pPr>
+      <w:r>
+        <w:rPr>
+          <w:rFonts w:ascii="微软雅黑" w:hAnsi="微软雅黑" w:eastAsia="微软雅黑"/>
+          <w:b/>
+          <w:sz w:val="24"/>
+        </w:rPr>
+        <w:t>续讲点 5</w:t>
+      </w:r>
+    </w:p>
+    <w:p>
+      <w:pPr>
+        <w:spacing w:after="80" w:line="324" w:lineRule="auto"/>
+      </w:pPr>
+      <w:r>
+        <w:rPr>
+          <w:rFonts w:ascii="微软雅黑" w:hAnsi="微软雅黑" w:eastAsia="微软雅黑"/>
+          <w:b w:val="0"/>
+          <w:sz w:val="22"/>
+        </w:rPr>
+        <w:t>作业：四图四结论加一百字总述，必须写对建模的建议。只有图没有字退回。后面残差图、聚类散点、词频条形都会回来。</w:t>
+      </w:r>
+    </w:p>
+    <w:p>
+      <w:pPr>
+        <w:spacing w:after="80" w:line="324" w:lineRule="auto"/>
+      </w:pPr>
+      <w:r>
+        <w:rPr>
+          <w:rFonts w:ascii="微软雅黑" w:hAnsi="微软雅黑" w:eastAsia="微软雅黑"/>
+          <w:b w:val="0"/>
+          <w:sz w:val="22"/>
+        </w:rPr>
+        <w:t>讲到这里先不要翻页。请用自己的话复述刚才三分钟的核心：输入是什么，输出是什么，最容易错在哪一步。复述不求漂亮，只求意思对。意思对了，才允许继续往下写代码。若你只能重复术语，说明还停留在名词层，我会再用大白话讲一遍。</w:t>
+      </w:r>
+    </w:p>
+    <w:p>
+      <w:pPr>
+        <w:spacing w:after="80" w:line="324" w:lineRule="auto"/>
+      </w:pPr>
+      <w:r>
+        <w:rPr>
+          <w:rFonts w:ascii="微软雅黑" w:hAnsi="微软雅黑" w:eastAsia="微软雅黑"/>
+          <w:b w:val="0"/>
+          <w:sz w:val="22"/>
+        </w:rPr>
+        <w:t>本段续讲结束时，请在笔记本首页补三条：今日必会、今日易错、回家必做。下节课我会抽查这三条。抽查不是为难，是防止听过等于会了。</w:t>
+      </w:r>
+    </w:p>
+    <w:p>
+      <w:pPr>
         <w:spacing w:after="200" w:line="324" w:lineRule="auto"/>
       </w:pPr>
       <w:r>
@@ -4816,6 +5479,227 @@
     </w:p>
     <w:p>
       <w:pPr>
+        <w:spacing w:after="120" w:line="324" w:lineRule="auto"/>
+      </w:pPr>
+      <w:r>
+        <w:rPr>
+          <w:rFonts w:ascii="微软雅黑" w:hAnsi="微软雅黑" w:eastAsia="微软雅黑"/>
+          <w:b/>
+          <w:sz w:val="26"/>
+        </w:rPr>
+        <w:t>续讲口述：预处理红线与流水线</w:t>
+      </w:r>
+    </w:p>
+    <w:p>
+      <w:pPr>
+        <w:spacing w:after="80" w:line="324" w:lineRule="auto"/>
+      </w:pPr>
+      <w:r>
+        <w:rPr>
+          <w:rFonts w:ascii="微软雅黑" w:hAnsi="微软雅黑" w:eastAsia="微软雅黑"/>
+          <w:b/>
+          <w:sz w:val="24"/>
+        </w:rPr>
+        <w:t>续讲点 1</w:t>
+      </w:r>
+    </w:p>
+    <w:p>
+      <w:pPr>
+        <w:spacing w:after="80" w:line="324" w:lineRule="auto"/>
+      </w:pPr>
+      <w:r>
+        <w:rPr>
+          <w:rFonts w:ascii="微软雅黑" w:hAnsi="微软雅黑" w:eastAsia="微软雅黑"/>
+          <w:b w:val="0"/>
+          <w:sz w:val="22"/>
+        </w:rPr>
+        <w:t>泄漏红线慢放：全数据算均值再划分，测试虚高；先划分再 fit 火车 transform 考卷，分数回落。两次分数写黑板，纪律靠落差记住。</w:t>
+      </w:r>
+    </w:p>
+    <w:p>
+      <w:pPr>
+        <w:spacing w:after="80" w:line="324" w:lineRule="auto"/>
+      </w:pPr>
+      <w:r>
+        <w:rPr>
+          <w:rFonts w:ascii="微软雅黑" w:hAnsi="微软雅黑" w:eastAsia="微软雅黑"/>
+          <w:b w:val="0"/>
+          <w:sz w:val="22"/>
+        </w:rPr>
+        <w:t>讲到这里先不要翻页。请用自己的话复述刚才三分钟的核心：输入是什么，输出是什么，最容易错在哪一步。复述不求漂亮，只求意思对。意思对了，才允许继续往下写代码。若你只能重复术语，说明还停留在名词层，我会再用大白话讲一遍。</w:t>
+      </w:r>
+    </w:p>
+    <w:p>
+      <w:pPr>
+        <w:spacing w:after="80" w:line="324" w:lineRule="auto"/>
+      </w:pPr>
+      <w:r>
+        <w:rPr>
+          <w:rFonts w:ascii="微软雅黑" w:hAnsi="微软雅黑" w:eastAsia="微软雅黑"/>
+          <w:b/>
+          <w:sz w:val="24"/>
+        </w:rPr>
+        <w:t>续讲点 2</w:t>
+      </w:r>
+    </w:p>
+    <w:p>
+      <w:pPr>
+        <w:spacing w:after="80" w:line="324" w:lineRule="auto"/>
+      </w:pPr>
+      <w:r>
+        <w:rPr>
+          <w:rFonts w:ascii="微软雅黑" w:hAnsi="微软雅黑" w:eastAsia="微软雅黑"/>
+          <w:b w:val="0"/>
+          <w:sz w:val="22"/>
+        </w:rPr>
+        <w:t>缺失策略列表：列名、缺失率、删或填、理由。「想提高分数」不是理由。缺本身有时是信号，可做缺失指示列。</w:t>
+      </w:r>
+    </w:p>
+    <w:p>
+      <w:pPr>
+        <w:spacing w:after="80" w:line="324" w:lineRule="auto"/>
+      </w:pPr>
+      <w:r>
+        <w:rPr>
+          <w:rFonts w:ascii="微软雅黑" w:hAnsi="微软雅黑" w:eastAsia="微软雅黑"/>
+          <w:b w:val="0"/>
+          <w:sz w:val="22"/>
+        </w:rPr>
+        <w:t>讲到这里先不要翻页。请用自己的话复述刚才三分钟的核心：输入是什么，输出是什么，最容易错在哪一步。复述不求漂亮，只求意思对。意思对了，才允许继续往下写代码。若你只能重复术语，说明还停留在名词层，我会再用大白话讲一遍。</w:t>
+      </w:r>
+    </w:p>
+    <w:p>
+      <w:pPr>
+        <w:spacing w:after="80" w:line="324" w:lineRule="auto"/>
+      </w:pPr>
+      <w:r>
+        <w:rPr>
+          <w:rFonts w:ascii="微软雅黑" w:hAnsi="微软雅黑" w:eastAsia="微软雅黑"/>
+          <w:b/>
+          <w:sz w:val="24"/>
+        </w:rPr>
+        <w:t>续讲点 3</w:t>
+      </w:r>
+    </w:p>
+    <w:p>
+      <w:pPr>
+        <w:spacing w:after="80" w:line="324" w:lineRule="auto"/>
+      </w:pPr>
+      <w:r>
+        <w:rPr>
+          <w:rFonts w:ascii="微软雅黑" w:hAnsi="微软雅黑" w:eastAsia="微软雅黑"/>
+          <w:b w:val="0"/>
+          <w:sz w:val="22"/>
+        </w:rPr>
+        <w:t>异常先业务问答。极端消费可能是大客户，删掉会上线后对重要人不准。截尾、分箱、单独建模都是选项，自动删除最省事也最危险。</w:t>
+      </w:r>
+    </w:p>
+    <w:p>
+      <w:pPr>
+        <w:spacing w:after="80" w:line="324" w:lineRule="auto"/>
+      </w:pPr>
+      <w:r>
+        <w:rPr>
+          <w:rFonts w:ascii="微软雅黑" w:hAnsi="微软雅黑" w:eastAsia="微软雅黑"/>
+          <w:b w:val="0"/>
+          <w:sz w:val="22"/>
+        </w:rPr>
+        <w:t>讲到这里先不要翻页。请用自己的话复述刚才三分钟的核心：输入是什么，输出是什么，最容易错在哪一步。复述不求漂亮，只求意思对。意思对了，才允许继续往下写代码。若你只能重复术语，说明还停留在名词层，我会再用大白话讲一遍。</w:t>
+      </w:r>
+    </w:p>
+    <w:p>
+      <w:pPr>
+        <w:spacing w:after="80" w:line="324" w:lineRule="auto"/>
+      </w:pPr>
+      <w:r>
+        <w:rPr>
+          <w:rFonts w:ascii="微软雅黑" w:hAnsi="微软雅黑" w:eastAsia="微软雅黑"/>
+          <w:b/>
+          <w:sz w:val="24"/>
+        </w:rPr>
+        <w:t>续讲点 4</w:t>
+      </w:r>
+    </w:p>
+    <w:p>
+      <w:pPr>
+        <w:spacing w:after="80" w:line="324" w:lineRule="auto"/>
+      </w:pPr>
+      <w:r>
+        <w:rPr>
+          <w:rFonts w:ascii="微软雅黑" w:hAnsi="微软雅黑" w:eastAsia="微软雅黑"/>
+          <w:b w:val="0"/>
+          <w:sz w:val="22"/>
+        </w:rPr>
+        <w:t>量纲：距离类与正则类常需标准化；树模型不敏感。scaler 只 fit 火车。类别：无序 one-hot，稀有水平合并，规则写入笔记保证一致。</w:t>
+      </w:r>
+    </w:p>
+    <w:p>
+      <w:pPr>
+        <w:spacing w:after="80" w:line="324" w:lineRule="auto"/>
+      </w:pPr>
+      <w:r>
+        <w:rPr>
+          <w:rFonts w:ascii="微软雅黑" w:hAnsi="微软雅黑" w:eastAsia="微软雅黑"/>
+          <w:b w:val="0"/>
+          <w:sz w:val="22"/>
+        </w:rPr>
+        <w:t>讲到这里先不要翻页。请用自己的话复述刚才三分钟的核心：输入是什么，输出是什么，最容易错在哪一步。复述不求漂亮，只求意思对。意思对了，才允许继续往下写代码。若你只能重复术语，说明还停留在名词层，我会再用大白话讲一遍。</w:t>
+      </w:r>
+    </w:p>
+    <w:p>
+      <w:pPr>
+        <w:spacing w:after="80" w:line="324" w:lineRule="auto"/>
+      </w:pPr>
+      <w:r>
+        <w:rPr>
+          <w:rFonts w:ascii="微软雅黑" w:hAnsi="微软雅黑" w:eastAsia="微软雅黑"/>
+          <w:b/>
+          <w:sz w:val="24"/>
+        </w:rPr>
+        <w:t>续讲点 5</w:t>
+      </w:r>
+    </w:p>
+    <w:p>
+      <w:pPr>
+        <w:spacing w:after="80" w:line="324" w:lineRule="auto"/>
+      </w:pPr>
+      <w:r>
+        <w:rPr>
+          <w:rFonts w:ascii="微软雅黑" w:hAnsi="微软雅黑" w:eastAsia="微软雅黑"/>
+          <w:b w:val="0"/>
+          <w:sz w:val="22"/>
+        </w:rPr>
+        <w:t>口令背熟：体检、切分、填充、编码、缩放、检查 shape。时间数据按时间切，不能随机打乱。下节课抽查口令。</w:t>
+      </w:r>
+    </w:p>
+    <w:p>
+      <w:pPr>
+        <w:spacing w:after="80" w:line="324" w:lineRule="auto"/>
+      </w:pPr>
+      <w:r>
+        <w:rPr>
+          <w:rFonts w:ascii="微软雅黑" w:hAnsi="微软雅黑" w:eastAsia="微软雅黑"/>
+          <w:b w:val="0"/>
+          <w:sz w:val="22"/>
+        </w:rPr>
+        <w:t>讲到这里先不要翻页。请用自己的话复述刚才三分钟的核心：输入是什么，输出是什么，最容易错在哪一步。复述不求漂亮，只求意思对。意思对了，才允许继续往下写代码。若你只能重复术语，说明还停留在名词层，我会再用大白话讲一遍。</w:t>
+      </w:r>
+    </w:p>
+    <w:p>
+      <w:pPr>
+        <w:spacing w:after="80" w:line="324" w:lineRule="auto"/>
+      </w:pPr>
+      <w:r>
+        <w:rPr>
+          <w:rFonts w:ascii="微软雅黑" w:hAnsi="微软雅黑" w:eastAsia="微软雅黑"/>
+          <w:b w:val="0"/>
+          <w:sz w:val="22"/>
+        </w:rPr>
+        <w:t>本段续讲结束时，请在笔记本首页补三条：今日必会、今日易错、回家必做。下节课我会抽查这三条。抽查不是为难，是防止听过等于会了。</w:t>
+      </w:r>
+    </w:p>
+    <w:p>
+      <w:pPr>
         <w:spacing w:after="200" w:line="324" w:lineRule="auto"/>
       </w:pPr>
       <w:r>
@@ -6025,6 +6909,227 @@
     </w:p>
     <w:p>
       <w:pPr>
+        <w:spacing w:after="120" w:line="324" w:lineRule="auto"/>
+      </w:pPr>
+      <w:r>
+        <w:rPr>
+          <w:rFonts w:ascii="微软雅黑" w:hAnsi="微软雅黑" w:eastAsia="微软雅黑"/>
+          <w:b/>
+          <w:sz w:val="26"/>
+        </w:rPr>
+        <w:t>续讲口述：回归与最小二乘再钉牢</w:t>
+      </w:r>
+    </w:p>
+    <w:p>
+      <w:pPr>
+        <w:spacing w:after="80" w:line="324" w:lineRule="auto"/>
+      </w:pPr>
+      <w:r>
+        <w:rPr>
+          <w:rFonts w:ascii="微软雅黑" w:hAnsi="微软雅黑" w:eastAsia="微软雅黑"/>
+          <w:b/>
+          <w:sz w:val="24"/>
+        </w:rPr>
+        <w:t>续讲点 1</w:t>
+      </w:r>
+    </w:p>
+    <w:p>
+      <w:pPr>
+        <w:spacing w:after="80" w:line="324" w:lineRule="auto"/>
+      </w:pPr>
+      <w:r>
+        <w:rPr>
+          <w:rFonts w:ascii="微软雅黑" w:hAnsi="微软雅黑" w:eastAsia="微软雅黑"/>
+          <w:b w:val="0"/>
+          <w:sz w:val="22"/>
+        </w:rPr>
+        <w:t>最小二乘最小化残差平方和。正负直接加会抵消；平方让大错更痛，故怕离群。加一个离群点看直线被拽歪，印象最深。</w:t>
+      </w:r>
+    </w:p>
+    <w:p>
+      <w:pPr>
+        <w:spacing w:after="80" w:line="324" w:lineRule="auto"/>
+      </w:pPr>
+      <w:r>
+        <w:rPr>
+          <w:rFonts w:ascii="微软雅黑" w:hAnsi="微软雅黑" w:eastAsia="微软雅黑"/>
+          <w:b w:val="0"/>
+          <w:sz w:val="22"/>
+        </w:rPr>
+        <w:t>讲到这里先不要翻页。请用自己的话复述刚才三分钟的核心：输入是什么，输出是什么，最容易错在哪一步。复述不求漂亮，只求意思对。意思对了，才允许继续往下写代码。若你只能重复术语，说明还停留在名词层，我会再用大白话讲一遍。</w:t>
+      </w:r>
+    </w:p>
+    <w:p>
+      <w:pPr>
+        <w:spacing w:after="80" w:line="324" w:lineRule="auto"/>
+      </w:pPr>
+      <w:r>
+        <w:rPr>
+          <w:rFonts w:ascii="微软雅黑" w:hAnsi="微软雅黑" w:eastAsia="微软雅黑"/>
+          <w:b/>
+          <w:sz w:val="24"/>
+        </w:rPr>
+        <w:t>续讲点 2</w:t>
+      </w:r>
+    </w:p>
+    <w:p>
+      <w:pPr>
+        <w:spacing w:after="80" w:line="324" w:lineRule="auto"/>
+      </w:pPr>
+      <w:r>
+        <w:rPr>
+          <w:rFonts w:ascii="微软雅黑" w:hAnsi="微软雅黑" w:eastAsia="微软雅黑"/>
+          <w:b w:val="0"/>
+          <w:sz w:val="22"/>
+        </w:rPr>
+        <w:t>指标一组看：MAE 好懂，RMSE 疼大错，R2 看相对基线。残差若弯曲或喇叭形，说明形式不够或异方差，别只报一个数字。</w:t>
+      </w:r>
+    </w:p>
+    <w:p>
+      <w:pPr>
+        <w:spacing w:after="80" w:line="324" w:lineRule="auto"/>
+      </w:pPr>
+      <w:r>
+        <w:rPr>
+          <w:rFonts w:ascii="微软雅黑" w:hAnsi="微软雅黑" w:eastAsia="微软雅黑"/>
+          <w:b w:val="0"/>
+          <w:sz w:val="22"/>
+        </w:rPr>
+        <w:t>讲到这里先不要翻页。请用自己的话复述刚才三分钟的核心：输入是什么，输出是什么，最容易错在哪一步。复述不求漂亮，只求意思对。意思对了，才允许继续往下写代码。若你只能重复术语，说明还停留在名词层，我会再用大白话讲一遍。</w:t>
+      </w:r>
+    </w:p>
+    <w:p>
+      <w:pPr>
+        <w:spacing w:after="80" w:line="324" w:lineRule="auto"/>
+      </w:pPr>
+      <w:r>
+        <w:rPr>
+          <w:rFonts w:ascii="微软雅黑" w:hAnsi="微软雅黑" w:eastAsia="微软雅黑"/>
+          <w:b/>
+          <w:sz w:val="24"/>
+        </w:rPr>
+        <w:t>续讲点 3</w:t>
+      </w:r>
+    </w:p>
+    <w:p>
+      <w:pPr>
+        <w:spacing w:after="80" w:line="324" w:lineRule="auto"/>
+      </w:pPr>
+      <w:r>
+        <w:rPr>
+          <w:rFonts w:ascii="微软雅黑" w:hAnsi="微软雅黑" w:eastAsia="微软雅黑"/>
+          <w:b w:val="0"/>
+          <w:sz w:val="22"/>
+        </w:rPr>
+        <w:t>系数解释要谨慎。量纲不同时「系数更大」不等于更重要。共线时符号可能乱。先看散点相关，再讲影响。</w:t>
+      </w:r>
+    </w:p>
+    <w:p>
+      <w:pPr>
+        <w:spacing w:after="80" w:line="324" w:lineRule="auto"/>
+      </w:pPr>
+      <w:r>
+        <w:rPr>
+          <w:rFonts w:ascii="微软雅黑" w:hAnsi="微软雅黑" w:eastAsia="微软雅黑"/>
+          <w:b w:val="0"/>
+          <w:sz w:val="22"/>
+        </w:rPr>
+        <w:t>讲到这里先不要翻页。请用自己的话复述刚才三分钟的核心：输入是什么，输出是什么，最容易错在哪一步。复述不求漂亮，只求意思对。意思对了，才允许继续往下写代码。若你只能重复术语，说明还停留在名词层，我会再用大白话讲一遍。</w:t>
+      </w:r>
+    </w:p>
+    <w:p>
+      <w:pPr>
+        <w:spacing w:after="80" w:line="324" w:lineRule="auto"/>
+      </w:pPr>
+      <w:r>
+        <w:rPr>
+          <w:rFonts w:ascii="微软雅黑" w:hAnsi="微软雅黑" w:eastAsia="微软雅黑"/>
+          <w:b/>
+          <w:sz w:val="24"/>
+        </w:rPr>
+        <w:t>续讲点 4</w:t>
+      </w:r>
+    </w:p>
+    <w:p>
+      <w:pPr>
+        <w:spacing w:after="80" w:line="324" w:lineRule="auto"/>
+      </w:pPr>
+      <w:r>
+        <w:rPr>
+          <w:rFonts w:ascii="微软雅黑" w:hAnsi="微软雅黑" w:eastAsia="微软雅黑"/>
+          <w:b w:val="0"/>
+          <w:sz w:val="22"/>
+        </w:rPr>
+        <w:t>Ridge 压缩，Lasso 可稀疏。alpha 靠验证，训练集越小 alpha 越好看往往是幻觉。多项式升阶易过拟合，从二阶对比开始。</w:t>
+      </w:r>
+    </w:p>
+    <w:p>
+      <w:pPr>
+        <w:spacing w:after="80" w:line="324" w:lineRule="auto"/>
+      </w:pPr>
+      <w:r>
+        <w:rPr>
+          <w:rFonts w:ascii="微软雅黑" w:hAnsi="微软雅黑" w:eastAsia="微软雅黑"/>
+          <w:b w:val="0"/>
+          <w:sz w:val="22"/>
+        </w:rPr>
+        <w:t>讲到这里先不要翻页。请用自己的话复述刚才三分钟的核心：输入是什么，输出是什么，最容易错在哪一步。复述不求漂亮，只求意思对。意思对了，才允许继续往下写代码。若你只能重复术语，说明还停留在名词层，我会再用大白话讲一遍。</w:t>
+      </w:r>
+    </w:p>
+    <w:p>
+      <w:pPr>
+        <w:spacing w:after="80" w:line="324" w:lineRule="auto"/>
+      </w:pPr>
+      <w:r>
+        <w:rPr>
+          <w:rFonts w:ascii="微软雅黑" w:hAnsi="微软雅黑" w:eastAsia="微软雅黑"/>
+          <w:b/>
+          <w:sz w:val="24"/>
+        </w:rPr>
+        <w:t>续讲点 5</w:t>
+      </w:r>
+    </w:p>
+    <w:p>
+      <w:pPr>
+        <w:spacing w:after="80" w:line="324" w:lineRule="auto"/>
+      </w:pPr>
+      <w:r>
+        <w:rPr>
+          <w:rFonts w:ascii="微软雅黑" w:hAnsi="微软雅黑" w:eastAsia="微软雅黑"/>
+          <w:b w:val="0"/>
+          <w:sz w:val="22"/>
+        </w:rPr>
+        <w:t>案例结构：问题、图、预处理、至少两模型、只在测试集报分、残差与结论。缺观察只交分数，不算会回归。</w:t>
+      </w:r>
+    </w:p>
+    <w:p>
+      <w:pPr>
+        <w:spacing w:after="80" w:line="324" w:lineRule="auto"/>
+      </w:pPr>
+      <w:r>
+        <w:rPr>
+          <w:rFonts w:ascii="微软雅黑" w:hAnsi="微软雅黑" w:eastAsia="微软雅黑"/>
+          <w:b w:val="0"/>
+          <w:sz w:val="22"/>
+        </w:rPr>
+        <w:t>讲到这里先不要翻页。请用自己的话复述刚才三分钟的核心：输入是什么，输出是什么，最容易错在哪一步。复述不求漂亮，只求意思对。意思对了，才允许继续往下写代码。若你只能重复术语，说明还停留在名词层，我会再用大白话讲一遍。</w:t>
+      </w:r>
+    </w:p>
+    <w:p>
+      <w:pPr>
+        <w:spacing w:after="80" w:line="324" w:lineRule="auto"/>
+      </w:pPr>
+      <w:r>
+        <w:rPr>
+          <w:rFonts w:ascii="微软雅黑" w:hAnsi="微软雅黑" w:eastAsia="微软雅黑"/>
+          <w:b w:val="0"/>
+          <w:sz w:val="22"/>
+        </w:rPr>
+        <w:t>本段续讲结束时，请在笔记本首页补三条：今日必会、今日易错、回家必做。下节课我会抽查这三条。抽查不是为难，是防止听过等于会了。</w:t>
+      </w:r>
+    </w:p>
+    <w:p>
+      <w:pPr>
         <w:spacing w:after="200" w:line="324" w:lineRule="auto"/>
       </w:pPr>
       <w:r>
@@ -7208,6 +8313,227 @@
     </w:p>
     <w:p>
       <w:pPr>
+        <w:spacing w:after="120" w:line="324" w:lineRule="auto"/>
+      </w:pPr>
+      <w:r>
+        <w:rPr>
+          <w:rFonts w:ascii="微软雅黑" w:hAnsi="微软雅黑" w:eastAsia="微软雅黑"/>
+          <w:b/>
+          <w:sz w:val="26"/>
+        </w:rPr>
+        <w:t>续讲口述：关联规则三指标与方向</w:t>
+      </w:r>
+    </w:p>
+    <w:p>
+      <w:pPr>
+        <w:spacing w:after="80" w:line="324" w:lineRule="auto"/>
+      </w:pPr>
+      <w:r>
+        <w:rPr>
+          <w:rFonts w:ascii="微软雅黑" w:hAnsi="微软雅黑" w:eastAsia="微软雅黑"/>
+          <w:b/>
+          <w:sz w:val="24"/>
+        </w:rPr>
+        <w:t>续讲点 1</w:t>
+      </w:r>
+    </w:p>
+    <w:p>
+      <w:pPr>
+        <w:spacing w:after="80" w:line="324" w:lineRule="auto"/>
+      </w:pPr>
+      <w:r>
+        <w:rPr>
+          <w:rFonts w:ascii="微软雅黑" w:hAnsi="微软雅黑" w:eastAsia="微软雅黑"/>
+          <w:b w:val="0"/>
+          <w:sz w:val="22"/>
+        </w:rPr>
+        <w:t>手算：同现、前件、后件、全场基数。Support 看常见，Confidence 看稳定，Lift 看是否强过随机。热门后件会制造假高置信度，Lift 揭穿它。</w:t>
+      </w:r>
+    </w:p>
+    <w:p>
+      <w:pPr>
+        <w:spacing w:after="80" w:line="324" w:lineRule="auto"/>
+      </w:pPr>
+      <w:r>
+        <w:rPr>
+          <w:rFonts w:ascii="微软雅黑" w:hAnsi="微软雅黑" w:eastAsia="微软雅黑"/>
+          <w:b w:val="0"/>
+          <w:sz w:val="22"/>
+        </w:rPr>
+        <w:t>讲到这里先不要翻页。请用自己的话复述刚才三分钟的核心：输入是什么，输出是什么，最容易错在哪一步。复述不求漂亮，只求意思对。意思对了，才允许继续往下写代码。若你只能重复术语，说明还停留在名词层，我会再用大白话讲一遍。</w:t>
+      </w:r>
+    </w:p>
+    <w:p>
+      <w:pPr>
+        <w:spacing w:after="80" w:line="324" w:lineRule="auto"/>
+      </w:pPr>
+      <w:r>
+        <w:rPr>
+          <w:rFonts w:ascii="微软雅黑" w:hAnsi="微软雅黑" w:eastAsia="微软雅黑"/>
+          <w:b/>
+          <w:sz w:val="24"/>
+        </w:rPr>
+        <w:t>续讲点 2</w:t>
+      </w:r>
+    </w:p>
+    <w:p>
+      <w:pPr>
+        <w:spacing w:after="80" w:line="324" w:lineRule="auto"/>
+      </w:pPr>
+      <w:r>
+        <w:rPr>
+          <w:rFonts w:ascii="微软雅黑" w:hAnsi="微软雅黑" w:eastAsia="微软雅黑"/>
+          <w:b w:val="0"/>
+          <w:sz w:val="22"/>
+        </w:rPr>
+        <w:t>规则有方向。A 推 B 与 B 推 A 的置信度可以差很多。推荐与货架要选对方向，不能把共现当成双向理由。</w:t>
+      </w:r>
+    </w:p>
+    <w:p>
+      <w:pPr>
+        <w:spacing w:after="80" w:line="324" w:lineRule="auto"/>
+      </w:pPr>
+      <w:r>
+        <w:rPr>
+          <w:rFonts w:ascii="微软雅黑" w:hAnsi="微软雅黑" w:eastAsia="微软雅黑"/>
+          <w:b w:val="0"/>
+          <w:sz w:val="22"/>
+        </w:rPr>
+        <w:t>讲到这里先不要翻页。请用自己的话复述刚才三分钟的核心：输入是什么，输出是什么，最容易错在哪一步。复述不求漂亮，只求意思对。意思对了，才允许继续往下写代码。若你只能重复术语，说明还停留在名词层，我会再用大白话讲一遍。</w:t>
+      </w:r>
+    </w:p>
+    <w:p>
+      <w:pPr>
+        <w:spacing w:after="80" w:line="324" w:lineRule="auto"/>
+      </w:pPr>
+      <w:r>
+        <w:rPr>
+          <w:rFonts w:ascii="微软雅黑" w:hAnsi="微软雅黑" w:eastAsia="微软雅黑"/>
+          <w:b/>
+          <w:sz w:val="24"/>
+        </w:rPr>
+        <w:t>续讲点 3</w:t>
+      </w:r>
+    </w:p>
+    <w:p>
+      <w:pPr>
+        <w:spacing w:after="80" w:line="324" w:lineRule="auto"/>
+      </w:pPr>
+      <w:r>
+        <w:rPr>
+          <w:rFonts w:ascii="微软雅黑" w:hAnsi="微软雅黑" w:eastAsia="微软雅黑"/>
+          <w:b w:val="0"/>
+          <w:sz w:val="22"/>
+        </w:rPr>
+        <w:t>阈值从紧到松，再人工挑可行动规则。正确但无新信息的规则，例如手机壳推手机，要会丢弃。</w:t>
+      </w:r>
+    </w:p>
+    <w:p>
+      <w:pPr>
+        <w:spacing w:after="80" w:line="324" w:lineRule="auto"/>
+      </w:pPr>
+      <w:r>
+        <w:rPr>
+          <w:rFonts w:ascii="微软雅黑" w:hAnsi="微软雅黑" w:eastAsia="微软雅黑"/>
+          <w:b w:val="0"/>
+          <w:sz w:val="22"/>
+        </w:rPr>
+        <w:t>讲到这里先不要翻页。请用自己的话复述刚才三分钟的核心：输入是什么，输出是什么，最容易错在哪一步。复述不求漂亮，只求意思对。意思对了，才允许继续往下写代码。若你只能重复术语，说明还停留在名词层，我会再用大白话讲一遍。</w:t>
+      </w:r>
+    </w:p>
+    <w:p>
+      <w:pPr>
+        <w:spacing w:after="80" w:line="324" w:lineRule="auto"/>
+      </w:pPr>
+      <w:r>
+        <w:rPr>
+          <w:rFonts w:ascii="微软雅黑" w:hAnsi="微软雅黑" w:eastAsia="微软雅黑"/>
+          <w:b/>
+          <w:sz w:val="24"/>
+        </w:rPr>
+        <w:t>续讲点 4</w:t>
+      </w:r>
+    </w:p>
+    <w:p>
+      <w:pPr>
+        <w:spacing w:after="80" w:line="324" w:lineRule="auto"/>
+      </w:pPr>
+      <w:r>
+        <w:rPr>
+          <w:rFonts w:ascii="微软雅黑" w:hAnsi="微软雅黑" w:eastAsia="微软雅黑"/>
+          <w:b w:val="0"/>
+          <w:sz w:val="22"/>
+        </w:rPr>
+        <w:t>粒度：订单还是用户，天还是促销周，故事不同。先定义任务再调参。关联不是因果，夏天冰淇淋与溺水是反例。</w:t>
+      </w:r>
+    </w:p>
+    <w:p>
+      <w:pPr>
+        <w:spacing w:after="80" w:line="324" w:lineRule="auto"/>
+      </w:pPr>
+      <w:r>
+        <w:rPr>
+          <w:rFonts w:ascii="微软雅黑" w:hAnsi="微软雅黑" w:eastAsia="微软雅黑"/>
+          <w:b w:val="0"/>
+          <w:sz w:val="22"/>
+        </w:rPr>
+        <w:t>讲到这里先不要翻页。请用自己的话复述刚才三分钟的核心：输入是什么，输出是什么，最容易错在哪一步。复述不求漂亮，只求意思对。意思对了，才允许继续往下写代码。若你只能重复术语，说明还停留在名词层，我会再用大白话讲一遍。</w:t>
+      </w:r>
+    </w:p>
+    <w:p>
+      <w:pPr>
+        <w:spacing w:after="80" w:line="324" w:lineRule="auto"/>
+      </w:pPr>
+      <w:r>
+        <w:rPr>
+          <w:rFonts w:ascii="微软雅黑" w:hAnsi="微软雅黑" w:eastAsia="微软雅黑"/>
+          <w:b/>
+          <w:sz w:val="24"/>
+        </w:rPr>
+        <w:t>续讲点 5</w:t>
+      </w:r>
+    </w:p>
+    <w:p>
+      <w:pPr>
+        <w:spacing w:after="80" w:line="324" w:lineRule="auto"/>
+      </w:pPr>
+      <w:r>
+        <w:rPr>
+          <w:rFonts w:ascii="微软雅黑" w:hAnsi="微软雅黑" w:eastAsia="微软雅黑"/>
+          <w:b w:val="0"/>
+          <w:sz w:val="22"/>
+        </w:rPr>
+        <w:t>交付：Top 规则写成运营三句话覆盖、准不准、有没有增益。关联课练筛选力。</w:t>
+      </w:r>
+    </w:p>
+    <w:p>
+      <w:pPr>
+        <w:spacing w:after="80" w:line="324" w:lineRule="auto"/>
+      </w:pPr>
+      <w:r>
+        <w:rPr>
+          <w:rFonts w:ascii="微软雅黑" w:hAnsi="微软雅黑" w:eastAsia="微软雅黑"/>
+          <w:b w:val="0"/>
+          <w:sz w:val="22"/>
+        </w:rPr>
+        <w:t>讲到这里先不要翻页。请用自己的话复述刚才三分钟的核心：输入是什么，输出是什么，最容易错在哪一步。复述不求漂亮，只求意思对。意思对了，才允许继续往下写代码。若你只能重复术语，说明还停留在名词层，我会再用大白话讲一遍。</w:t>
+      </w:r>
+    </w:p>
+    <w:p>
+      <w:pPr>
+        <w:spacing w:after="80" w:line="324" w:lineRule="auto"/>
+      </w:pPr>
+      <w:r>
+        <w:rPr>
+          <w:rFonts w:ascii="微软雅黑" w:hAnsi="微软雅黑" w:eastAsia="微软雅黑"/>
+          <w:b w:val="0"/>
+          <w:sz w:val="22"/>
+        </w:rPr>
+        <w:t>本段续讲结束时，请在笔记本首页补三条：今日必会、今日易错、回家必做。下节课我会抽查这三条。抽查不是为难，是防止听过等于会了。</w:t>
+      </w:r>
+    </w:p>
+    <w:p>
+      <w:pPr>
         <w:spacing w:after="200" w:line="324" w:lineRule="auto"/>
       </w:pPr>
       <w:r>
@@ -8352,6 +9678,253 @@
     </w:p>
     <w:p>
       <w:pPr>
+        <w:spacing w:after="120" w:line="324" w:lineRule="auto"/>
+      </w:pPr>
+      <w:r>
+        <w:rPr>
+          <w:rFonts w:ascii="微软雅黑" w:hAnsi="微软雅黑" w:eastAsia="微软雅黑"/>
+          <w:b/>
+          <w:sz w:val="26"/>
+        </w:rPr>
+        <w:t>续讲口述：聚类要可解释可动作</w:t>
+      </w:r>
+    </w:p>
+    <w:p>
+      <w:pPr>
+        <w:spacing w:after="80" w:line="324" w:lineRule="auto"/>
+      </w:pPr>
+      <w:r>
+        <w:rPr>
+          <w:rFonts w:ascii="微软雅黑" w:hAnsi="微软雅黑" w:eastAsia="微软雅黑"/>
+          <w:b/>
+          <w:sz w:val="24"/>
+        </w:rPr>
+        <w:t>续讲点 1</w:t>
+      </w:r>
+    </w:p>
+    <w:p>
+      <w:pPr>
+        <w:spacing w:after="80" w:line="324" w:lineRule="auto"/>
+      </w:pPr>
+      <w:r>
+        <w:rPr>
+          <w:rFonts w:ascii="微软雅黑" w:hAnsi="微软雅黑" w:eastAsia="微软雅黑"/>
+          <w:b w:val="0"/>
+          <w:sz w:val="22"/>
+        </w:rPr>
+        <w:t>K-Means：分配、更新中心、迭代。尺度不统一会被大数绑架，标准化前后对比必做。初始化不同结果可能不同，多跑或固定种子。</w:t>
+      </w:r>
+    </w:p>
+    <w:p>
+      <w:pPr>
+        <w:spacing w:after="80" w:line="324" w:lineRule="auto"/>
+      </w:pPr>
+      <w:r>
+        <w:rPr>
+          <w:rFonts w:ascii="微软雅黑" w:hAnsi="微软雅黑" w:eastAsia="微软雅黑"/>
+          <w:b w:val="0"/>
+          <w:sz w:val="22"/>
+        </w:rPr>
+        <w:t>讲到这里先不要翻页。请用自己的话复述刚才三分钟的核心：输入是什么，输出是什么，最容易错在哪一步。复述不求漂亮，只求意思对。意思对了，才允许继续往下写代码。若你只能重复术语，说明还停留在名词层，我会再用大白话讲一遍。</w:t>
+      </w:r>
+    </w:p>
+    <w:p>
+      <w:pPr>
+        <w:spacing w:after="80" w:line="324" w:lineRule="auto"/>
+      </w:pPr>
+      <w:r>
+        <w:rPr>
+          <w:rFonts w:ascii="微软雅黑" w:hAnsi="微软雅黑" w:eastAsia="微软雅黑"/>
+          <w:b/>
+          <w:sz w:val="24"/>
+        </w:rPr>
+        <w:t>续讲点 2</w:t>
+      </w:r>
+    </w:p>
+    <w:p>
+      <w:pPr>
+        <w:spacing w:after="80" w:line="324" w:lineRule="auto"/>
+      </w:pPr>
+      <w:r>
+        <w:rPr>
+          <w:rFonts w:ascii="微软雅黑" w:hAnsi="微软雅黑" w:eastAsia="微软雅黑"/>
+          <w:b w:val="0"/>
+          <w:sz w:val="22"/>
+        </w:rPr>
+        <w:t>选 K：肘部、轮廓、业务。轮廓高但簇极小不稳定就别选。编号无序，不能说零比一高级。</w:t>
+      </w:r>
+    </w:p>
+    <w:p>
+      <w:pPr>
+        <w:spacing w:after="80" w:line="324" w:lineRule="auto"/>
+      </w:pPr>
+      <w:r>
+        <w:rPr>
+          <w:rFonts w:ascii="微软雅黑" w:hAnsi="微软雅黑" w:eastAsia="微软雅黑"/>
+          <w:b w:val="0"/>
+          <w:sz w:val="22"/>
+        </w:rPr>
+        <w:t>讲到这里先不要翻页。请用自己的话复述刚才三分钟的核心：输入是什么，输出是什么，最容易错在哪一步。复述不求漂亮，只求意思对。意思对了，才允许继续往下写代码。若你只能重复术语，说明还停留在名词层，我会再用大白话讲一遍。</w:t>
+      </w:r>
+    </w:p>
+    <w:p>
+      <w:pPr>
+        <w:spacing w:after="80" w:line="324" w:lineRule="auto"/>
+      </w:pPr>
+      <w:r>
+        <w:rPr>
+          <w:rFonts w:ascii="微软雅黑" w:hAnsi="微软雅黑" w:eastAsia="微软雅黑"/>
+          <w:b/>
+          <w:sz w:val="24"/>
+        </w:rPr>
+        <w:t>续讲点 3</w:t>
+      </w:r>
+    </w:p>
+    <w:p>
+      <w:pPr>
+        <w:spacing w:after="80" w:line="324" w:lineRule="auto"/>
+      </w:pPr>
+      <w:r>
+        <w:rPr>
+          <w:rFonts w:ascii="微软雅黑" w:hAnsi="微软雅黑" w:eastAsia="微软雅黑"/>
+          <w:b w:val="0"/>
+          <w:sz w:val="22"/>
+        </w:rPr>
+        <w:t>画像：均值表、人话命名、运营或教学动作、风险。没有动作的彩色散点不算交付。</w:t>
+      </w:r>
+    </w:p>
+    <w:p>
+      <w:pPr>
+        <w:spacing w:after="80" w:line="324" w:lineRule="auto"/>
+      </w:pPr>
+      <w:r>
+        <w:rPr>
+          <w:rFonts w:ascii="微软雅黑" w:hAnsi="微软雅黑" w:eastAsia="微软雅黑"/>
+          <w:b w:val="0"/>
+          <w:sz w:val="22"/>
+        </w:rPr>
+        <w:t>讲到这里先不要翻页。请用自己的话复述刚才三分钟的核心：输入是什么，输出是什么，最容易错在哪一步。复述不求漂亮，只求意思对。意思对了，才允许继续往下写代码。若你只能重复术语，说明还停留在名词层，我会再用大白话讲一遍。</w:t>
+      </w:r>
+    </w:p>
+    <w:p>
+      <w:pPr>
+        <w:spacing w:after="80" w:line="324" w:lineRule="auto"/>
+      </w:pPr>
+      <w:r>
+        <w:rPr>
+          <w:rFonts w:ascii="微软雅黑" w:hAnsi="微软雅黑" w:eastAsia="微软雅黑"/>
+          <w:b/>
+          <w:sz w:val="24"/>
+        </w:rPr>
+        <w:t>续讲点 4</w:t>
+      </w:r>
+    </w:p>
+    <w:p>
+      <w:pPr>
+        <w:spacing w:after="80" w:line="324" w:lineRule="auto"/>
+      </w:pPr>
+      <w:r>
+        <w:rPr>
+          <w:rFonts w:ascii="微软雅黑" w:hAnsi="微软雅黑" w:eastAsia="微软雅黑"/>
+          <w:b w:val="0"/>
+          <w:sz w:val="22"/>
+        </w:rPr>
+        <w:t>局限：偏球形、固定 K、怕异常。月牙形数据要知道换思路。上线需固定中心，避免天天重训打乱人群 ID。</w:t>
+      </w:r>
+    </w:p>
+    <w:p>
+      <w:pPr>
+        <w:spacing w:after="80" w:line="324" w:lineRule="auto"/>
+      </w:pPr>
+      <w:r>
+        <w:rPr>
+          <w:rFonts w:ascii="微软雅黑" w:hAnsi="微软雅黑" w:eastAsia="微软雅黑"/>
+          <w:b w:val="0"/>
+          <w:sz w:val="22"/>
+        </w:rPr>
+        <w:t>讲到这里先不要翻页。请用自己的话复述刚才三分钟的核心：输入是什么，输出是什么，最容易错在哪一步。复述不求漂亮，只求意思对。意思对了，才允许继续往下写代码。若你只能重复术语，说明还停留在名词层，我会再用大白话讲一遍。</w:t>
+      </w:r>
+    </w:p>
+    <w:p>
+      <w:pPr>
+        <w:spacing w:after="80" w:line="324" w:lineRule="auto"/>
+      </w:pPr>
+      <w:r>
+        <w:rPr>
+          <w:rFonts w:ascii="微软雅黑" w:hAnsi="微软雅黑" w:eastAsia="微软雅黑"/>
+          <w:b/>
+          <w:sz w:val="24"/>
+        </w:rPr>
+        <w:t>续讲点 5</w:t>
+      </w:r>
+    </w:p>
+    <w:p>
+      <w:pPr>
+        <w:spacing w:after="80" w:line="324" w:lineRule="auto"/>
+      </w:pPr>
+      <w:r>
+        <w:rPr>
+          <w:rFonts w:ascii="微软雅黑" w:hAnsi="微软雅黑" w:eastAsia="微软雅黑"/>
+          <w:b w:val="0"/>
+          <w:sz w:val="22"/>
+        </w:rPr>
+        <w:t>作业交三簇说明书。解释过程比 inertia 更重要。聚类是提问机，不是真理机。</w:t>
+      </w:r>
+    </w:p>
+    <w:p>
+      <w:pPr>
+        <w:spacing w:after="80" w:line="324" w:lineRule="auto"/>
+      </w:pPr>
+      <w:r>
+        <w:rPr>
+          <w:rFonts w:ascii="微软雅黑" w:hAnsi="微软雅黑" w:eastAsia="微软雅黑"/>
+          <w:b w:val="0"/>
+          <w:sz w:val="22"/>
+        </w:rPr>
+        <w:t>讲到这里先不要翻页。请用自己的话复述刚才三分钟的核心：输入是什么，输出是什么，最容易错在哪一步。复述不求漂亮，只求意思对。意思对了，才允许继续往下写代码。若你只能重复术语，说明还停留在名词层，我会再用大白话讲一遍。</w:t>
+      </w:r>
+    </w:p>
+    <w:p>
+      <w:pPr>
+        <w:spacing w:after="80" w:line="324" w:lineRule="auto"/>
+      </w:pPr>
+      <w:r>
+        <w:rPr>
+          <w:rFonts w:ascii="微软雅黑" w:hAnsi="微软雅黑" w:eastAsia="微软雅黑"/>
+          <w:b w:val="0"/>
+          <w:sz w:val="22"/>
+        </w:rPr>
+        <w:t>本段续讲结束时，请在笔记本首页补三条：今日必会、今日易错、回家必做。下节课我会抽查这三条。抽查不是为难，是防止听过等于会了。</w:t>
+      </w:r>
+    </w:p>
+    <w:p>
+      <w:pPr>
+        <w:spacing w:after="120" w:line="324" w:lineRule="auto"/>
+      </w:pPr>
+      <w:r>
+        <w:rPr>
+          <w:rFonts w:ascii="微软雅黑" w:hAnsi="微软雅黑" w:eastAsia="微软雅黑"/>
+          <w:b/>
+          <w:sz w:val="26"/>
+        </w:rPr>
+        <w:t>加时续讲：聚类再补五分钟</w:t>
+      </w:r>
+    </w:p>
+    <w:p>
+      <w:pPr>
+        <w:spacing w:after="80" w:line="324" w:lineRule="auto"/>
+      </w:pPr>
+      <w:r>
+        <w:rPr>
+          <w:rFonts w:ascii="微软雅黑" w:hAnsi="微软雅黑" w:eastAsia="微软雅黑"/>
+          <w:b w:val="0"/>
+          <w:sz w:val="22"/>
+        </w:rPr>
+        <w:t>簇再漂亮，讲不出人话就不及格。请用一分钟给每一簇起名，并说一个可执行动作。若有人说「就是第零类」，请他重来。稳定性也提醒一句：明天重训，编号可能对调，上线要固定中心。</w:t>
+      </w:r>
+    </w:p>
+    <w:p>
+      <w:pPr>
         <w:spacing w:after="200" w:line="324" w:lineRule="auto"/>
       </w:pPr>
       <w:r>
@@ -9470,6 +11043,253 @@
     </w:p>
     <w:p>
       <w:pPr>
+        <w:spacing w:after="120" w:line="324" w:lineRule="auto"/>
+      </w:pPr>
+      <w:r>
+        <w:rPr>
+          <w:rFonts w:ascii="微软雅黑" w:hAnsi="微软雅黑" w:eastAsia="微软雅黑"/>
+          <w:b/>
+          <w:sz w:val="26"/>
+        </w:rPr>
+        <w:t>续讲口述：树的可读与森林的稳定性</w:t>
+      </w:r>
+    </w:p>
+    <w:p>
+      <w:pPr>
+        <w:spacing w:after="80" w:line="324" w:lineRule="auto"/>
+      </w:pPr>
+      <w:r>
+        <w:rPr>
+          <w:rFonts w:ascii="微软雅黑" w:hAnsi="微软雅黑" w:eastAsia="微软雅黑"/>
+          <w:b/>
+          <w:sz w:val="24"/>
+        </w:rPr>
+        <w:t>续讲点 1</w:t>
+      </w:r>
+    </w:p>
+    <w:p>
+      <w:pPr>
+        <w:spacing w:after="80" w:line="324" w:lineRule="auto"/>
+      </w:pPr>
+      <w:r>
+        <w:rPr>
+          <w:rFonts w:ascii="微软雅黑" w:hAnsi="微软雅黑" w:eastAsia="微软雅黑"/>
+          <w:b w:val="0"/>
+          <w:sz w:val="22"/>
+        </w:rPr>
+        <w:t>树用分裂把数据分纯，路径可读。深树易背噪声：深度三可读，深度十二训练满分测试下滑，曲线钉住过拟合。</w:t>
+      </w:r>
+    </w:p>
+    <w:p>
+      <w:pPr>
+        <w:spacing w:after="80" w:line="324" w:lineRule="auto"/>
+      </w:pPr>
+      <w:r>
+        <w:rPr>
+          <w:rFonts w:ascii="微软雅黑" w:hAnsi="微软雅黑" w:eastAsia="微软雅黑"/>
+          <w:b w:val="0"/>
+          <w:sz w:val="22"/>
+        </w:rPr>
+        <w:t>讲到这里先不要翻页。请用自己的话复述刚才三分钟的核心：输入是什么，输出是什么，最容易错在哪一步。复述不求漂亮，只求意思对。意思对了，才允许继续往下写代码。若你只能重复术语，说明还停留在名词层，我会再用大白话讲一遍。</w:t>
+      </w:r>
+    </w:p>
+    <w:p>
+      <w:pPr>
+        <w:spacing w:after="80" w:line="324" w:lineRule="auto"/>
+      </w:pPr>
+      <w:r>
+        <w:rPr>
+          <w:rFonts w:ascii="微软雅黑" w:hAnsi="微软雅黑" w:eastAsia="微软雅黑"/>
+          <w:b/>
+          <w:sz w:val="24"/>
+        </w:rPr>
+        <w:t>续讲点 2</w:t>
+      </w:r>
+    </w:p>
+    <w:p>
+      <w:pPr>
+        <w:spacing w:after="80" w:line="324" w:lineRule="auto"/>
+      </w:pPr>
+      <w:r>
+        <w:rPr>
+          <w:rFonts w:ascii="微软雅黑" w:hAnsi="微软雅黑" w:eastAsia="微软雅黑"/>
+          <w:b w:val="0"/>
+          <w:sz w:val="22"/>
+        </w:rPr>
+        <w:t>森林：自助抽样加特征随机，投票更稳。树数增多有收益递减。重要性是线索不是因果，异常高要查泄漏。</w:t>
+      </w:r>
+    </w:p>
+    <w:p>
+      <w:pPr>
+        <w:spacing w:after="80" w:line="324" w:lineRule="auto"/>
+      </w:pPr>
+      <w:r>
+        <w:rPr>
+          <w:rFonts w:ascii="微软雅黑" w:hAnsi="微软雅黑" w:eastAsia="微软雅黑"/>
+          <w:b w:val="0"/>
+          <w:sz w:val="22"/>
+        </w:rPr>
+        <w:t>讲到这里先不要翻页。请用自己的话复述刚才三分钟的核心：输入是什么，输出是什么，最容易错在哪一步。复述不求漂亮，只求意思对。意思对了，才允许继续往下写代码。若你只能重复术语，说明还停留在名词层，我会再用大白话讲一遍。</w:t>
+      </w:r>
+    </w:p>
+    <w:p>
+      <w:pPr>
+        <w:spacing w:after="80" w:line="324" w:lineRule="auto"/>
+      </w:pPr>
+      <w:r>
+        <w:rPr>
+          <w:rFonts w:ascii="微软雅黑" w:hAnsi="微软雅黑" w:eastAsia="微软雅黑"/>
+          <w:b/>
+          <w:sz w:val="24"/>
+        </w:rPr>
+        <w:t>续讲点 3</w:t>
+      </w:r>
+    </w:p>
+    <w:p>
+      <w:pPr>
+        <w:spacing w:after="80" w:line="324" w:lineRule="auto"/>
+      </w:pPr>
+      <w:r>
+        <w:rPr>
+          <w:rFonts w:ascii="微软雅黑" w:hAnsi="微软雅黑" w:eastAsia="微软雅黑"/>
+          <w:b w:val="0"/>
+          <w:sz w:val="22"/>
+        </w:rPr>
+        <w:t>混淆矩阵：抓对、误伤、放对、漏放。风控怕漏，骚扰怕误伤。不平衡时看召回精确，别只看准确率。</w:t>
+      </w:r>
+    </w:p>
+    <w:p>
+      <w:pPr>
+        <w:spacing w:after="80" w:line="324" w:lineRule="auto"/>
+      </w:pPr>
+      <w:r>
+        <w:rPr>
+          <w:rFonts w:ascii="微软雅黑" w:hAnsi="微软雅黑" w:eastAsia="微软雅黑"/>
+          <w:b w:val="0"/>
+          <w:sz w:val="22"/>
+        </w:rPr>
+        <w:t>讲到这里先不要翻页。请用自己的话复述刚才三分钟的核心：输入是什么，输出是什么，最容易错在哪一步。复述不求漂亮，只求意思对。意思对了，才允许继续往下写代码。若你只能重复术语，说明还停留在名词层，我会再用大白话讲一遍。</w:t>
+      </w:r>
+    </w:p>
+    <w:p>
+      <w:pPr>
+        <w:spacing w:after="80" w:line="324" w:lineRule="auto"/>
+      </w:pPr>
+      <w:r>
+        <w:rPr>
+          <w:rFonts w:ascii="微软雅黑" w:hAnsi="微软雅黑" w:eastAsia="微软雅黑"/>
+          <w:b/>
+          <w:sz w:val="24"/>
+        </w:rPr>
+        <w:t>续讲点 4</w:t>
+      </w:r>
+    </w:p>
+    <w:p>
+      <w:pPr>
+        <w:spacing w:after="80" w:line="324" w:lineRule="auto"/>
+      </w:pPr>
+      <w:r>
+        <w:rPr>
+          <w:rFonts w:ascii="微软雅黑" w:hAnsi="微软雅黑" w:eastAsia="微软雅黑"/>
+          <w:b w:val="0"/>
+          <w:sz w:val="22"/>
+        </w:rPr>
+        <w:t>与线性比：树擅交互非线性，外推弱。流水线编码加模型，验证集选参，测试集少碰。</w:t>
+      </w:r>
+    </w:p>
+    <w:p>
+      <w:pPr>
+        <w:spacing w:after="80" w:line="324" w:lineRule="auto"/>
+      </w:pPr>
+      <w:r>
+        <w:rPr>
+          <w:rFonts w:ascii="微软雅黑" w:hAnsi="微软雅黑" w:eastAsia="微软雅黑"/>
+          <w:b w:val="0"/>
+          <w:sz w:val="22"/>
+        </w:rPr>
+        <w:t>讲到这里先不要翻页。请用自己的话复述刚才三分钟的核心：输入是什么，输出是什么，最容易错在哪一步。复述不求漂亮，只求意思对。意思对了，才允许继续往下写代码。若你只能重复术语，说明还停留在名词层，我会再用大白话讲一遍。</w:t>
+      </w:r>
+    </w:p>
+    <w:p>
+      <w:pPr>
+        <w:spacing w:after="80" w:line="324" w:lineRule="auto"/>
+      </w:pPr>
+      <w:r>
+        <w:rPr>
+          <w:rFonts w:ascii="微软雅黑" w:hAnsi="微软雅黑" w:eastAsia="微软雅黑"/>
+          <w:b/>
+          <w:sz w:val="24"/>
+        </w:rPr>
+        <w:t>续讲点 5</w:t>
+      </w:r>
+    </w:p>
+    <w:p>
+      <w:pPr>
+        <w:spacing w:after="80" w:line="324" w:lineRule="auto"/>
+      </w:pPr>
+      <w:r>
+        <w:rPr>
+          <w:rFonts w:ascii="微软雅黑" w:hAnsi="微软雅黑" w:eastAsia="微软雅黑"/>
+          <w:b w:val="0"/>
+          <w:sz w:val="22"/>
+        </w:rPr>
+        <w:t>练习：单树对森林比 F1 与波动；写三句为何小组投票通常更稳。</w:t>
+      </w:r>
+    </w:p>
+    <w:p>
+      <w:pPr>
+        <w:spacing w:after="80" w:line="324" w:lineRule="auto"/>
+      </w:pPr>
+      <w:r>
+        <w:rPr>
+          <w:rFonts w:ascii="微软雅黑" w:hAnsi="微软雅黑" w:eastAsia="微软雅黑"/>
+          <w:b w:val="0"/>
+          <w:sz w:val="22"/>
+        </w:rPr>
+        <w:t>讲到这里先不要翻页。请用自己的话复述刚才三分钟的核心：输入是什么，输出是什么，最容易错在哪一步。复述不求漂亮，只求意思对。意思对了，才允许继续往下写代码。若你只能重复术语，说明还停留在名词层，我会再用大白话讲一遍。</w:t>
+      </w:r>
+    </w:p>
+    <w:p>
+      <w:pPr>
+        <w:spacing w:after="80" w:line="324" w:lineRule="auto"/>
+      </w:pPr>
+      <w:r>
+        <w:rPr>
+          <w:rFonts w:ascii="微软雅黑" w:hAnsi="微软雅黑" w:eastAsia="微软雅黑"/>
+          <w:b w:val="0"/>
+          <w:sz w:val="22"/>
+        </w:rPr>
+        <w:t>本段续讲结束时，请在笔记本首页补三条：今日必会、今日易错、回家必做。下节课我会抽查这三条。抽查不是为难，是防止听过等于会了。</w:t>
+      </w:r>
+    </w:p>
+    <w:p>
+      <w:pPr>
+        <w:spacing w:after="120" w:line="324" w:lineRule="auto"/>
+      </w:pPr>
+      <w:r>
+        <w:rPr>
+          <w:rFonts w:ascii="微软雅黑" w:hAnsi="微软雅黑" w:eastAsia="微软雅黑"/>
+          <w:b/>
+          <w:sz w:val="26"/>
+        </w:rPr>
+        <w:t>加时续讲：森林课再补五分钟</w:t>
+      </w:r>
+    </w:p>
+    <w:p>
+      <w:pPr>
+        <w:spacing w:after="80" w:line="324" w:lineRule="auto"/>
+      </w:pPr>
+      <w:r>
+        <w:rPr>
+          <w:rFonts w:ascii="微软雅黑" w:hAnsi="微软雅黑" w:eastAsia="微软雅黑"/>
+          <w:b w:val="0"/>
+          <w:sz w:val="22"/>
+        </w:rPr>
+        <w:t>再强调一次：训练集满分不是荣耀，测试集稳才是。请把深度实验的两条曲线截进作业。特征重要性若出现「未来才能知道的字段」，先当泄漏嫌疑，不要当发现。课堂最后请两位同学用业务话解释混淆矩阵四格，全班纠错。</w:t>
+      </w:r>
+    </w:p>
+    <w:p>
+      <w:pPr>
         <w:spacing w:after="200" w:line="324" w:lineRule="auto"/>
       </w:pPr>
       <w:r>
@@ -10601,6 +12421,253 @@
     </w:p>
     <w:p>
       <w:pPr>
+        <w:spacing w:after="120" w:line="324" w:lineRule="auto"/>
+      </w:pPr>
+      <w:r>
+        <w:rPr>
+          <w:rFonts w:ascii="微软雅黑" w:hAnsi="微软雅黑" w:eastAsia="微软雅黑"/>
+          <w:b/>
+          <w:sz w:val="26"/>
+        </w:rPr>
+        <w:t>续讲口述：贝叶斯先验似然后验</w:t>
+      </w:r>
+    </w:p>
+    <w:p>
+      <w:pPr>
+        <w:spacing w:after="80" w:line="324" w:lineRule="auto"/>
+      </w:pPr>
+      <w:r>
+        <w:rPr>
+          <w:rFonts w:ascii="微软雅黑" w:hAnsi="微软雅黑" w:eastAsia="微软雅黑"/>
+          <w:b/>
+          <w:sz w:val="24"/>
+        </w:rPr>
+        <w:t>续讲点 1</w:t>
+      </w:r>
+    </w:p>
+    <w:p>
+      <w:pPr>
+        <w:spacing w:after="80" w:line="324" w:lineRule="auto"/>
+      </w:pPr>
+      <w:r>
+        <w:rPr>
+          <w:rFonts w:ascii="微软雅黑" w:hAnsi="微软雅黑" w:eastAsia="微软雅黑"/>
+          <w:b w:val="0"/>
+          <w:sz w:val="22"/>
+        </w:rPr>
+        <w:t>先验是底色，似然是证据匹配，后验是更新信念。垃圾邮件与疾病检测同一结构：少见病就算阳性也不等于确诊。</w:t>
+      </w:r>
+    </w:p>
+    <w:p>
+      <w:pPr>
+        <w:spacing w:after="80" w:line="324" w:lineRule="auto"/>
+      </w:pPr>
+      <w:r>
+        <w:rPr>
+          <w:rFonts w:ascii="微软雅黑" w:hAnsi="微软雅黑" w:eastAsia="微软雅黑"/>
+          <w:b w:val="0"/>
+          <w:sz w:val="22"/>
+        </w:rPr>
+        <w:t>讲到这里先不要翻页。请用自己的话复述刚才三分钟的核心：输入是什么，输出是什么，最容易错在哪一步。复述不求漂亮，只求意思对。意思对了，才允许继续往下写代码。若你只能重复术语，说明还停留在名词层，我会再用大白话讲一遍。</w:t>
+      </w:r>
+    </w:p>
+    <w:p>
+      <w:pPr>
+        <w:spacing w:after="80" w:line="324" w:lineRule="auto"/>
+      </w:pPr>
+      <w:r>
+        <w:rPr>
+          <w:rFonts w:ascii="微软雅黑" w:hAnsi="微软雅黑" w:eastAsia="微软雅黑"/>
+          <w:b/>
+          <w:sz w:val="24"/>
+        </w:rPr>
+        <w:t>续讲点 2</w:t>
+      </w:r>
+    </w:p>
+    <w:p>
+      <w:pPr>
+        <w:spacing w:after="80" w:line="324" w:lineRule="auto"/>
+      </w:pPr>
+      <w:r>
+        <w:rPr>
+          <w:rFonts w:ascii="微软雅黑" w:hAnsi="微软雅黑" w:eastAsia="微软雅黑"/>
+          <w:b w:val="0"/>
+          <w:sz w:val="22"/>
+        </w:rPr>
+        <w:t>朴素假设特征条件独立，常假但文本好用。零概率用平滑，未见词不能一票否决。选高斯还是多项式看特征类型。</w:t>
+      </w:r>
+    </w:p>
+    <w:p>
+      <w:pPr>
+        <w:spacing w:after="80" w:line="324" w:lineRule="auto"/>
+      </w:pPr>
+      <w:r>
+        <w:rPr>
+          <w:rFonts w:ascii="微软雅黑" w:hAnsi="微软雅黑" w:eastAsia="微软雅黑"/>
+          <w:b w:val="0"/>
+          <w:sz w:val="22"/>
+        </w:rPr>
+        <w:t>讲到这里先不要翻页。请用自己的话复述刚才三分钟的核心：输入是什么，输出是什么，最容易错在哪一步。复述不求漂亮，只求意思对。意思对了，才允许继续往下写代码。若你只能重复术语，说明还停留在名词层，我会再用大白话讲一遍。</w:t>
+      </w:r>
+    </w:p>
+    <w:p>
+      <w:pPr>
+        <w:spacing w:after="80" w:line="324" w:lineRule="auto"/>
+      </w:pPr>
+      <w:r>
+        <w:rPr>
+          <w:rFonts w:ascii="微软雅黑" w:hAnsi="微软雅黑" w:eastAsia="微软雅黑"/>
+          <w:b/>
+          <w:sz w:val="24"/>
+        </w:rPr>
+        <w:t>续讲点 3</w:t>
+      </w:r>
+    </w:p>
+    <w:p>
+      <w:pPr>
+        <w:spacing w:after="80" w:line="324" w:lineRule="auto"/>
+      </w:pPr>
+      <w:r>
+        <w:rPr>
+          <w:rFonts w:ascii="微软雅黑" w:hAnsi="微软雅黑" w:eastAsia="微软雅黑"/>
+          <w:b w:val="0"/>
+          <w:sz w:val="22"/>
+        </w:rPr>
+        <w:t>predict 与 predict_proba 不同。业务可调阈值，漏检代价高就更敏感。高置信错误要抽查，别迷信概率。</w:t>
+      </w:r>
+    </w:p>
+    <w:p>
+      <w:pPr>
+        <w:spacing w:after="80" w:line="324" w:lineRule="auto"/>
+      </w:pPr>
+      <w:r>
+        <w:rPr>
+          <w:rFonts w:ascii="微软雅黑" w:hAnsi="微软雅黑" w:eastAsia="微软雅黑"/>
+          <w:b w:val="0"/>
+          <w:sz w:val="22"/>
+        </w:rPr>
+        <w:t>讲到这里先不要翻页。请用自己的话复述刚才三分钟的核心：输入是什么，输出是什么，最容易错在哪一步。复述不求漂亮，只求意思对。意思对了，才允许继续往下写代码。若你只能重复术语，说明还停留在名词层，我会再用大白话讲一遍。</w:t>
+      </w:r>
+    </w:p>
+    <w:p>
+      <w:pPr>
+        <w:spacing w:after="80" w:line="324" w:lineRule="auto"/>
+      </w:pPr>
+      <w:r>
+        <w:rPr>
+          <w:rFonts w:ascii="微软雅黑" w:hAnsi="微软雅黑" w:eastAsia="微软雅黑"/>
+          <w:b/>
+          <w:sz w:val="24"/>
+        </w:rPr>
+        <w:t>续讲点 4</w:t>
+      </w:r>
+    </w:p>
+    <w:p>
+      <w:pPr>
+        <w:spacing w:after="80" w:line="324" w:lineRule="auto"/>
+      </w:pPr>
+      <w:r>
+        <w:rPr>
+          <w:rFonts w:ascii="微软雅黑" w:hAnsi="微软雅黑" w:eastAsia="微软雅黑"/>
+          <w:b w:val="0"/>
+          <w:sz w:val="22"/>
+        </w:rPr>
+        <w:t>文本接法：清洗分词向量化只 fit 火车，再 NB。与标准化防泄漏同构。</w:t>
+      </w:r>
+    </w:p>
+    <w:p>
+      <w:pPr>
+        <w:spacing w:after="80" w:line="324" w:lineRule="auto"/>
+      </w:pPr>
+      <w:r>
+        <w:rPr>
+          <w:rFonts w:ascii="微软雅黑" w:hAnsi="微软雅黑" w:eastAsia="微软雅黑"/>
+          <w:b w:val="0"/>
+          <w:sz w:val="22"/>
+        </w:rPr>
+        <w:t>讲到这里先不要翻页。请用自己的话复述刚才三分钟的核心：输入是什么，输出是什么，最容易错在哪一步。复述不求漂亮，只求意思对。意思对了，才允许继续往下写代码。若你只能重复术语，说明还停留在名词层，我会再用大白话讲一遍。</w:t>
+      </w:r>
+    </w:p>
+    <w:p>
+      <w:pPr>
+        <w:spacing w:after="80" w:line="324" w:lineRule="auto"/>
+      </w:pPr>
+      <w:r>
+        <w:rPr>
+          <w:rFonts w:ascii="微软雅黑" w:hAnsi="微软雅黑" w:eastAsia="微软雅黑"/>
+          <w:b/>
+          <w:sz w:val="24"/>
+        </w:rPr>
+        <w:t>续讲点 5</w:t>
+      </w:r>
+    </w:p>
+    <w:p>
+      <w:pPr>
+        <w:spacing w:after="80" w:line="324" w:lineRule="auto"/>
+      </w:pPr>
+      <w:r>
+        <w:rPr>
+          <w:rFonts w:ascii="微软雅黑" w:hAnsi="微软雅黑" w:eastAsia="微软雅黑"/>
+          <w:b w:val="0"/>
+          <w:sz w:val="22"/>
+        </w:rPr>
+        <w:t>作业：手算小例子上机核对；一句话人话版贝叶斯；同划分对比森林。</w:t>
+      </w:r>
+    </w:p>
+    <w:p>
+      <w:pPr>
+        <w:spacing w:after="80" w:line="324" w:lineRule="auto"/>
+      </w:pPr>
+      <w:r>
+        <w:rPr>
+          <w:rFonts w:ascii="微软雅黑" w:hAnsi="微软雅黑" w:eastAsia="微软雅黑"/>
+          <w:b w:val="0"/>
+          <w:sz w:val="22"/>
+        </w:rPr>
+        <w:t>讲到这里先不要翻页。请用自己的话复述刚才三分钟的核心：输入是什么，输出是什么，最容易错在哪一步。复述不求漂亮，只求意思对。意思对了，才允许继续往下写代码。若你只能重复术语，说明还停留在名词层，我会再用大白话讲一遍。</w:t>
+      </w:r>
+    </w:p>
+    <w:p>
+      <w:pPr>
+        <w:spacing w:after="80" w:line="324" w:lineRule="auto"/>
+      </w:pPr>
+      <w:r>
+        <w:rPr>
+          <w:rFonts w:ascii="微软雅黑" w:hAnsi="微软雅黑" w:eastAsia="微软雅黑"/>
+          <w:b w:val="0"/>
+          <w:sz w:val="22"/>
+        </w:rPr>
+        <w:t>本段续讲结束时，请在笔记本首页补三条：今日必会、今日易错、回家必做。下节课我会抽查这三条。抽查不是为难，是防止听过等于会了。</w:t>
+      </w:r>
+    </w:p>
+    <w:p>
+      <w:pPr>
+        <w:spacing w:after="120" w:line="324" w:lineRule="auto"/>
+      </w:pPr>
+      <w:r>
+        <w:rPr>
+          <w:rFonts w:ascii="微软雅黑" w:hAnsi="微软雅黑" w:eastAsia="微软雅黑"/>
+          <w:b/>
+          <w:sz w:val="26"/>
+        </w:rPr>
+        <w:t>加时续讲：贝叶斯再补五分钟</w:t>
+      </w:r>
+    </w:p>
+    <w:p>
+      <w:pPr>
+        <w:spacing w:after="80" w:line="324" w:lineRule="auto"/>
+      </w:pPr>
+      <w:r>
+        <w:rPr>
+          <w:rFonts w:ascii="微软雅黑" w:hAnsi="微软雅黑" w:eastAsia="微软雅黑"/>
+          <w:b w:val="0"/>
+          <w:sz w:val="22"/>
+        </w:rPr>
+        <w:t>平滑演示再看一眼：没有平滑，未见词把概率打成零；有平滑，恢复正常。把「先验、证据、后验」写成三张卡片贴笔记本。下节课文本会直接接上多项式朴素贝叶斯，今天卡片会用到。</w:t>
+      </w:r>
+    </w:p>
+    <w:p>
+      <w:pPr>
         <w:spacing w:after="200" w:line="324" w:lineRule="auto"/>
       </w:pPr>
       <w:r>
@@ -11706,6 +13773,253 @@
     </w:p>
     <w:p>
       <w:pPr>
+        <w:spacing w:after="120" w:line="324" w:lineRule="auto"/>
+      </w:pPr>
+      <w:r>
+        <w:rPr>
+          <w:rFonts w:ascii="微软雅黑" w:hAnsi="微软雅黑" w:eastAsia="微软雅黑"/>
+          <w:b/>
+          <w:sz w:val="26"/>
+        </w:rPr>
+        <w:t>续讲口述：神经网络去神化</w:t>
+      </w:r>
+    </w:p>
+    <w:p>
+      <w:pPr>
+        <w:spacing w:after="80" w:line="324" w:lineRule="auto"/>
+      </w:pPr>
+      <w:r>
+        <w:rPr>
+          <w:rFonts w:ascii="微软雅黑" w:hAnsi="微软雅黑" w:eastAsia="微软雅黑"/>
+          <w:b/>
+          <w:sz w:val="24"/>
+        </w:rPr>
+        <w:t>续讲点 1</w:t>
+      </w:r>
+    </w:p>
+    <w:p>
+      <w:pPr>
+        <w:spacing w:after="80" w:line="324" w:lineRule="auto"/>
+      </w:pPr>
+      <w:r>
+        <w:rPr>
+          <w:rFonts w:ascii="微软雅黑" w:hAnsi="微软雅黑" w:eastAsia="微软雅黑"/>
+          <w:b w:val="0"/>
+          <w:sz w:val="22"/>
+        </w:rPr>
+        <w:t>线性叠线性仍是线性，激活提供弯曲。ReLU 负数截断。损失指路，学习率太大震荡太小爬行。</w:t>
+      </w:r>
+    </w:p>
+    <w:p>
+      <w:pPr>
+        <w:spacing w:after="80" w:line="324" w:lineRule="auto"/>
+      </w:pPr>
+      <w:r>
+        <w:rPr>
+          <w:rFonts w:ascii="微软雅黑" w:hAnsi="微软雅黑" w:eastAsia="微软雅黑"/>
+          <w:b w:val="0"/>
+          <w:sz w:val="22"/>
+        </w:rPr>
+        <w:t>讲到这里先不要翻页。请用自己的话复述刚才三分钟的核心：输入是什么，输出是什么，最容易错在哪一步。复述不求漂亮，只求意思对。意思对了，才允许继续往下写代码。若你只能重复术语，说明还停留在名词层，我会再用大白话讲一遍。</w:t>
+      </w:r>
+    </w:p>
+    <w:p>
+      <w:pPr>
+        <w:spacing w:after="80" w:line="324" w:lineRule="auto"/>
+      </w:pPr>
+      <w:r>
+        <w:rPr>
+          <w:rFonts w:ascii="微软雅黑" w:hAnsi="微软雅黑" w:eastAsia="微软雅黑"/>
+          <w:b/>
+          <w:sz w:val="24"/>
+        </w:rPr>
+        <w:t>续讲点 2</w:t>
+      </w:r>
+    </w:p>
+    <w:p>
+      <w:pPr>
+        <w:spacing w:after="80" w:line="324" w:lineRule="auto"/>
+      </w:pPr>
+      <w:r>
+        <w:rPr>
+          <w:rFonts w:ascii="微软雅黑" w:hAnsi="微软雅黑" w:eastAsia="微软雅黑"/>
+          <w:b w:val="0"/>
+          <w:sz w:val="22"/>
+        </w:rPr>
+        <w:t>标准化对照必做。小表格上森林常更省事；感知类任务网络更主场。选工具看问题。</w:t>
+      </w:r>
+    </w:p>
+    <w:p>
+      <w:pPr>
+        <w:spacing w:after="80" w:line="324" w:lineRule="auto"/>
+      </w:pPr>
+      <w:r>
+        <w:rPr>
+          <w:rFonts w:ascii="微软雅黑" w:hAnsi="微软雅黑" w:eastAsia="微软雅黑"/>
+          <w:b w:val="0"/>
+          <w:sz w:val="22"/>
+        </w:rPr>
+        <w:t>讲到这里先不要翻页。请用自己的话复述刚才三分钟的核心：输入是什么，输出是什么，最容易错在哪一步。复述不求漂亮，只求意思对。意思对了，才允许继续往下写代码。若你只能重复术语，说明还停留在名词层，我会再用大白话讲一遍。</w:t>
+      </w:r>
+    </w:p>
+    <w:p>
+      <w:pPr>
+        <w:spacing w:after="80" w:line="324" w:lineRule="auto"/>
+      </w:pPr>
+      <w:r>
+        <w:rPr>
+          <w:rFonts w:ascii="微软雅黑" w:hAnsi="微软雅黑" w:eastAsia="微软雅黑"/>
+          <w:b/>
+          <w:sz w:val="24"/>
+        </w:rPr>
+        <w:t>续讲点 3</w:t>
+      </w:r>
+    </w:p>
+    <w:p>
+      <w:pPr>
+        <w:spacing w:after="80" w:line="324" w:lineRule="auto"/>
+      </w:pPr>
+      <w:r>
+        <w:rPr>
+          <w:rFonts w:ascii="微软雅黑" w:hAnsi="微软雅黑" w:eastAsia="微软雅黑"/>
+          <w:b w:val="0"/>
+          <w:sz w:val="22"/>
+        </w:rPr>
+        <w:t>过拟合：变宽变深训练升测试掉。早停、变小、加数据、查泄漏。Convergence 先查缩放与迭代。</w:t>
+      </w:r>
+    </w:p>
+    <w:p>
+      <w:pPr>
+        <w:spacing w:after="80" w:line="324" w:lineRule="auto"/>
+      </w:pPr>
+      <w:r>
+        <w:rPr>
+          <w:rFonts w:ascii="微软雅黑" w:hAnsi="微软雅黑" w:eastAsia="微软雅黑"/>
+          <w:b w:val="0"/>
+          <w:sz w:val="22"/>
+        </w:rPr>
+        <w:t>讲到这里先不要翻页。请用自己的话复述刚才三分钟的核心：输入是什么，输出是什么，最容易错在哪一步。复述不求漂亮，只求意思对。意思对了，才允许继续往下写代码。若你只能重复术语，说明还停留在名词层，我会再用大白话讲一遍。</w:t>
+      </w:r>
+    </w:p>
+    <w:p>
+      <w:pPr>
+        <w:spacing w:after="80" w:line="324" w:lineRule="auto"/>
+      </w:pPr>
+      <w:r>
+        <w:rPr>
+          <w:rFonts w:ascii="微软雅黑" w:hAnsi="微软雅黑" w:eastAsia="微软雅黑"/>
+          <w:b/>
+          <w:sz w:val="24"/>
+        </w:rPr>
+        <w:t>续讲点 4</w:t>
+      </w:r>
+    </w:p>
+    <w:p>
+      <w:pPr>
+        <w:spacing w:after="80" w:line="324" w:lineRule="auto"/>
+      </w:pPr>
+      <w:r>
+        <w:rPr>
+          <w:rFonts w:ascii="微软雅黑" w:hAnsi="微软雅黑" w:eastAsia="微软雅黑"/>
+          <w:b w:val="0"/>
+          <w:sz w:val="22"/>
+        </w:rPr>
+        <w:t>解释要诚实：网络难读规则，高风险慎用。入门抓非线性、损失、尺度、验证四件事。</w:t>
+      </w:r>
+    </w:p>
+    <w:p>
+      <w:pPr>
+        <w:spacing w:after="80" w:line="324" w:lineRule="auto"/>
+      </w:pPr>
+      <w:r>
+        <w:rPr>
+          <w:rFonts w:ascii="微软雅黑" w:hAnsi="微软雅黑" w:eastAsia="微软雅黑"/>
+          <w:b w:val="0"/>
+          <w:sz w:val="22"/>
+        </w:rPr>
+        <w:t>讲到这里先不要翻页。请用自己的话复述刚才三分钟的核心：输入是什么，输出是什么，最容易错在哪一步。复述不求漂亮，只求意思对。意思对了，才允许继续往下写代码。若你只能重复术语，说明还停留在名词层，我会再用大白话讲一遍。</w:t>
+      </w:r>
+    </w:p>
+    <w:p>
+      <w:pPr>
+        <w:spacing w:after="80" w:line="324" w:lineRule="auto"/>
+      </w:pPr>
+      <w:r>
+        <w:rPr>
+          <w:rFonts w:ascii="微软雅黑" w:hAnsi="微软雅黑" w:eastAsia="微软雅黑"/>
+          <w:b/>
+          <w:sz w:val="24"/>
+        </w:rPr>
+        <w:t>续讲点 5</w:t>
+      </w:r>
+    </w:p>
+    <w:p>
+      <w:pPr>
+        <w:spacing w:after="80" w:line="324" w:lineRule="auto"/>
+      </w:pPr>
+      <w:r>
+        <w:rPr>
+          <w:rFonts w:ascii="微软雅黑" w:hAnsi="微软雅黑" w:eastAsia="微软雅黑"/>
+          <w:b w:val="0"/>
+          <w:sz w:val="22"/>
+        </w:rPr>
+        <w:t>练习：三模型对比写观察；手算一个神经元加权加 ReLU，去神秘化。</w:t>
+      </w:r>
+    </w:p>
+    <w:p>
+      <w:pPr>
+        <w:spacing w:after="80" w:line="324" w:lineRule="auto"/>
+      </w:pPr>
+      <w:r>
+        <w:rPr>
+          <w:rFonts w:ascii="微软雅黑" w:hAnsi="微软雅黑" w:eastAsia="微软雅黑"/>
+          <w:b w:val="0"/>
+          <w:sz w:val="22"/>
+        </w:rPr>
+        <w:t>讲到这里先不要翻页。请用自己的话复述刚才三分钟的核心：输入是什么，输出是什么，最容易错在哪一步。复述不求漂亮，只求意思对。意思对了，才允许继续往下写代码。若你只能重复术语，说明还停留在名词层，我会再用大白话讲一遍。</w:t>
+      </w:r>
+    </w:p>
+    <w:p>
+      <w:pPr>
+        <w:spacing w:after="80" w:line="324" w:lineRule="auto"/>
+      </w:pPr>
+      <w:r>
+        <w:rPr>
+          <w:rFonts w:ascii="微软雅黑" w:hAnsi="微软雅黑" w:eastAsia="微软雅黑"/>
+          <w:b w:val="0"/>
+          <w:sz w:val="22"/>
+        </w:rPr>
+        <w:t>本段续讲结束时，请在笔记本首页补三条：今日必会、今日易错、回家必做。下节课我会抽查这三条。抽查不是为难，是防止听过等于会了。</w:t>
+      </w:r>
+    </w:p>
+    <w:p>
+      <w:pPr>
+        <w:spacing w:after="120" w:line="324" w:lineRule="auto"/>
+      </w:pPr>
+      <w:r>
+        <w:rPr>
+          <w:rFonts w:ascii="微软雅黑" w:hAnsi="微软雅黑" w:eastAsia="微软雅黑"/>
+          <w:b/>
+          <w:sz w:val="26"/>
+        </w:rPr>
+        <w:t>加时续讲：神经网络再补五分钟</w:t>
+      </w:r>
+    </w:p>
+    <w:p>
+      <w:pPr>
+        <w:spacing w:after="80" w:line="324" w:lineRule="auto"/>
+      </w:pPr>
+      <w:r>
+        <w:rPr>
+          <w:rFonts w:ascii="微软雅黑" w:hAnsi="微软雅黑" w:eastAsia="微软雅黑"/>
+          <w:b w:val="0"/>
+          <w:sz w:val="22"/>
+        </w:rPr>
+        <w:t>把「不标准化就训」和「标准化再训」的分数写在黑板两侧。差距就是本课最贵的教训。再问一句：小表格任务，你为什么仍可能优先选森林？答得出，说明你没有被名词绑架。回家手算一个神经元：加权求和加 ReLU，写在纸上交。</w:t>
+      </w:r>
+    </w:p>
+    <w:p>
+      <w:pPr>
         <w:spacing w:after="200" w:line="324" w:lineRule="auto"/>
       </w:pPr>
       <w:r>
@@ -12859,6 +15173,253 @@
           <w:sz w:val="22"/>
         </w:rPr>
         <w:t>四十分钟要结束时，我不追求再塞一个新算法，而追求你们带走一张清单。清单上写：今天必须会的三件事、最常见的两个坑、回家要亲手跑的一个小练习。下节课开头我会抽查这张清单。抽查不是为难人，是防止知识只停留在听过。你们若能把清单讲给室友听懂，这节课就算达标了。回家后请把清单抄到笔记本首页，旁边留白，做题时随时补坑。</w:t>
+      </w:r>
+    </w:p>
+    <w:p>
+      <w:pPr>
+        <w:spacing w:after="120" w:line="324" w:lineRule="auto"/>
+      </w:pPr>
+      <w:r>
+        <w:rPr>
+          <w:rFonts w:ascii="微软雅黑" w:hAnsi="微软雅黑" w:eastAsia="微软雅黑"/>
+          <w:b/>
+          <w:sz w:val="26"/>
+        </w:rPr>
+        <w:t>续讲口述：文本表示与错例闭环</w:t>
+      </w:r>
+    </w:p>
+    <w:p>
+      <w:pPr>
+        <w:spacing w:after="80" w:line="324" w:lineRule="auto"/>
+      </w:pPr>
+      <w:r>
+        <w:rPr>
+          <w:rFonts w:ascii="微软雅黑" w:hAnsi="微软雅黑" w:eastAsia="微软雅黑"/>
+          <w:b/>
+          <w:sz w:val="24"/>
+        </w:rPr>
+        <w:t>续讲点 1</w:t>
+      </w:r>
+    </w:p>
+    <w:p>
+      <w:pPr>
+        <w:spacing w:after="80" w:line="324" w:lineRule="auto"/>
+      </w:pPr>
+      <w:r>
+        <w:rPr>
+          <w:rFonts w:ascii="微软雅黑" w:hAnsi="微软雅黑" w:eastAsia="微软雅黑"/>
+          <w:b w:val="0"/>
+          <w:sz w:val="22"/>
+        </w:rPr>
+        <w:t>文本先变数字。中文分词决定特征，切错模型冤。清洗记规则，表情是否保留靠实验。</w:t>
+      </w:r>
+    </w:p>
+    <w:p>
+      <w:pPr>
+        <w:spacing w:after="80" w:line="324" w:lineRule="auto"/>
+      </w:pPr>
+      <w:r>
+        <w:rPr>
+          <w:rFonts w:ascii="微软雅黑" w:hAnsi="微软雅黑" w:eastAsia="微软雅黑"/>
+          <w:b w:val="0"/>
+          <w:sz w:val="22"/>
+        </w:rPr>
+        <w:t>讲到这里先不要翻页。请用自己的话复述刚才三分钟的核心：输入是什么，输出是什么，最容易错在哪一步。复述不求漂亮，只求意思对。意思对了，才允许继续往下写代码。若你只能重复术语，说明还停留在名词层，我会再用大白话讲一遍。</w:t>
+      </w:r>
+    </w:p>
+    <w:p>
+      <w:pPr>
+        <w:spacing w:after="80" w:line="324" w:lineRule="auto"/>
+      </w:pPr>
+      <w:r>
+        <w:rPr>
+          <w:rFonts w:ascii="微软雅黑" w:hAnsi="微软雅黑" w:eastAsia="微软雅黑"/>
+          <w:b/>
+          <w:sz w:val="24"/>
+        </w:rPr>
+        <w:t>续讲点 2</w:t>
+      </w:r>
+    </w:p>
+    <w:p>
+      <w:pPr>
+        <w:spacing w:after="80" w:line="324" w:lineRule="auto"/>
+      </w:pPr>
+      <w:r>
+        <w:rPr>
+          <w:rFonts w:ascii="微软雅黑" w:hAnsi="微软雅黑" w:eastAsia="微软雅黑"/>
+          <w:b w:val="0"/>
+          <w:sz w:val="22"/>
+        </w:rPr>
+        <w:t>词袋丢语序，否定易翻车；TF-IDF 降常见抬区分；n-gram 找回一点顺序，维度上升。向量化只 fit 火车。</w:t>
+      </w:r>
+    </w:p>
+    <w:p>
+      <w:pPr>
+        <w:spacing w:after="80" w:line="324" w:lineRule="auto"/>
+      </w:pPr>
+      <w:r>
+        <w:rPr>
+          <w:rFonts w:ascii="微软雅黑" w:hAnsi="微软雅黑" w:eastAsia="微软雅黑"/>
+          <w:b w:val="0"/>
+          <w:sz w:val="22"/>
+        </w:rPr>
+        <w:t>讲到这里先不要翻页。请用自己的话复述刚才三分钟的核心：输入是什么，输出是什么，最容易错在哪一步。复述不求漂亮，只求意思对。意思对了，才允许继续往下写代码。若你只能重复术语，说明还停留在名词层，我会再用大白话讲一遍。</w:t>
+      </w:r>
+    </w:p>
+    <w:p>
+      <w:pPr>
+        <w:spacing w:after="80" w:line="324" w:lineRule="auto"/>
+      </w:pPr>
+      <w:r>
+        <w:rPr>
+          <w:rFonts w:ascii="微软雅黑" w:hAnsi="微软雅黑" w:eastAsia="微软雅黑"/>
+          <w:b/>
+          <w:sz w:val="24"/>
+        </w:rPr>
+        <w:t>续讲点 3</w:t>
+      </w:r>
+    </w:p>
+    <w:p>
+      <w:pPr>
+        <w:spacing w:after="80" w:line="324" w:lineRule="auto"/>
+      </w:pPr>
+      <w:r>
+        <w:rPr>
+          <w:rFonts w:ascii="微软雅黑" w:hAnsi="微软雅黑" w:eastAsia="微软雅黑"/>
+          <w:b w:val="0"/>
+          <w:sz w:val="22"/>
+        </w:rPr>
+        <w:t>强基线：多项式 NB 或逻辑回归。准确率外必须错例：否定、讽刺、切错、近义，每类对应改法。</w:t>
+      </w:r>
+    </w:p>
+    <w:p>
+      <w:pPr>
+        <w:spacing w:after="80" w:line="324" w:lineRule="auto"/>
+      </w:pPr>
+      <w:r>
+        <w:rPr>
+          <w:rFonts w:ascii="微软雅黑" w:hAnsi="微软雅黑" w:eastAsia="微软雅黑"/>
+          <w:b w:val="0"/>
+          <w:sz w:val="22"/>
+        </w:rPr>
+        <w:t>讲到这里先不要翻页。请用自己的话复述刚才三分钟的核心：输入是什么，输出是什么，最容易错在哪一步。复述不求漂亮，只求意思对。意思对了，才允许继续往下写代码。若你只能重复术语，说明还停留在名词层，我会再用大白话讲一遍。</w:t>
+      </w:r>
+    </w:p>
+    <w:p>
+      <w:pPr>
+        <w:spacing w:after="80" w:line="324" w:lineRule="auto"/>
+      </w:pPr>
+      <w:r>
+        <w:rPr>
+          <w:rFonts w:ascii="微软雅黑" w:hAnsi="微软雅黑" w:eastAsia="微软雅黑"/>
+          <w:b/>
+          <w:sz w:val="24"/>
+        </w:rPr>
+        <w:t>续讲点 4</w:t>
+      </w:r>
+    </w:p>
+    <w:p>
+      <w:pPr>
+        <w:spacing w:after="80" w:line="324" w:lineRule="auto"/>
+      </w:pPr>
+      <w:r>
+        <w:rPr>
+          <w:rFonts w:ascii="微软雅黑" w:hAnsi="微软雅黑" w:eastAsia="微软雅黑"/>
+          <w:b w:val="0"/>
+          <w:sz w:val="22"/>
+        </w:rPr>
+        <w:t>泄漏：标签捷径词、全语料先 fit、时间穿越，都会虚高。审查标注流程。</w:t>
+      </w:r>
+    </w:p>
+    <w:p>
+      <w:pPr>
+        <w:spacing w:after="80" w:line="324" w:lineRule="auto"/>
+      </w:pPr>
+      <w:r>
+        <w:rPr>
+          <w:rFonts w:ascii="微软雅黑" w:hAnsi="微软雅黑" w:eastAsia="微软雅黑"/>
+          <w:b w:val="0"/>
+          <w:sz w:val="22"/>
+        </w:rPr>
+        <w:t>讲到这里先不要翻页。请用自己的话复述刚才三分钟的核心：输入是什么，输出是什么，最容易错在哪一步。复述不求漂亮，只求意思对。意思对了，才允许继续往下写代码。若你只能重复术语，说明还停留在名词层，我会再用大白话讲一遍。</w:t>
+      </w:r>
+    </w:p>
+    <w:p>
+      <w:pPr>
+        <w:spacing w:after="80" w:line="324" w:lineRule="auto"/>
+      </w:pPr>
+      <w:r>
+        <w:rPr>
+          <w:rFonts w:ascii="微软雅黑" w:hAnsi="微软雅黑" w:eastAsia="微软雅黑"/>
+          <w:b/>
+          <w:sz w:val="24"/>
+        </w:rPr>
+        <w:t>续讲点 5</w:t>
+      </w:r>
+    </w:p>
+    <w:p>
+      <w:pPr>
+        <w:spacing w:after="80" w:line="324" w:lineRule="auto"/>
+      </w:pPr>
+      <w:r>
+        <w:rPr>
+          <w:rFonts w:ascii="微软雅黑" w:hAnsi="微软雅黑" w:eastAsia="微软雅黑"/>
+          <w:b w:val="0"/>
+          <w:sz w:val="22"/>
+        </w:rPr>
+        <w:t>作业闭环：分词样例、向量化说明、指标、三条错例。表示选对，简单模型也强。</w:t>
+      </w:r>
+    </w:p>
+    <w:p>
+      <w:pPr>
+        <w:spacing w:after="80" w:line="324" w:lineRule="auto"/>
+      </w:pPr>
+      <w:r>
+        <w:rPr>
+          <w:rFonts w:ascii="微软雅黑" w:hAnsi="微软雅黑" w:eastAsia="微软雅黑"/>
+          <w:b w:val="0"/>
+          <w:sz w:val="22"/>
+        </w:rPr>
+        <w:t>讲到这里先不要翻页。请用自己的话复述刚才三分钟的核心：输入是什么，输出是什么，最容易错在哪一步。复述不求漂亮，只求意思对。意思对了，才允许继续往下写代码。若你只能重复术语，说明还停留在名词层，我会再用大白话讲一遍。</w:t>
+      </w:r>
+    </w:p>
+    <w:p>
+      <w:pPr>
+        <w:spacing w:after="80" w:line="324" w:lineRule="auto"/>
+      </w:pPr>
+      <w:r>
+        <w:rPr>
+          <w:rFonts w:ascii="微软雅黑" w:hAnsi="微软雅黑" w:eastAsia="微软雅黑"/>
+          <w:b w:val="0"/>
+          <w:sz w:val="22"/>
+        </w:rPr>
+        <w:t>本段续讲结束时，请在笔记本首页补三条：今日必会、今日易错、回家必做。下节课我会抽查这三条。抽查不是为难，是防止听过等于会了。</w:t>
+      </w:r>
+    </w:p>
+    <w:p>
+      <w:pPr>
+        <w:spacing w:after="120" w:line="324" w:lineRule="auto"/>
+      </w:pPr>
+      <w:r>
+        <w:rPr>
+          <w:rFonts w:ascii="微软雅黑" w:hAnsi="微软雅黑" w:eastAsia="微软雅黑"/>
+          <w:b/>
+          <w:sz w:val="26"/>
+        </w:rPr>
+        <w:t>加时续讲：文本再补五分钟</w:t>
+      </w:r>
+    </w:p>
+    <w:p>
+      <w:pPr>
+        <w:spacing w:after="80" w:line="324" w:lineRule="auto"/>
+      </w:pPr>
+      <w:r>
+        <w:rPr>
+          <w:rFonts w:ascii="微软雅黑" w:hAnsi="微软雅黑" w:eastAsia="微软雅黑"/>
+          <w:b w:val="0"/>
+          <w:sz w:val="22"/>
+        </w:rPr>
+        <w:t>错例三分类：否定没处理好、分词切错、标注本身吵。每类写一条改法。没有错例的准确率，我不当真。向量化只 fit 火车，再念一遍，和预处理红线对齐。</w:t>
       </w:r>
     </w:p>
     <w:sectPr>

</xml_diff>

<commit_message>
Add classroom scenario scripts to further thicken each lesson.
Expand oral teaching material with scene-based rehearsal blocks and sync site/Word.
</commit_message>
<xml_diff>
--- a/各课具体教学内容.docx
+++ b/各课具体教学内容.docx
@@ -1488,6 +1488,188 @@
     </w:p>
     <w:p>
       <w:pPr>
+        <w:spacing w:after="120" w:line="324" w:lineRule="auto"/>
+      </w:pPr>
+      <w:r>
+        <w:rPr>
+          <w:rFonts w:ascii="微软雅黑" w:hAnsi="微软雅黑" w:eastAsia="微软雅黑"/>
+          <w:b/>
+          <w:sz w:val="26"/>
+        </w:rPr>
+        <w:t>课堂情景口述：Python 翻车现场</w:t>
+      </w:r>
+    </w:p>
+    <w:p>
+      <w:pPr>
+        <w:spacing w:after="80" w:line="324" w:lineRule="auto"/>
+      </w:pPr>
+      <w:r>
+        <w:rPr>
+          <w:rFonts w:ascii="微软雅黑" w:hAnsi="微软雅黑" w:eastAsia="微软雅黑"/>
+          <w:b/>
+          <w:sz w:val="24"/>
+        </w:rPr>
+        <w:t>情景 1</w:t>
+      </w:r>
+    </w:p>
+    <w:p>
+      <w:pPr>
+        <w:spacing w:after="80" w:line="324" w:lineRule="auto"/>
+      </w:pPr>
+      <w:r>
+        <w:rPr>
+          <w:rFonts w:ascii="微软雅黑" w:hAnsi="微软雅黑" w:eastAsia="微软雅黑"/>
+          <w:b w:val="0"/>
+          <w:sz w:val="22"/>
+        </w:rPr>
+        <w:t>同学 A 读完 CSV 直接算平均分，结果报错。投影 info，发现分数列是 object。现场 to_numeric，错误变缺失，再决定填还是删。这个情景要让全班记住：先看类型，再做统计。</w:t>
+      </w:r>
+    </w:p>
+    <w:p>
+      <w:pPr>
+        <w:spacing w:after="80" w:line="324" w:lineRule="auto"/>
+      </w:pPr>
+      <w:r>
+        <w:rPr>
+          <w:rFonts w:ascii="微软雅黑" w:hAnsi="微软雅黑" w:eastAsia="微软雅黑"/>
+          <w:b w:val="0"/>
+          <w:sz w:val="22"/>
+        </w:rPr>
+        <w:t>停一下。请邻座互相用二十秒复述这一点。复述时不允许只念术语，必须带一个例子。例子说不出来，就举手，我再用更土的话讲一遍。</w:t>
+      </w:r>
+    </w:p>
+    <w:p>
+      <w:pPr>
+        <w:spacing w:after="80" w:line="324" w:lineRule="auto"/>
+      </w:pPr>
+      <w:r>
+        <w:rPr>
+          <w:rFonts w:ascii="微软雅黑" w:hAnsi="微软雅黑" w:eastAsia="微软雅黑"/>
+          <w:b/>
+          <w:sz w:val="24"/>
+        </w:rPr>
+        <w:t>情景 2</w:t>
+      </w:r>
+    </w:p>
+    <w:p>
+      <w:pPr>
+        <w:spacing w:after="80" w:line="324" w:lineRule="auto"/>
+      </w:pPr>
+      <w:r>
+        <w:rPr>
+          <w:rFonts w:ascii="微软雅黑" w:hAnsi="微软雅黑" w:eastAsia="微软雅黑"/>
+          <w:b w:val="0"/>
+          <w:sz w:val="22"/>
+        </w:rPr>
+        <w:t>同学 B 写 df[score&gt;=90] 忘了引号和括号，报错一片红。我们慢改成正确筛选，并打印筛后行数。复合条件再练一题：低分且高缺勤。筛出零行时，先怀疑条件写反。</w:t>
+      </w:r>
+    </w:p>
+    <w:p>
+      <w:pPr>
+        <w:spacing w:after="80" w:line="324" w:lineRule="auto"/>
+      </w:pPr>
+      <w:r>
+        <w:rPr>
+          <w:rFonts w:ascii="微软雅黑" w:hAnsi="微软雅黑" w:eastAsia="微软雅黑"/>
+          <w:b w:val="0"/>
+          <w:sz w:val="22"/>
+        </w:rPr>
+        <w:t>停一下。请邻座互相用二十秒复述这一点。复述时不允许只念术语，必须带一个例子。例子说不出来，就举手，我再用更土的话讲一遍。</w:t>
+      </w:r>
+    </w:p>
+    <w:p>
+      <w:pPr>
+        <w:spacing w:after="80" w:line="324" w:lineRule="auto"/>
+      </w:pPr>
+      <w:r>
+        <w:rPr>
+          <w:rFonts w:ascii="微软雅黑" w:hAnsi="微软雅黑" w:eastAsia="微软雅黑"/>
+          <w:b/>
+          <w:sz w:val="24"/>
+        </w:rPr>
+        <w:t>情景 3</w:t>
+      </w:r>
+    </w:p>
+    <w:p>
+      <w:pPr>
+        <w:spacing w:after="80" w:line="324" w:lineRule="auto"/>
+      </w:pPr>
+      <w:r>
+        <w:rPr>
+          <w:rFonts w:ascii="微软雅黑" w:hAnsi="微软雅黑" w:eastAsia="微软雅黑"/>
+          <w:b w:val="0"/>
+          <w:sz w:val="22"/>
+        </w:rPr>
+        <w:t>同学 C 把一维分数当成特征矩阵送进模型。讲清 df['x'] 与 df[['x']]。shape 打印出来，一维二维一目了然。报错 Expected 2D array 从此对号入座。</w:t>
+      </w:r>
+    </w:p>
+    <w:p>
+      <w:pPr>
+        <w:spacing w:after="80" w:line="324" w:lineRule="auto"/>
+      </w:pPr>
+      <w:r>
+        <w:rPr>
+          <w:rFonts w:ascii="微软雅黑" w:hAnsi="微软雅黑" w:eastAsia="微软雅黑"/>
+          <w:b w:val="0"/>
+          <w:sz w:val="22"/>
+        </w:rPr>
+        <w:t>停一下。请邻座互相用二十秒复述这一点。复述时不允许只念术语，必须带一个例子。例子说不出来，就举手，我再用更土的话讲一遍。</w:t>
+      </w:r>
+    </w:p>
+    <w:p>
+      <w:pPr>
+        <w:spacing w:after="80" w:line="324" w:lineRule="auto"/>
+      </w:pPr>
+      <w:r>
+        <w:rPr>
+          <w:rFonts w:ascii="微软雅黑" w:hAnsi="微软雅黑" w:eastAsia="微软雅黑"/>
+          <w:b/>
+          <w:sz w:val="24"/>
+        </w:rPr>
+        <w:t>情景 4</w:t>
+      </w:r>
+    </w:p>
+    <w:p>
+      <w:pPr>
+        <w:spacing w:after="80" w:line="324" w:lineRule="auto"/>
+      </w:pPr>
+      <w:r>
+        <w:rPr>
+          <w:rFonts w:ascii="微软雅黑" w:hAnsi="微软雅黑" w:eastAsia="微软雅黑"/>
+          <w:b w:val="0"/>
+          <w:sz w:val="22"/>
+        </w:rPr>
+        <w:t>当堂小测：不看讲义写出四件套，并解释每一项看什么。写不全的回家把四件套抄五遍不是惩罚，是肌肉记忆。Python 课过关标准是能独立体检一张新表。</w:t>
+      </w:r>
+    </w:p>
+    <w:p>
+      <w:pPr>
+        <w:spacing w:after="80" w:line="324" w:lineRule="auto"/>
+      </w:pPr>
+      <w:r>
+        <w:rPr>
+          <w:rFonts w:ascii="微软雅黑" w:hAnsi="微软雅黑" w:eastAsia="微软雅黑"/>
+          <w:b w:val="0"/>
+          <w:sz w:val="22"/>
+        </w:rPr>
+        <w:t>停一下。请邻座互相用二十秒复述这一点。复述时不允许只念术语，必须带一个例子。例子说不出来，就举手，我再用更土的话讲一遍。</w:t>
+      </w:r>
+    </w:p>
+    <w:p>
+      <w:pPr>
+        <w:spacing w:after="80" w:line="324" w:lineRule="auto"/>
+      </w:pPr>
+      <w:r>
+        <w:rPr>
+          <w:rFonts w:ascii="微软雅黑" w:hAnsi="微软雅黑" w:eastAsia="微软雅黑"/>
+          <w:b w:val="0"/>
+          <w:sz w:val="22"/>
+        </w:rPr>
+        <w:t>情景口述收束：把刚才每个情景对应到你的作业检查清单上。下一次卡住时，先翻清单，再问老师。能自己定位问题，比多听一个名词更值钱。</w:t>
+      </w:r>
+    </w:p>
+    <w:p>
+      <w:pPr>
         <w:spacing w:after="200" w:line="324" w:lineRule="auto"/>
       </w:pPr>
       <w:r>
@@ -2879,6 +3061,188 @@
     </w:p>
     <w:p>
       <w:pPr>
+        <w:spacing w:after="120" w:line="324" w:lineRule="auto"/>
+      </w:pPr>
+      <w:r>
+        <w:rPr>
+          <w:rFonts w:ascii="微软雅黑" w:hAnsi="微软雅黑" w:eastAsia="微软雅黑"/>
+          <w:b/>
+          <w:sz w:val="26"/>
+        </w:rPr>
+        <w:t>课堂情景口述：环境连环坑</w:t>
+      </w:r>
+    </w:p>
+    <w:p>
+      <w:pPr>
+        <w:spacing w:after="80" w:line="324" w:lineRule="auto"/>
+      </w:pPr>
+      <w:r>
+        <w:rPr>
+          <w:rFonts w:ascii="微软雅黑" w:hAnsi="微软雅黑" w:eastAsia="微软雅黑"/>
+          <w:b/>
+          <w:sz w:val="24"/>
+        </w:rPr>
+        <w:t>情景 1</w:t>
+      </w:r>
+    </w:p>
+    <w:p>
+      <w:pPr>
+        <w:spacing w:after="80" w:line="324" w:lineRule="auto"/>
+      </w:pPr>
+      <w:r>
+        <w:rPr>
+          <w:rFonts w:ascii="微软雅黑" w:hAnsi="微软雅黑" w:eastAsia="微软雅黑"/>
+          <w:b w:val="0"/>
+          <w:sz w:val="22"/>
+        </w:rPr>
+        <w:t>同一台电脑，终端能 import sklearn，Notebook 不能。打印两边 executable，发现内核不是那个环境。切换内核后恢复。把这个故事写成排障第一条。</w:t>
+      </w:r>
+    </w:p>
+    <w:p>
+      <w:pPr>
+        <w:spacing w:after="80" w:line="324" w:lineRule="auto"/>
+      </w:pPr>
+      <w:r>
+        <w:rPr>
+          <w:rFonts w:ascii="微软雅黑" w:hAnsi="微软雅黑" w:eastAsia="微软雅黑"/>
+          <w:b w:val="0"/>
+          <w:sz w:val="22"/>
+        </w:rPr>
+        <w:t>停一下。请邻座互相用二十秒复述这一点。复述时不允许只念术语，必须带一个例子。例子说不出来，就举手，我再用更土的话讲一遍。</w:t>
+      </w:r>
+    </w:p>
+    <w:p>
+      <w:pPr>
+        <w:spacing w:after="80" w:line="324" w:lineRule="auto"/>
+      </w:pPr>
+      <w:r>
+        <w:rPr>
+          <w:rFonts w:ascii="微软雅黑" w:hAnsi="微软雅黑" w:eastAsia="微软雅黑"/>
+          <w:b/>
+          <w:sz w:val="24"/>
+        </w:rPr>
+        <w:t>情景 2</w:t>
+      </w:r>
+    </w:p>
+    <w:p>
+      <w:pPr>
+        <w:spacing w:after="80" w:line="324" w:lineRule="auto"/>
+      </w:pPr>
+      <w:r>
+        <w:rPr>
+          <w:rFonts w:ascii="微软雅黑" w:hAnsi="微软雅黑" w:eastAsia="微软雅黑"/>
+          <w:b w:val="0"/>
+          <w:sz w:val="22"/>
+        </w:rPr>
+        <w:t>路径坑：笔记本在 notebooks 文件夹，数据在 data，相对路径写错。打印 getcwd，改成 ../data/xxx.csv。再演示绝对路径临时排查。</w:t>
+      </w:r>
+    </w:p>
+    <w:p>
+      <w:pPr>
+        <w:spacing w:after="80" w:line="324" w:lineRule="auto"/>
+      </w:pPr>
+      <w:r>
+        <w:rPr>
+          <w:rFonts w:ascii="微软雅黑" w:hAnsi="微软雅黑" w:eastAsia="微软雅黑"/>
+          <w:b w:val="0"/>
+          <w:sz w:val="22"/>
+        </w:rPr>
+        <w:t>停一下。请邻座互相用二十秒复述这一点。复述时不允许只念术语，必须带一个例子。例子说不出来，就举手，我再用更土的话讲一遍。</w:t>
+      </w:r>
+    </w:p>
+    <w:p>
+      <w:pPr>
+        <w:spacing w:after="80" w:line="324" w:lineRule="auto"/>
+      </w:pPr>
+      <w:r>
+        <w:rPr>
+          <w:rFonts w:ascii="微软雅黑" w:hAnsi="微软雅黑" w:eastAsia="微软雅黑"/>
+          <w:b/>
+          <w:sz w:val="24"/>
+        </w:rPr>
+        <w:t>情景 3</w:t>
+      </w:r>
+    </w:p>
+    <w:p>
+      <w:pPr>
+        <w:spacing w:after="80" w:line="324" w:lineRule="auto"/>
+      </w:pPr>
+      <w:r>
+        <w:rPr>
+          <w:rFonts w:ascii="微软雅黑" w:hAnsi="微软雅黑" w:eastAsia="微软雅黑"/>
+          <w:b w:val="0"/>
+          <w:sz w:val="22"/>
+        </w:rPr>
+        <w:t>装包成功但版本乱：pandas 与依赖冲突。策略：重建课程环境，比死磕更快。验收仍是：读样例、画直方图、跑一个极简回归。</w:t>
+      </w:r>
+    </w:p>
+    <w:p>
+      <w:pPr>
+        <w:spacing w:after="80" w:line="324" w:lineRule="auto"/>
+      </w:pPr>
+      <w:r>
+        <w:rPr>
+          <w:rFonts w:ascii="微软雅黑" w:hAnsi="微软雅黑" w:eastAsia="微软雅黑"/>
+          <w:b w:val="0"/>
+          <w:sz w:val="22"/>
+        </w:rPr>
+        <w:t>停一下。请邻座互相用二十秒复述这一点。复述时不允许只念术语，必须带一个例子。例子说不出来，就举手，我再用更土的话讲一遍。</w:t>
+      </w:r>
+    </w:p>
+    <w:p>
+      <w:pPr>
+        <w:spacing w:after="80" w:line="324" w:lineRule="auto"/>
+      </w:pPr>
+      <w:r>
+        <w:rPr>
+          <w:rFonts w:ascii="微软雅黑" w:hAnsi="微软雅黑" w:eastAsia="微软雅黑"/>
+          <w:b/>
+          <w:sz w:val="24"/>
+        </w:rPr>
+        <w:t>情景 4</w:t>
+      </w:r>
+    </w:p>
+    <w:p>
+      <w:pPr>
+        <w:spacing w:after="80" w:line="324" w:lineRule="auto"/>
+      </w:pPr>
+      <w:r>
+        <w:rPr>
+          <w:rFonts w:ascii="微软雅黑" w:hAnsi="微软雅黑" w:eastAsia="微软雅黑"/>
+          <w:b w:val="0"/>
+          <w:sz w:val="22"/>
+        </w:rPr>
+        <w:t>提交前 Run All 失败，因为中间格依赖上面未运行的变量。Restart 后从头跑，才暴露真实问题。假成功今天必须被消灭。</w:t>
+      </w:r>
+    </w:p>
+    <w:p>
+      <w:pPr>
+        <w:spacing w:after="80" w:line="324" w:lineRule="auto"/>
+      </w:pPr>
+      <w:r>
+        <w:rPr>
+          <w:rFonts w:ascii="微软雅黑" w:hAnsi="微软雅黑" w:eastAsia="微软雅黑"/>
+          <w:b w:val="0"/>
+          <w:sz w:val="22"/>
+        </w:rPr>
+        <w:t>停一下。请邻座互相用二十秒复述这一点。复述时不允许只念术语，必须带一个例子。例子说不出来，就举手，我再用更土的话讲一遍。</w:t>
+      </w:r>
+    </w:p>
+    <w:p>
+      <w:pPr>
+        <w:spacing w:after="80" w:line="324" w:lineRule="auto"/>
+      </w:pPr>
+      <w:r>
+        <w:rPr>
+          <w:rFonts w:ascii="微软雅黑" w:hAnsi="微软雅黑" w:eastAsia="微软雅黑"/>
+          <w:b w:val="0"/>
+          <w:sz w:val="22"/>
+        </w:rPr>
+        <w:t>情景口述收束：把刚才每个情景对应到你的作业检查清单上。下一次卡住时，先翻清单，再问老师。能自己定位问题，比多听一个名词更值钱。</w:t>
+      </w:r>
+    </w:p>
+    <w:p>
+      <w:pPr>
         <w:spacing w:after="200" w:line="324" w:lineRule="auto"/>
       </w:pPr>
       <w:r>
@@ -4296,6 +4660,188 @@
     </w:p>
     <w:p>
       <w:pPr>
+        <w:spacing w:after="120" w:line="324" w:lineRule="auto"/>
+      </w:pPr>
+      <w:r>
+        <w:rPr>
+          <w:rFonts w:ascii="微软雅黑" w:hAnsi="微软雅黑" w:eastAsia="微软雅黑"/>
+          <w:b/>
+          <w:sz w:val="26"/>
+        </w:rPr>
+        <w:t>课堂情景口述：读图会审</w:t>
+      </w:r>
+    </w:p>
+    <w:p>
+      <w:pPr>
+        <w:spacing w:after="80" w:line="324" w:lineRule="auto"/>
+      </w:pPr>
+      <w:r>
+        <w:rPr>
+          <w:rFonts w:ascii="微软雅黑" w:hAnsi="微软雅黑" w:eastAsia="微软雅黑"/>
+          <w:b/>
+          <w:sz w:val="24"/>
+        </w:rPr>
+        <w:t>情景 1</w:t>
+      </w:r>
+    </w:p>
+    <w:p>
+      <w:pPr>
+        <w:spacing w:after="80" w:line="324" w:lineRule="auto"/>
+      </w:pPr>
+      <w:r>
+        <w:rPr>
+          <w:rFonts w:ascii="微软雅黑" w:hAnsi="微软雅黑" w:eastAsia="微软雅黑"/>
+          <w:b w:val="0"/>
+          <w:sz w:val="22"/>
+        </w:rPr>
+        <w:t>投一张右偏收入直方图。同学轮流说：峰、尾巴、均值是否被拉高。再问：若做回归，极端高收入会怎样影响平方误差。</w:t>
+      </w:r>
+    </w:p>
+    <w:p>
+      <w:pPr>
+        <w:spacing w:after="80" w:line="324" w:lineRule="auto"/>
+      </w:pPr>
+      <w:r>
+        <w:rPr>
+          <w:rFonts w:ascii="微软雅黑" w:hAnsi="微软雅黑" w:eastAsia="微软雅黑"/>
+          <w:b w:val="0"/>
+          <w:sz w:val="22"/>
+        </w:rPr>
+        <w:t>停一下。请邻座互相用二十秒复述这一点。复述时不允许只念术语，必须带一个例子。例子说不出来，就举手，我再用更土的话讲一遍。</w:t>
+      </w:r>
+    </w:p>
+    <w:p>
+      <w:pPr>
+        <w:spacing w:after="80" w:line="324" w:lineRule="auto"/>
+      </w:pPr>
+      <w:r>
+        <w:rPr>
+          <w:rFonts w:ascii="微软雅黑" w:hAnsi="微软雅黑" w:eastAsia="微软雅黑"/>
+          <w:b/>
+          <w:sz w:val="24"/>
+        </w:rPr>
+        <w:t>情景 2</w:t>
+      </w:r>
+    </w:p>
+    <w:p>
+      <w:pPr>
+        <w:spacing w:after="80" w:line="324" w:lineRule="auto"/>
+      </w:pPr>
+      <w:r>
+        <w:rPr>
+          <w:rFonts w:ascii="微软雅黑" w:hAnsi="微软雅黑" w:eastAsia="微软雅黑"/>
+          <w:b w:val="0"/>
+          <w:sz w:val="22"/>
+        </w:rPr>
+        <w:t>投散点：学习时长对分数，其中两点时长很长分数很低。讨论删还是留。没有业务理由不准删。相关不等于因果再念一遍。</w:t>
+      </w:r>
+    </w:p>
+    <w:p>
+      <w:pPr>
+        <w:spacing w:after="80" w:line="324" w:lineRule="auto"/>
+      </w:pPr>
+      <w:r>
+        <w:rPr>
+          <w:rFonts w:ascii="微软雅黑" w:hAnsi="微软雅黑" w:eastAsia="微软雅黑"/>
+          <w:b w:val="0"/>
+          <w:sz w:val="22"/>
+        </w:rPr>
+        <w:t>停一下。请邻座互相用二十秒复述这一点。复述时不允许只念术语，必须带一个例子。例子说不出来，就举手，我再用更土的话讲一遍。</w:t>
+      </w:r>
+    </w:p>
+    <w:p>
+      <w:pPr>
+        <w:spacing w:after="80" w:line="324" w:lineRule="auto"/>
+      </w:pPr>
+      <w:r>
+        <w:rPr>
+          <w:rFonts w:ascii="微软雅黑" w:hAnsi="微软雅黑" w:eastAsia="微软雅黑"/>
+          <w:b/>
+          <w:sz w:val="24"/>
+        </w:rPr>
+        <w:t>情景 3</w:t>
+      </w:r>
+    </w:p>
+    <w:p>
+      <w:pPr>
+        <w:spacing w:after="80" w:line="324" w:lineRule="auto"/>
+      </w:pPr>
+      <w:r>
+        <w:rPr>
+          <w:rFonts w:ascii="微软雅黑" w:hAnsi="微软雅黑" w:eastAsia="微软雅黑"/>
+          <w:b w:val="0"/>
+          <w:sz w:val="22"/>
+        </w:rPr>
+        <w:t>投截断纵轴柱状图与完整纵轴图，投票哪个差异更大，再揭晓数据相同。视觉诚实写进报告规范。</w:t>
+      </w:r>
+    </w:p>
+    <w:p>
+      <w:pPr>
+        <w:spacing w:after="80" w:line="324" w:lineRule="auto"/>
+      </w:pPr>
+      <w:r>
+        <w:rPr>
+          <w:rFonts w:ascii="微软雅黑" w:hAnsi="微软雅黑" w:eastAsia="微软雅黑"/>
+          <w:b w:val="0"/>
+          <w:sz w:val="22"/>
+        </w:rPr>
+        <w:t>停一下。请邻座互相用二十秒复述这一点。复述时不允许只念术语，必须带一个例子。例子说不出来，就举手，我再用更土的话讲一遍。</w:t>
+      </w:r>
+    </w:p>
+    <w:p>
+      <w:pPr>
+        <w:spacing w:after="80" w:line="324" w:lineRule="auto"/>
+      </w:pPr>
+      <w:r>
+        <w:rPr>
+          <w:rFonts w:ascii="微软雅黑" w:hAnsi="微软雅黑" w:eastAsia="微软雅黑"/>
+          <w:b/>
+          <w:sz w:val="24"/>
+        </w:rPr>
+        <w:t>情景 4</w:t>
+      </w:r>
+    </w:p>
+    <w:p>
+      <w:pPr>
+        <w:spacing w:after="80" w:line="324" w:lineRule="auto"/>
+      </w:pPr>
+      <w:r>
+        <w:rPr>
+          <w:rFonts w:ascii="微软雅黑" w:hAnsi="微软雅黑" w:eastAsia="微软雅黑"/>
+          <w:b w:val="0"/>
+          <w:sz w:val="22"/>
+        </w:rPr>
+        <w:t>每人选一张自己画的图，邻座找茬：缺标题、缺单位、颜色难辨、结论夸大。找茬清单留到期末。</w:t>
+      </w:r>
+    </w:p>
+    <w:p>
+      <w:pPr>
+        <w:spacing w:after="80" w:line="324" w:lineRule="auto"/>
+      </w:pPr>
+      <w:r>
+        <w:rPr>
+          <w:rFonts w:ascii="微软雅黑" w:hAnsi="微软雅黑" w:eastAsia="微软雅黑"/>
+          <w:b w:val="0"/>
+          <w:sz w:val="22"/>
+        </w:rPr>
+        <w:t>停一下。请邻座互相用二十秒复述这一点。复述时不允许只念术语，必须带一个例子。例子说不出来，就举手，我再用更土的话讲一遍。</w:t>
+      </w:r>
+    </w:p>
+    <w:p>
+      <w:pPr>
+        <w:spacing w:after="80" w:line="324" w:lineRule="auto"/>
+      </w:pPr>
+      <w:r>
+        <w:rPr>
+          <w:rFonts w:ascii="微软雅黑" w:hAnsi="微软雅黑" w:eastAsia="微软雅黑"/>
+          <w:b w:val="0"/>
+          <w:sz w:val="22"/>
+        </w:rPr>
+        <w:t>情景口述收束：把刚才每个情景对应到你的作业检查清单上。下一次卡住时，先翻清单，再问老师。能自己定位问题，比多听一个名词更值钱。</w:t>
+      </w:r>
+    </w:p>
+    <w:p>
+      <w:pPr>
         <w:spacing w:after="200" w:line="324" w:lineRule="auto"/>
       </w:pPr>
       <w:r>
@@ -5700,6 +6246,188 @@
     </w:p>
     <w:p>
       <w:pPr>
+        <w:spacing w:after="120" w:line="324" w:lineRule="auto"/>
+      </w:pPr>
+      <w:r>
+        <w:rPr>
+          <w:rFonts w:ascii="微软雅黑" w:hAnsi="微软雅黑" w:eastAsia="微软雅黑"/>
+          <w:b/>
+          <w:sz w:val="26"/>
+        </w:rPr>
+        <w:t>课堂情景口述：泄漏审判庭</w:t>
+      </w:r>
+    </w:p>
+    <w:p>
+      <w:pPr>
+        <w:spacing w:after="80" w:line="324" w:lineRule="auto"/>
+      </w:pPr>
+      <w:r>
+        <w:rPr>
+          <w:rFonts w:ascii="微软雅黑" w:hAnsi="微软雅黑" w:eastAsia="微软雅黑"/>
+          <w:b/>
+          <w:sz w:val="24"/>
+        </w:rPr>
+        <w:t>情景 1</w:t>
+      </w:r>
+    </w:p>
+    <w:p>
+      <w:pPr>
+        <w:spacing w:after="80" w:line="324" w:lineRule="auto"/>
+      </w:pPr>
+      <w:r>
+        <w:rPr>
+          <w:rFonts w:ascii="微软雅黑" w:hAnsi="微软雅黑" w:eastAsia="微软雅黑"/>
+          <w:b w:val="0"/>
+          <w:sz w:val="22"/>
+        </w:rPr>
+        <w:t>控方展示：全数据标准化再划分，测试分九点二。辩方改正：先划分再 fit，分数降到八点四。法官（全班）表决哪个实验可信。</w:t>
+      </w:r>
+    </w:p>
+    <w:p>
+      <w:pPr>
+        <w:spacing w:after="80" w:line="324" w:lineRule="auto"/>
+      </w:pPr>
+      <w:r>
+        <w:rPr>
+          <w:rFonts w:ascii="微软雅黑" w:hAnsi="微软雅黑" w:eastAsia="微软雅黑"/>
+          <w:b w:val="0"/>
+          <w:sz w:val="22"/>
+        </w:rPr>
+        <w:t>停一下。请邻座互相用二十秒复述这一点。复述时不允许只念术语，必须带一个例子。例子说不出来，就举手，我再用更土的话讲一遍。</w:t>
+      </w:r>
+    </w:p>
+    <w:p>
+      <w:pPr>
+        <w:spacing w:after="80" w:line="324" w:lineRule="auto"/>
+      </w:pPr>
+      <w:r>
+        <w:rPr>
+          <w:rFonts w:ascii="微软雅黑" w:hAnsi="微软雅黑" w:eastAsia="微软雅黑"/>
+          <w:b/>
+          <w:sz w:val="24"/>
+        </w:rPr>
+        <w:t>情景 2</w:t>
+      </w:r>
+    </w:p>
+    <w:p>
+      <w:pPr>
+        <w:spacing w:after="80" w:line="324" w:lineRule="auto"/>
+      </w:pPr>
+      <w:r>
+        <w:rPr>
+          <w:rFonts w:ascii="微软雅黑" w:hAnsi="微软雅黑" w:eastAsia="微软雅黑"/>
+          <w:b w:val="0"/>
+          <w:sz w:val="22"/>
+        </w:rPr>
+        <w:t>缺失审判：某列缺失百分之六十。有人主张全填零，有人主张删列，有人主张缺失指示。各组陈述理由，选一种并写进笔记。</w:t>
+      </w:r>
+    </w:p>
+    <w:p>
+      <w:pPr>
+        <w:spacing w:after="80" w:line="324" w:lineRule="auto"/>
+      </w:pPr>
+      <w:r>
+        <w:rPr>
+          <w:rFonts w:ascii="微软雅黑" w:hAnsi="微软雅黑" w:eastAsia="微软雅黑"/>
+          <w:b w:val="0"/>
+          <w:sz w:val="22"/>
+        </w:rPr>
+        <w:t>停一下。请邻座互相用二十秒复述这一点。复述时不允许只念术语，必须带一个例子。例子说不出来，就举手，我再用更土的话讲一遍。</w:t>
+      </w:r>
+    </w:p>
+    <w:p>
+      <w:pPr>
+        <w:spacing w:after="80" w:line="324" w:lineRule="auto"/>
+      </w:pPr>
+      <w:r>
+        <w:rPr>
+          <w:rFonts w:ascii="微软雅黑" w:hAnsi="微软雅黑" w:eastAsia="微软雅黑"/>
+          <w:b/>
+          <w:sz w:val="24"/>
+        </w:rPr>
+        <w:t>情景 3</w:t>
+      </w:r>
+    </w:p>
+    <w:p>
+      <w:pPr>
+        <w:spacing w:after="80" w:line="324" w:lineRule="auto"/>
+      </w:pPr>
+      <w:r>
+        <w:rPr>
+          <w:rFonts w:ascii="微软雅黑" w:hAnsi="微软雅黑" w:eastAsia="微软雅黑"/>
+          <w:b w:val="0"/>
+          <w:sz w:val="22"/>
+        </w:rPr>
+        <w:t>编码审判：城市二百个做 one-hot，维度爆炸。现场合并低频城市为其他，对比 shape。规则必须冻住，测试集出现新城市怎么办，讨论策略。</w:t>
+      </w:r>
+    </w:p>
+    <w:p>
+      <w:pPr>
+        <w:spacing w:after="80" w:line="324" w:lineRule="auto"/>
+      </w:pPr>
+      <w:r>
+        <w:rPr>
+          <w:rFonts w:ascii="微软雅黑" w:hAnsi="微软雅黑" w:eastAsia="微软雅黑"/>
+          <w:b w:val="0"/>
+          <w:sz w:val="22"/>
+        </w:rPr>
+        <w:t>停一下。请邻座互相用二十秒复述这一点。复述时不允许只念术语，必须带一个例子。例子说不出来，就举手，我再用更土的话讲一遍。</w:t>
+      </w:r>
+    </w:p>
+    <w:p>
+      <w:pPr>
+        <w:spacing w:after="80" w:line="324" w:lineRule="auto"/>
+      </w:pPr>
+      <w:r>
+        <w:rPr>
+          <w:rFonts w:ascii="微软雅黑" w:hAnsi="微软雅黑" w:eastAsia="微软雅黑"/>
+          <w:b/>
+          <w:sz w:val="24"/>
+        </w:rPr>
+        <w:t>情景 4</w:t>
+      </w:r>
+    </w:p>
+    <w:p>
+      <w:pPr>
+        <w:spacing w:after="80" w:line="324" w:lineRule="auto"/>
+      </w:pPr>
+      <w:r>
+        <w:rPr>
+          <w:rFonts w:ascii="微软雅黑" w:hAnsi="微软雅黑" w:eastAsia="微软雅黑"/>
+          <w:b w:val="0"/>
+          <w:sz w:val="22"/>
+        </w:rPr>
+        <w:t>口令接力：体检、切分、填充、编码、缩放、检查。每人说一步，说错的从该步重来。预处理纪律靠重复。</w:t>
+      </w:r>
+    </w:p>
+    <w:p>
+      <w:pPr>
+        <w:spacing w:after="80" w:line="324" w:lineRule="auto"/>
+      </w:pPr>
+      <w:r>
+        <w:rPr>
+          <w:rFonts w:ascii="微软雅黑" w:hAnsi="微软雅黑" w:eastAsia="微软雅黑"/>
+          <w:b w:val="0"/>
+          <w:sz w:val="22"/>
+        </w:rPr>
+        <w:t>停一下。请邻座互相用二十秒复述这一点。复述时不允许只念术语，必须带一个例子。例子说不出来，就举手，我再用更土的话讲一遍。</w:t>
+      </w:r>
+    </w:p>
+    <w:p>
+      <w:pPr>
+        <w:spacing w:after="80" w:line="324" w:lineRule="auto"/>
+      </w:pPr>
+      <w:r>
+        <w:rPr>
+          <w:rFonts w:ascii="微软雅黑" w:hAnsi="微软雅黑" w:eastAsia="微软雅黑"/>
+          <w:b w:val="0"/>
+          <w:sz w:val="22"/>
+        </w:rPr>
+        <w:t>情景口述收束：把刚才每个情景对应到你的作业检查清单上。下一次卡住时，先翻清单，再问老师。能自己定位问题，比多听一个名词更值钱。</w:t>
+      </w:r>
+    </w:p>
+    <w:p>
+      <w:pPr>
         <w:spacing w:after="200" w:line="324" w:lineRule="auto"/>
       </w:pPr>
       <w:r>
@@ -7130,6 +7858,188 @@
     </w:p>
     <w:p>
       <w:pPr>
+        <w:spacing w:after="120" w:line="324" w:lineRule="auto"/>
+      </w:pPr>
+      <w:r>
+        <w:rPr>
+          <w:rFonts w:ascii="微软雅黑" w:hAnsi="微软雅黑" w:eastAsia="微软雅黑"/>
+          <w:b/>
+          <w:sz w:val="26"/>
+        </w:rPr>
+        <w:t>课堂情景口述：直线被离群点绑架</w:t>
+      </w:r>
+    </w:p>
+    <w:p>
+      <w:pPr>
+        <w:spacing w:after="80" w:line="324" w:lineRule="auto"/>
+      </w:pPr>
+      <w:r>
+        <w:rPr>
+          <w:rFonts w:ascii="微软雅黑" w:hAnsi="微软雅黑" w:eastAsia="微软雅黑"/>
+          <w:b/>
+          <w:sz w:val="24"/>
+        </w:rPr>
+        <w:t>情景 1</w:t>
+      </w:r>
+    </w:p>
+    <w:p>
+      <w:pPr>
+        <w:spacing w:after="80" w:line="324" w:lineRule="auto"/>
+      </w:pPr>
+      <w:r>
+        <w:rPr>
+          <w:rFonts w:ascii="微软雅黑" w:hAnsi="微软雅黑" w:eastAsia="微软雅黑"/>
+          <w:b w:val="0"/>
+          <w:sz w:val="22"/>
+        </w:rPr>
+        <w:t>先拟合干净点，再加入一个极端点，直线明显偏转。SSE 变大的来源指向谁，请同学指出来。最小二乘怕极端，从此有画面。</w:t>
+      </w:r>
+    </w:p>
+    <w:p>
+      <w:pPr>
+        <w:spacing w:after="80" w:line="324" w:lineRule="auto"/>
+      </w:pPr>
+      <w:r>
+        <w:rPr>
+          <w:rFonts w:ascii="微软雅黑" w:hAnsi="微软雅黑" w:eastAsia="微软雅黑"/>
+          <w:b w:val="0"/>
+          <w:sz w:val="22"/>
+        </w:rPr>
+        <w:t>停一下。请邻座互相用二十秒复述这一点。复述时不允许只念术语，必须带一个例子。例子说不出来，就举手，我再用更土的话讲一遍。</w:t>
+      </w:r>
+    </w:p>
+    <w:p>
+      <w:pPr>
+        <w:spacing w:after="80" w:line="324" w:lineRule="auto"/>
+      </w:pPr>
+      <w:r>
+        <w:rPr>
+          <w:rFonts w:ascii="微软雅黑" w:hAnsi="微软雅黑" w:eastAsia="微软雅黑"/>
+          <w:b/>
+          <w:sz w:val="24"/>
+        </w:rPr>
+        <w:t>情景 2</w:t>
+      </w:r>
+    </w:p>
+    <w:p>
+      <w:pPr>
+        <w:spacing w:after="80" w:line="324" w:lineRule="auto"/>
+      </w:pPr>
+      <w:r>
+        <w:rPr>
+          <w:rFonts w:ascii="微软雅黑" w:hAnsi="微软雅黑" w:eastAsia="微软雅黑"/>
+          <w:b w:val="0"/>
+          <w:sz w:val="22"/>
+        </w:rPr>
+        <w:t>同一模型报 MAE、RMSE、R2。制造大错样本，看哪个指标跳得更凶。理解指标脾气，才不会被单数字骗。</w:t>
+      </w:r>
+    </w:p>
+    <w:p>
+      <w:pPr>
+        <w:spacing w:after="80" w:line="324" w:lineRule="auto"/>
+      </w:pPr>
+      <w:r>
+        <w:rPr>
+          <w:rFonts w:ascii="微软雅黑" w:hAnsi="微软雅黑" w:eastAsia="微软雅黑"/>
+          <w:b w:val="0"/>
+          <w:sz w:val="22"/>
+        </w:rPr>
+        <w:t>停一下。请邻座互相用二十秒复述这一点。复述时不允许只念术语，必须带一个例子。例子说不出来，就举手，我再用更土的话讲一遍。</w:t>
+      </w:r>
+    </w:p>
+    <w:p>
+      <w:pPr>
+        <w:spacing w:after="80" w:line="324" w:lineRule="auto"/>
+      </w:pPr>
+      <w:r>
+        <w:rPr>
+          <w:rFonts w:ascii="微软雅黑" w:hAnsi="微软雅黑" w:eastAsia="微软雅黑"/>
+          <w:b/>
+          <w:sz w:val="24"/>
+        </w:rPr>
+        <w:t>情景 3</w:t>
+      </w:r>
+    </w:p>
+    <w:p>
+      <w:pPr>
+        <w:spacing w:after="80" w:line="324" w:lineRule="auto"/>
+      </w:pPr>
+      <w:r>
+        <w:rPr>
+          <w:rFonts w:ascii="微软雅黑" w:hAnsi="微软雅黑" w:eastAsia="微软雅黑"/>
+          <w:b w:val="0"/>
+          <w:sz w:val="22"/>
+        </w:rPr>
+        <w:t>残差图仍有弯曲：说明直线不够。试二阶多项式，训练变好，测试若变差就停。升阶是药也是毒。</w:t>
+      </w:r>
+    </w:p>
+    <w:p>
+      <w:pPr>
+        <w:spacing w:after="80" w:line="324" w:lineRule="auto"/>
+      </w:pPr>
+      <w:r>
+        <w:rPr>
+          <w:rFonts w:ascii="微软雅黑" w:hAnsi="微软雅黑" w:eastAsia="微软雅黑"/>
+          <w:b w:val="0"/>
+          <w:sz w:val="22"/>
+        </w:rPr>
+        <w:t>停一下。请邻座互相用二十秒复述这一点。复述时不允许只念术语，必须带一个例子。例子说不出来，就举手，我再用更土的话讲一遍。</w:t>
+      </w:r>
+    </w:p>
+    <w:p>
+      <w:pPr>
+        <w:spacing w:after="80" w:line="324" w:lineRule="auto"/>
+      </w:pPr>
+      <w:r>
+        <w:rPr>
+          <w:rFonts w:ascii="微软雅黑" w:hAnsi="微软雅黑" w:eastAsia="微软雅黑"/>
+          <w:b/>
+          <w:sz w:val="24"/>
+        </w:rPr>
+        <w:t>情景 4</w:t>
+      </w:r>
+    </w:p>
+    <w:p>
+      <w:pPr>
+        <w:spacing w:after="80" w:line="324" w:lineRule="auto"/>
+      </w:pPr>
+      <w:r>
+        <w:rPr>
+          <w:rFonts w:ascii="微软雅黑" w:hAnsi="微软雅黑" w:eastAsia="微软雅黑"/>
+          <w:b w:val="0"/>
+          <w:sz w:val="22"/>
+        </w:rPr>
+        <w:t>系数解释辩论：未标准化时，面积系数与房间数系数谁大谁重要？结论：先统一尺度或看实际影响，别只看绝对值。</w:t>
+      </w:r>
+    </w:p>
+    <w:p>
+      <w:pPr>
+        <w:spacing w:after="80" w:line="324" w:lineRule="auto"/>
+      </w:pPr>
+      <w:r>
+        <w:rPr>
+          <w:rFonts w:ascii="微软雅黑" w:hAnsi="微软雅黑" w:eastAsia="微软雅黑"/>
+          <w:b w:val="0"/>
+          <w:sz w:val="22"/>
+        </w:rPr>
+        <w:t>停一下。请邻座互相用二十秒复述这一点。复述时不允许只念术语，必须带一个例子。例子说不出来，就举手，我再用更土的话讲一遍。</w:t>
+      </w:r>
+    </w:p>
+    <w:p>
+      <w:pPr>
+        <w:spacing w:after="80" w:line="324" w:lineRule="auto"/>
+      </w:pPr>
+      <w:r>
+        <w:rPr>
+          <w:rFonts w:ascii="微软雅黑" w:hAnsi="微软雅黑" w:eastAsia="微软雅黑"/>
+          <w:b w:val="0"/>
+          <w:sz w:val="22"/>
+        </w:rPr>
+        <w:t>情景口述收束：把刚才每个情景对应到你的作业检查清单上。下一次卡住时，先翻清单，再问老师。能自己定位问题，比多听一个名词更值钱。</w:t>
+      </w:r>
+    </w:p>
+    <w:p>
+      <w:pPr>
         <w:spacing w:after="200" w:line="324" w:lineRule="auto"/>
       </w:pPr>
       <w:r>
@@ -8534,6 +9444,188 @@
     </w:p>
     <w:p>
       <w:pPr>
+        <w:spacing w:after="120" w:line="324" w:lineRule="auto"/>
+      </w:pPr>
+      <w:r>
+        <w:rPr>
+          <w:rFonts w:ascii="微软雅黑" w:hAnsi="微软雅黑" w:eastAsia="微软雅黑"/>
+          <w:b/>
+          <w:sz w:val="26"/>
+        </w:rPr>
+        <w:t>课堂情景口述：超市小票法庭</w:t>
+      </w:r>
+    </w:p>
+    <w:p>
+      <w:pPr>
+        <w:spacing w:after="80" w:line="324" w:lineRule="auto"/>
+      </w:pPr>
+      <w:r>
+        <w:rPr>
+          <w:rFonts w:ascii="微软雅黑" w:hAnsi="微软雅黑" w:eastAsia="微软雅黑"/>
+          <w:b/>
+          <w:sz w:val="24"/>
+        </w:rPr>
+        <w:t>情景 1</w:t>
+      </w:r>
+    </w:p>
+    <w:p>
+      <w:pPr>
+        <w:spacing w:after="80" w:line="324" w:lineRule="auto"/>
+      </w:pPr>
+      <w:r>
+        <w:rPr>
+          <w:rFonts w:ascii="微软雅黑" w:hAnsi="微软雅黑" w:eastAsia="微软雅黑"/>
+          <w:b w:val="0"/>
+          <w:sz w:val="22"/>
+        </w:rPr>
+        <w:t>五笔小票写黑板上，手算一条规则三指标。算错的地方通常是分母：Support 用全场，Confidence 用前件。</w:t>
+      </w:r>
+    </w:p>
+    <w:p>
+      <w:pPr>
+        <w:spacing w:after="80" w:line="324" w:lineRule="auto"/>
+      </w:pPr>
+      <w:r>
+        <w:rPr>
+          <w:rFonts w:ascii="微软雅黑" w:hAnsi="微软雅黑" w:eastAsia="微软雅黑"/>
+          <w:b w:val="0"/>
+          <w:sz w:val="22"/>
+        </w:rPr>
+        <w:t>停一下。请邻座互相用二十秒复述这一点。复述时不允许只念术语，必须带一个例子。例子说不出来，就举手，我再用更土的话讲一遍。</w:t>
+      </w:r>
+    </w:p>
+    <w:p>
+      <w:pPr>
+        <w:spacing w:after="80" w:line="324" w:lineRule="auto"/>
+      </w:pPr>
+      <w:r>
+        <w:rPr>
+          <w:rFonts w:ascii="微软雅黑" w:hAnsi="微软雅黑" w:eastAsia="微软雅黑"/>
+          <w:b/>
+          <w:sz w:val="24"/>
+        </w:rPr>
+        <w:t>情景 2</w:t>
+      </w:r>
+    </w:p>
+    <w:p>
+      <w:pPr>
+        <w:spacing w:after="80" w:line="324" w:lineRule="auto"/>
+      </w:pPr>
+      <w:r>
+        <w:rPr>
+          <w:rFonts w:ascii="微软雅黑" w:hAnsi="微软雅黑" w:eastAsia="微软雅黑"/>
+          <w:b w:val="0"/>
+          <w:sz w:val="22"/>
+        </w:rPr>
+        <w:t>构造假高置信：后件是热销面包。Lift 接近一，规则被驳回。全班给这条规则写驳回理由。</w:t>
+      </w:r>
+    </w:p>
+    <w:p>
+      <w:pPr>
+        <w:spacing w:after="80" w:line="324" w:lineRule="auto"/>
+      </w:pPr>
+      <w:r>
+        <w:rPr>
+          <w:rFonts w:ascii="微软雅黑" w:hAnsi="微软雅黑" w:eastAsia="微软雅黑"/>
+          <w:b w:val="0"/>
+          <w:sz w:val="22"/>
+        </w:rPr>
+        <w:t>停一下。请邻座互相用二十秒复述这一点。复述时不允许只念术语，必须带一个例子。例子说不出来，就举手，我再用更土的话讲一遍。</w:t>
+      </w:r>
+    </w:p>
+    <w:p>
+      <w:pPr>
+        <w:spacing w:after="80" w:line="324" w:lineRule="auto"/>
+      </w:pPr>
+      <w:r>
+        <w:rPr>
+          <w:rFonts w:ascii="微软雅黑" w:hAnsi="微软雅黑" w:eastAsia="微软雅黑"/>
+          <w:b/>
+          <w:sz w:val="24"/>
+        </w:rPr>
+        <w:t>情景 3</w:t>
+      </w:r>
+    </w:p>
+    <w:p>
+      <w:pPr>
+        <w:spacing w:after="80" w:line="324" w:lineRule="auto"/>
+      </w:pPr>
+      <w:r>
+        <w:rPr>
+          <w:rFonts w:ascii="微软雅黑" w:hAnsi="微软雅黑" w:eastAsia="微软雅黑"/>
+          <w:b w:val="0"/>
+          <w:sz w:val="22"/>
+        </w:rPr>
+        <w:t>方向辩论：尿布推啤酒，还是啤酒推尿布？两个方向都算，选更能指导货架的一侧。</w:t>
+      </w:r>
+    </w:p>
+    <w:p>
+      <w:pPr>
+        <w:spacing w:after="80" w:line="324" w:lineRule="auto"/>
+      </w:pPr>
+      <w:r>
+        <w:rPr>
+          <w:rFonts w:ascii="微软雅黑" w:hAnsi="微软雅黑" w:eastAsia="微软雅黑"/>
+          <w:b w:val="0"/>
+          <w:sz w:val="22"/>
+        </w:rPr>
+        <w:t>停一下。请邻座互相用二十秒复述这一点。复述时不允许只念术语，必须带一个例子。例子说不出来，就举手，我再用更土的话讲一遍。</w:t>
+      </w:r>
+    </w:p>
+    <w:p>
+      <w:pPr>
+        <w:spacing w:after="80" w:line="324" w:lineRule="auto"/>
+      </w:pPr>
+      <w:r>
+        <w:rPr>
+          <w:rFonts w:ascii="微软雅黑" w:hAnsi="微软雅黑" w:eastAsia="微软雅黑"/>
+          <w:b/>
+          <w:sz w:val="24"/>
+        </w:rPr>
+        <w:t>情景 4</w:t>
+      </w:r>
+    </w:p>
+    <w:p>
+      <w:pPr>
+        <w:spacing w:after="80" w:line="324" w:lineRule="auto"/>
+      </w:pPr>
+      <w:r>
+        <w:rPr>
+          <w:rFonts w:ascii="微软雅黑" w:hAnsi="微软雅黑" w:eastAsia="微软雅黑"/>
+          <w:b w:val="0"/>
+          <w:sz w:val="22"/>
+        </w:rPr>
+        <w:t>业务筛选：从软件吐出的二十条里只留三条可试点，说明为何丢掉其余。关联课交付是筛选，不是堆规则。</w:t>
+      </w:r>
+    </w:p>
+    <w:p>
+      <w:pPr>
+        <w:spacing w:after="80" w:line="324" w:lineRule="auto"/>
+      </w:pPr>
+      <w:r>
+        <w:rPr>
+          <w:rFonts w:ascii="微软雅黑" w:hAnsi="微软雅黑" w:eastAsia="微软雅黑"/>
+          <w:b w:val="0"/>
+          <w:sz w:val="22"/>
+        </w:rPr>
+        <w:t>停一下。请邻座互相用二十秒复述这一点。复述时不允许只念术语，必须带一个例子。例子说不出来，就举手，我再用更土的话讲一遍。</w:t>
+      </w:r>
+    </w:p>
+    <w:p>
+      <w:pPr>
+        <w:spacing w:after="80" w:line="324" w:lineRule="auto"/>
+      </w:pPr>
+      <w:r>
+        <w:rPr>
+          <w:rFonts w:ascii="微软雅黑" w:hAnsi="微软雅黑" w:eastAsia="微软雅黑"/>
+          <w:b w:val="0"/>
+          <w:sz w:val="22"/>
+        </w:rPr>
+        <w:t>情景口述收束：把刚才每个情景对应到你的作业检查清单上。下一次卡住时，先翻清单，再问老师。能自己定位问题，比多听一个名词更值钱。</w:t>
+      </w:r>
+    </w:p>
+    <w:p>
+      <w:pPr>
         <w:spacing w:after="200" w:line="324" w:lineRule="auto"/>
       </w:pPr>
       <w:r>
@@ -9925,6 +11017,188 @@
     </w:p>
     <w:p>
       <w:pPr>
+        <w:spacing w:after="120" w:line="324" w:lineRule="auto"/>
+      </w:pPr>
+      <w:r>
+        <w:rPr>
+          <w:rFonts w:ascii="微软雅黑" w:hAnsi="微软雅黑" w:eastAsia="微软雅黑"/>
+          <w:b/>
+          <w:sz w:val="26"/>
+        </w:rPr>
+        <w:t>课堂情景口述：分群作战室</w:t>
+      </w:r>
+    </w:p>
+    <w:p>
+      <w:pPr>
+        <w:spacing w:after="80" w:line="324" w:lineRule="auto"/>
+      </w:pPr>
+      <w:r>
+        <w:rPr>
+          <w:rFonts w:ascii="微软雅黑" w:hAnsi="微软雅黑" w:eastAsia="微软雅黑"/>
+          <w:b/>
+          <w:sz w:val="24"/>
+        </w:rPr>
+        <w:t>情景 1</w:t>
+      </w:r>
+    </w:p>
+    <w:p>
+      <w:pPr>
+        <w:spacing w:after="80" w:line="324" w:lineRule="auto"/>
+      </w:pPr>
+      <w:r>
+        <w:rPr>
+          <w:rFonts w:ascii="微软雅黑" w:hAnsi="微软雅黑" w:eastAsia="微软雅黑"/>
+          <w:b w:val="0"/>
+          <w:sz w:val="22"/>
+        </w:rPr>
+        <w:t>不标准化分群，被收入绑架；标准化后再分，故事改写。两张中心表对比，量纲表决被揭穿。</w:t>
+      </w:r>
+    </w:p>
+    <w:p>
+      <w:pPr>
+        <w:spacing w:after="80" w:line="324" w:lineRule="auto"/>
+      </w:pPr>
+      <w:r>
+        <w:rPr>
+          <w:rFonts w:ascii="微软雅黑" w:hAnsi="微软雅黑" w:eastAsia="微软雅黑"/>
+          <w:b w:val="0"/>
+          <w:sz w:val="22"/>
+        </w:rPr>
+        <w:t>停一下。请邻座互相用二十秒复述这一点。复述时不允许只念术语，必须带一个例子。例子说不出来，就举手，我再用更土的话讲一遍。</w:t>
+      </w:r>
+    </w:p>
+    <w:p>
+      <w:pPr>
+        <w:spacing w:after="80" w:line="324" w:lineRule="auto"/>
+      </w:pPr>
+      <w:r>
+        <w:rPr>
+          <w:rFonts w:ascii="微软雅黑" w:hAnsi="微软雅黑" w:eastAsia="微软雅黑"/>
+          <w:b/>
+          <w:sz w:val="24"/>
+        </w:rPr>
+        <w:t>情景 2</w:t>
+      </w:r>
+    </w:p>
+    <w:p>
+      <w:pPr>
+        <w:spacing w:after="80" w:line="324" w:lineRule="auto"/>
+      </w:pPr>
+      <w:r>
+        <w:rPr>
+          <w:rFonts w:ascii="微软雅黑" w:hAnsi="微软雅黑" w:eastAsia="微软雅黑"/>
+          <w:b w:val="0"/>
+          <w:sz w:val="22"/>
+        </w:rPr>
+        <w:t>K 从二到五，给每个 K 起名。起不出名字的 K 淘汰，哪怕轮廓略高。可解释优先。</w:t>
+      </w:r>
+    </w:p>
+    <w:p>
+      <w:pPr>
+        <w:spacing w:after="80" w:line="324" w:lineRule="auto"/>
+      </w:pPr>
+      <w:r>
+        <w:rPr>
+          <w:rFonts w:ascii="微软雅黑" w:hAnsi="微软雅黑" w:eastAsia="微软雅黑"/>
+          <w:b w:val="0"/>
+          <w:sz w:val="22"/>
+        </w:rPr>
+        <w:t>停一下。请邻座互相用二十秒复述这一点。复述时不允许只念术语，必须带一个例子。例子说不出来，就举手，我再用更土的话讲一遍。</w:t>
+      </w:r>
+    </w:p>
+    <w:p>
+      <w:pPr>
+        <w:spacing w:after="80" w:line="324" w:lineRule="auto"/>
+      </w:pPr>
+      <w:r>
+        <w:rPr>
+          <w:rFonts w:ascii="微软雅黑" w:hAnsi="微软雅黑" w:eastAsia="微软雅黑"/>
+          <w:b/>
+          <w:sz w:val="24"/>
+        </w:rPr>
+        <w:t>情景 3</w:t>
+      </w:r>
+    </w:p>
+    <w:p>
+      <w:pPr>
+        <w:spacing w:after="80" w:line="324" w:lineRule="auto"/>
+      </w:pPr>
+      <w:r>
+        <w:rPr>
+          <w:rFonts w:ascii="微软雅黑" w:hAnsi="微软雅黑" w:eastAsia="微软雅黑"/>
+          <w:b w:val="0"/>
+          <w:sz w:val="22"/>
+        </w:rPr>
+        <w:t>画像作战：每簇写动作。沉睡客发券要控成本，高价值客别发低价券砸品牌。动作要匹配。</w:t>
+      </w:r>
+    </w:p>
+    <w:p>
+      <w:pPr>
+        <w:spacing w:after="80" w:line="324" w:lineRule="auto"/>
+      </w:pPr>
+      <w:r>
+        <w:rPr>
+          <w:rFonts w:ascii="微软雅黑" w:hAnsi="微软雅黑" w:eastAsia="微软雅黑"/>
+          <w:b w:val="0"/>
+          <w:sz w:val="22"/>
+        </w:rPr>
+        <w:t>停一下。请邻座互相用二十秒复述这一点。复述时不允许只念术语，必须带一个例子。例子说不出来，就举手，我再用更土的话讲一遍。</w:t>
+      </w:r>
+    </w:p>
+    <w:p>
+      <w:pPr>
+        <w:spacing w:after="80" w:line="324" w:lineRule="auto"/>
+      </w:pPr>
+      <w:r>
+        <w:rPr>
+          <w:rFonts w:ascii="微软雅黑" w:hAnsi="微软雅黑" w:eastAsia="微软雅黑"/>
+          <w:b/>
+          <w:sz w:val="24"/>
+        </w:rPr>
+        <w:t>情景 4</w:t>
+      </w:r>
+    </w:p>
+    <w:p>
+      <w:pPr>
+        <w:spacing w:after="80" w:line="324" w:lineRule="auto"/>
+      </w:pPr>
+      <w:r>
+        <w:rPr>
+          <w:rFonts w:ascii="微软雅黑" w:hAnsi="微软雅黑" w:eastAsia="微软雅黑"/>
+          <w:b w:val="0"/>
+          <w:sz w:val="22"/>
+        </w:rPr>
+        <w:t>稳定性警告：重训后零一对调，业务系统若写死编号会乱。解决方案：保存中心，新用户靠最近中心分配。</w:t>
+      </w:r>
+    </w:p>
+    <w:p>
+      <w:pPr>
+        <w:spacing w:after="80" w:line="324" w:lineRule="auto"/>
+      </w:pPr>
+      <w:r>
+        <w:rPr>
+          <w:rFonts w:ascii="微软雅黑" w:hAnsi="微软雅黑" w:eastAsia="微软雅黑"/>
+          <w:b w:val="0"/>
+          <w:sz w:val="22"/>
+        </w:rPr>
+        <w:t>停一下。请邻座互相用二十秒复述这一点。复述时不允许只念术语，必须带一个例子。例子说不出来，就举手，我再用更土的话讲一遍。</w:t>
+      </w:r>
+    </w:p>
+    <w:p>
+      <w:pPr>
+        <w:spacing w:after="80" w:line="324" w:lineRule="auto"/>
+      </w:pPr>
+      <w:r>
+        <w:rPr>
+          <w:rFonts w:ascii="微软雅黑" w:hAnsi="微软雅黑" w:eastAsia="微软雅黑"/>
+          <w:b w:val="0"/>
+          <w:sz w:val="22"/>
+        </w:rPr>
+        <w:t>情景口述收束：把刚才每个情景对应到你的作业检查清单上。下一次卡住时，先翻清单，再问老师。能自己定位问题，比多听一个名词更值钱。</w:t>
+      </w:r>
+    </w:p>
+    <w:p>
+      <w:pPr>
         <w:spacing w:after="200" w:line="324" w:lineRule="auto"/>
       </w:pPr>
       <w:r>
@@ -11290,6 +12564,188 @@
     </w:p>
     <w:p>
       <w:pPr>
+        <w:spacing w:after="120" w:line="324" w:lineRule="auto"/>
+      </w:pPr>
+      <w:r>
+        <w:rPr>
+          <w:rFonts w:ascii="微软雅黑" w:hAnsi="微软雅黑" w:eastAsia="微软雅黑"/>
+          <w:b/>
+          <w:sz w:val="26"/>
+        </w:rPr>
+        <w:t>课堂情景口述：过拟合展览馆</w:t>
+      </w:r>
+    </w:p>
+    <w:p>
+      <w:pPr>
+        <w:spacing w:after="80" w:line="324" w:lineRule="auto"/>
+      </w:pPr>
+      <w:r>
+        <w:rPr>
+          <w:rFonts w:ascii="微软雅黑" w:hAnsi="微软雅黑" w:eastAsia="微软雅黑"/>
+          <w:b/>
+          <w:sz w:val="24"/>
+        </w:rPr>
+        <w:t>情景 1</w:t>
+      </w:r>
+    </w:p>
+    <w:p>
+      <w:pPr>
+        <w:spacing w:after="80" w:line="324" w:lineRule="auto"/>
+      </w:pPr>
+      <w:r>
+        <w:rPr>
+          <w:rFonts w:ascii="微软雅黑" w:hAnsi="微软雅黑" w:eastAsia="微软雅黑"/>
+          <w:b w:val="0"/>
+          <w:sz w:val="22"/>
+        </w:rPr>
+        <w:t>深度二到十二的训练测试曲线展览。指出分叉点。过拟合从词变成图。</w:t>
+      </w:r>
+    </w:p>
+    <w:p>
+      <w:pPr>
+        <w:spacing w:after="80" w:line="324" w:lineRule="auto"/>
+      </w:pPr>
+      <w:r>
+        <w:rPr>
+          <w:rFonts w:ascii="微软雅黑" w:hAnsi="微软雅黑" w:eastAsia="微软雅黑"/>
+          <w:b w:val="0"/>
+          <w:sz w:val="22"/>
+        </w:rPr>
+        <w:t>停一下。请邻座互相用二十秒复述这一点。复述时不允许只念术语，必须带一个例子。例子说不出来，就举手，我再用更土的话讲一遍。</w:t>
+      </w:r>
+    </w:p>
+    <w:p>
+      <w:pPr>
+        <w:spacing w:after="80" w:line="324" w:lineRule="auto"/>
+      </w:pPr>
+      <w:r>
+        <w:rPr>
+          <w:rFonts w:ascii="微软雅黑" w:hAnsi="微软雅黑" w:eastAsia="微软雅黑"/>
+          <w:b/>
+          <w:sz w:val="24"/>
+        </w:rPr>
+        <w:t>情景 2</w:t>
+      </w:r>
+    </w:p>
+    <w:p>
+      <w:pPr>
+        <w:spacing w:after="80" w:line="324" w:lineRule="auto"/>
+      </w:pPr>
+      <w:r>
+        <w:rPr>
+          <w:rFonts w:ascii="微软雅黑" w:hAnsi="微软雅黑" w:eastAsia="微软雅黑"/>
+          <w:b w:val="0"/>
+          <w:sz w:val="22"/>
+        </w:rPr>
+        <w:t>单树三次不同种子，分数晃；森林二百棵，晃变小。稳定性被看见。</w:t>
+      </w:r>
+    </w:p>
+    <w:p>
+      <w:pPr>
+        <w:spacing w:after="80" w:line="324" w:lineRule="auto"/>
+      </w:pPr>
+      <w:r>
+        <w:rPr>
+          <w:rFonts w:ascii="微软雅黑" w:hAnsi="微软雅黑" w:eastAsia="微软雅黑"/>
+          <w:b w:val="0"/>
+          <w:sz w:val="22"/>
+        </w:rPr>
+        <w:t>停一下。请邻座互相用二十秒复述这一点。复述时不允许只念术语，必须带一个例子。例子说不出来，就举手，我再用更土的话讲一遍。</w:t>
+      </w:r>
+    </w:p>
+    <w:p>
+      <w:pPr>
+        <w:spacing w:after="80" w:line="324" w:lineRule="auto"/>
+      </w:pPr>
+      <w:r>
+        <w:rPr>
+          <w:rFonts w:ascii="微软雅黑" w:hAnsi="微软雅黑" w:eastAsia="微软雅黑"/>
+          <w:b/>
+          <w:sz w:val="24"/>
+        </w:rPr>
+        <w:t>情景 3</w:t>
+      </w:r>
+    </w:p>
+    <w:p>
+      <w:pPr>
+        <w:spacing w:after="80" w:line="324" w:lineRule="auto"/>
+      </w:pPr>
+      <w:r>
+        <w:rPr>
+          <w:rFonts w:ascii="微软雅黑" w:hAnsi="微软雅黑" w:eastAsia="微软雅黑"/>
+          <w:b w:val="0"/>
+          <w:sz w:val="22"/>
+        </w:rPr>
+        <w:t>混淆矩阵角色扮演：风控要召回，运营要精确。同一矩阵，两人给出不同阈值建议。</w:t>
+      </w:r>
+    </w:p>
+    <w:p>
+      <w:pPr>
+        <w:spacing w:after="80" w:line="324" w:lineRule="auto"/>
+      </w:pPr>
+      <w:r>
+        <w:rPr>
+          <w:rFonts w:ascii="微软雅黑" w:hAnsi="微软雅黑" w:eastAsia="微软雅黑"/>
+          <w:b w:val="0"/>
+          <w:sz w:val="22"/>
+        </w:rPr>
+        <w:t>停一下。请邻座互相用二十秒复述这一点。复述时不允许只念术语，必须带一个例子。例子说不出来，就举手，我再用更土的话讲一遍。</w:t>
+      </w:r>
+    </w:p>
+    <w:p>
+      <w:pPr>
+        <w:spacing w:after="80" w:line="324" w:lineRule="auto"/>
+      </w:pPr>
+      <w:r>
+        <w:rPr>
+          <w:rFonts w:ascii="微软雅黑" w:hAnsi="微软雅黑" w:eastAsia="微软雅黑"/>
+          <w:b/>
+          <w:sz w:val="24"/>
+        </w:rPr>
+        <w:t>情景 4</w:t>
+      </w:r>
+    </w:p>
+    <w:p>
+      <w:pPr>
+        <w:spacing w:after="80" w:line="324" w:lineRule="auto"/>
+      </w:pPr>
+      <w:r>
+        <w:rPr>
+          <w:rFonts w:ascii="微软雅黑" w:hAnsi="微软雅黑" w:eastAsia="微软雅黑"/>
+          <w:b w:val="0"/>
+          <w:sz w:val="22"/>
+        </w:rPr>
+        <w:t>重要性陷阱：放入「是否已违约结案」这类泄漏列，重要性爆表。删掉后再训，教训是先审特征可用性。</w:t>
+      </w:r>
+    </w:p>
+    <w:p>
+      <w:pPr>
+        <w:spacing w:after="80" w:line="324" w:lineRule="auto"/>
+      </w:pPr>
+      <w:r>
+        <w:rPr>
+          <w:rFonts w:ascii="微软雅黑" w:hAnsi="微软雅黑" w:eastAsia="微软雅黑"/>
+          <w:b w:val="0"/>
+          <w:sz w:val="22"/>
+        </w:rPr>
+        <w:t>停一下。请邻座互相用二十秒复述这一点。复述时不允许只念术语，必须带一个例子。例子说不出来，就举手，我再用更土的话讲一遍。</w:t>
+      </w:r>
+    </w:p>
+    <w:p>
+      <w:pPr>
+        <w:spacing w:after="80" w:line="324" w:lineRule="auto"/>
+      </w:pPr>
+      <w:r>
+        <w:rPr>
+          <w:rFonts w:ascii="微软雅黑" w:hAnsi="微软雅黑" w:eastAsia="微软雅黑"/>
+          <w:b w:val="0"/>
+          <w:sz w:val="22"/>
+        </w:rPr>
+        <w:t>情景口述收束：把刚才每个情景对应到你的作业检查清单上。下一次卡住时，先翻清单，再问老师。能自己定位问题，比多听一个名词更值钱。</w:t>
+      </w:r>
+    </w:p>
+    <w:p>
+      <w:pPr>
         <w:spacing w:after="200" w:line="324" w:lineRule="auto"/>
       </w:pPr>
       <w:r>
@@ -12668,6 +14124,188 @@
     </w:p>
     <w:p>
       <w:pPr>
+        <w:spacing w:after="120" w:line="324" w:lineRule="auto"/>
+      </w:pPr>
+      <w:r>
+        <w:rPr>
+          <w:rFonts w:ascii="微软雅黑" w:hAnsi="微软雅黑" w:eastAsia="微软雅黑"/>
+          <w:b/>
+          <w:sz w:val="26"/>
+        </w:rPr>
+        <w:t>课堂情景口述：先验更新工作坊</w:t>
+      </w:r>
+    </w:p>
+    <w:p>
+      <w:pPr>
+        <w:spacing w:after="80" w:line="324" w:lineRule="auto"/>
+      </w:pPr>
+      <w:r>
+        <w:rPr>
+          <w:rFonts w:ascii="微软雅黑" w:hAnsi="微软雅黑" w:eastAsia="微软雅黑"/>
+          <w:b/>
+          <w:sz w:val="24"/>
+        </w:rPr>
+        <w:t>情景 1</w:t>
+      </w:r>
+    </w:p>
+    <w:p>
+      <w:pPr>
+        <w:spacing w:after="80" w:line="324" w:lineRule="auto"/>
+      </w:pPr>
+      <w:r>
+        <w:rPr>
+          <w:rFonts w:ascii="微软雅黑" w:hAnsi="微软雅黑" w:eastAsia="微软雅黑"/>
+          <w:b w:val="0"/>
+          <w:sz w:val="22"/>
+        </w:rPr>
+        <w:t>先让全班拍脑袋猜某词出现时是垃圾邮件的概率，再给统计证据更新。体会先验到后验。</w:t>
+      </w:r>
+    </w:p>
+    <w:p>
+      <w:pPr>
+        <w:spacing w:after="80" w:line="324" w:lineRule="auto"/>
+      </w:pPr>
+      <w:r>
+        <w:rPr>
+          <w:rFonts w:ascii="微软雅黑" w:hAnsi="微软雅黑" w:eastAsia="微软雅黑"/>
+          <w:b w:val="0"/>
+          <w:sz w:val="22"/>
+        </w:rPr>
+        <w:t>停一下。请邻座互相用二十秒复述这一点。复述时不允许只念术语，必须带一个例子。例子说不出来，就举手，我再用更土的话讲一遍。</w:t>
+      </w:r>
+    </w:p>
+    <w:p>
+      <w:pPr>
+        <w:spacing w:after="80" w:line="324" w:lineRule="auto"/>
+      </w:pPr>
+      <w:r>
+        <w:rPr>
+          <w:rFonts w:ascii="微软雅黑" w:hAnsi="微软雅黑" w:eastAsia="微软雅黑"/>
+          <w:b/>
+          <w:sz w:val="24"/>
+        </w:rPr>
+        <w:t>情景 2</w:t>
+      </w:r>
+    </w:p>
+    <w:p>
+      <w:pPr>
+        <w:spacing w:after="80" w:line="324" w:lineRule="auto"/>
+      </w:pPr>
+      <w:r>
+        <w:rPr>
+          <w:rFonts w:ascii="微软雅黑" w:hAnsi="微软雅黑" w:eastAsia="微软雅黑"/>
+          <w:b w:val="0"/>
+          <w:sz w:val="22"/>
+        </w:rPr>
+        <w:t>关闭平滑，塞入未见词，概率归零；打开平滑，恢复。零概率灾难有了身体记忆。</w:t>
+      </w:r>
+    </w:p>
+    <w:p>
+      <w:pPr>
+        <w:spacing w:after="80" w:line="324" w:lineRule="auto"/>
+      </w:pPr>
+      <w:r>
+        <w:rPr>
+          <w:rFonts w:ascii="微软雅黑" w:hAnsi="微软雅黑" w:eastAsia="微软雅黑"/>
+          <w:b w:val="0"/>
+          <w:sz w:val="22"/>
+        </w:rPr>
+        <w:t>停一下。请邻座互相用二十秒复述这一点。复述时不允许只念术语，必须带一个例子。例子说不出来，就举手，我再用更土的话讲一遍。</w:t>
+      </w:r>
+    </w:p>
+    <w:p>
+      <w:pPr>
+        <w:spacing w:after="80" w:line="324" w:lineRule="auto"/>
+      </w:pPr>
+      <w:r>
+        <w:rPr>
+          <w:rFonts w:ascii="微软雅黑" w:hAnsi="微软雅黑" w:eastAsia="微软雅黑"/>
+          <w:b/>
+          <w:sz w:val="24"/>
+        </w:rPr>
+        <w:t>情景 3</w:t>
+      </w:r>
+    </w:p>
+    <w:p>
+      <w:pPr>
+        <w:spacing w:after="80" w:line="324" w:lineRule="auto"/>
+      </w:pPr>
+      <w:r>
+        <w:rPr>
+          <w:rFonts w:ascii="微软雅黑" w:hAnsi="微软雅黑" w:eastAsia="微软雅黑"/>
+          <w:b w:val="0"/>
+          <w:sz w:val="22"/>
+        </w:rPr>
+        <w:t>阈值游戏：漏检代价高时，把阈值从零点五降到零点三，看召回上升、精确下降。业务决定阈值。</w:t>
+      </w:r>
+    </w:p>
+    <w:p>
+      <w:pPr>
+        <w:spacing w:after="80" w:line="324" w:lineRule="auto"/>
+      </w:pPr>
+      <w:r>
+        <w:rPr>
+          <w:rFonts w:ascii="微软雅黑" w:hAnsi="微软雅黑" w:eastAsia="微软雅黑"/>
+          <w:b w:val="0"/>
+          <w:sz w:val="22"/>
+        </w:rPr>
+        <w:t>停一下。请邻座互相用二十秒复述这一点。复述时不允许只念术语，必须带一个例子。例子说不出来，就举手，我再用更土的话讲一遍。</w:t>
+      </w:r>
+    </w:p>
+    <w:p>
+      <w:pPr>
+        <w:spacing w:after="80" w:line="324" w:lineRule="auto"/>
+      </w:pPr>
+      <w:r>
+        <w:rPr>
+          <w:rFonts w:ascii="微软雅黑" w:hAnsi="微软雅黑" w:eastAsia="微软雅黑"/>
+          <w:b/>
+          <w:sz w:val="24"/>
+        </w:rPr>
+        <w:t>情景 4</w:t>
+      </w:r>
+    </w:p>
+    <w:p>
+      <w:pPr>
+        <w:spacing w:after="80" w:line="324" w:lineRule="auto"/>
+      </w:pPr>
+      <w:r>
+        <w:rPr>
+          <w:rFonts w:ascii="微软雅黑" w:hAnsi="微软雅黑" w:eastAsia="微软雅黑"/>
+          <w:b w:val="0"/>
+          <w:sz w:val="22"/>
+        </w:rPr>
+        <w:t>文本预习：说明为何词频适配多项式 NB，连续体检指标可能适配高斯。选错家族会无故变差。</w:t>
+      </w:r>
+    </w:p>
+    <w:p>
+      <w:pPr>
+        <w:spacing w:after="80" w:line="324" w:lineRule="auto"/>
+      </w:pPr>
+      <w:r>
+        <w:rPr>
+          <w:rFonts w:ascii="微软雅黑" w:hAnsi="微软雅黑" w:eastAsia="微软雅黑"/>
+          <w:b w:val="0"/>
+          <w:sz w:val="22"/>
+        </w:rPr>
+        <w:t>停一下。请邻座互相用二十秒复述这一点。复述时不允许只念术语，必须带一个例子。例子说不出来，就举手，我再用更土的话讲一遍。</w:t>
+      </w:r>
+    </w:p>
+    <w:p>
+      <w:pPr>
+        <w:spacing w:after="80" w:line="324" w:lineRule="auto"/>
+      </w:pPr>
+      <w:r>
+        <w:rPr>
+          <w:rFonts w:ascii="微软雅黑" w:hAnsi="微软雅黑" w:eastAsia="微软雅黑"/>
+          <w:b w:val="0"/>
+          <w:sz w:val="22"/>
+        </w:rPr>
+        <w:t>情景口述收束：把刚才每个情景对应到你的作业检查清单上。下一次卡住时，先翻清单，再问老师。能自己定位问题，比多听一个名词更值钱。</w:t>
+      </w:r>
+    </w:p>
+    <w:p>
+      <w:pPr>
         <w:spacing w:after="200" w:line="324" w:lineRule="auto"/>
       </w:pPr>
       <w:r>
@@ -14020,6 +15658,188 @@
     </w:p>
     <w:p>
       <w:pPr>
+        <w:spacing w:after="120" w:line="324" w:lineRule="auto"/>
+      </w:pPr>
+      <w:r>
+        <w:rPr>
+          <w:rFonts w:ascii="微软雅黑" w:hAnsi="微软雅黑" w:eastAsia="微软雅黑"/>
+          <w:b/>
+          <w:sz w:val="26"/>
+        </w:rPr>
+        <w:t>课堂情景口述：去神化实验台</w:t>
+      </w:r>
+    </w:p>
+    <w:p>
+      <w:pPr>
+        <w:spacing w:after="80" w:line="324" w:lineRule="auto"/>
+      </w:pPr>
+      <w:r>
+        <w:rPr>
+          <w:rFonts w:ascii="微软雅黑" w:hAnsi="微软雅黑" w:eastAsia="微软雅黑"/>
+          <w:b/>
+          <w:sz w:val="24"/>
+        </w:rPr>
+        <w:t>情景 1</w:t>
+      </w:r>
+    </w:p>
+    <w:p>
+      <w:pPr>
+        <w:spacing w:after="80" w:line="324" w:lineRule="auto"/>
+      </w:pPr>
+      <w:r>
+        <w:rPr>
+          <w:rFonts w:ascii="微软雅黑" w:hAnsi="微软雅黑" w:eastAsia="微软雅黑"/>
+          <w:b w:val="0"/>
+          <w:sz w:val="22"/>
+        </w:rPr>
+        <w:t>黑板上写：线性加线性还是线性。插入 ReLU 后边界可弯。激活的意义一句话讲完。</w:t>
+      </w:r>
+    </w:p>
+    <w:p>
+      <w:pPr>
+        <w:spacing w:after="80" w:line="324" w:lineRule="auto"/>
+      </w:pPr>
+      <w:r>
+        <w:rPr>
+          <w:rFonts w:ascii="微软雅黑" w:hAnsi="微软雅黑" w:eastAsia="微软雅黑"/>
+          <w:b w:val="0"/>
+          <w:sz w:val="22"/>
+        </w:rPr>
+        <w:t>停一下。请邻座互相用二十秒复述这一点。复述时不允许只念术语，必须带一个例子。例子说不出来，就举手，我再用更土的话讲一遍。</w:t>
+      </w:r>
+    </w:p>
+    <w:p>
+      <w:pPr>
+        <w:spacing w:after="80" w:line="324" w:lineRule="auto"/>
+      </w:pPr>
+      <w:r>
+        <w:rPr>
+          <w:rFonts w:ascii="微软雅黑" w:hAnsi="微软雅黑" w:eastAsia="微软雅黑"/>
+          <w:b/>
+          <w:sz w:val="24"/>
+        </w:rPr>
+        <w:t>情景 2</w:t>
+      </w:r>
+    </w:p>
+    <w:p>
+      <w:pPr>
+        <w:spacing w:after="80" w:line="324" w:lineRule="auto"/>
+      </w:pPr>
+      <w:r>
+        <w:rPr>
+          <w:rFonts w:ascii="微软雅黑" w:hAnsi="微软雅黑" w:eastAsia="微软雅黑"/>
+          <w:b w:val="0"/>
+          <w:sz w:val="22"/>
+        </w:rPr>
+        <w:t>不缩放 vs 缩放 MLP，分数对照。再放一个随机森林分数，讨论小表格谁更合适。</w:t>
+      </w:r>
+    </w:p>
+    <w:p>
+      <w:pPr>
+        <w:spacing w:after="80" w:line="324" w:lineRule="auto"/>
+      </w:pPr>
+      <w:r>
+        <w:rPr>
+          <w:rFonts w:ascii="微软雅黑" w:hAnsi="微软雅黑" w:eastAsia="微软雅黑"/>
+          <w:b w:val="0"/>
+          <w:sz w:val="22"/>
+        </w:rPr>
+        <w:t>停一下。请邻座互相用二十秒复述这一点。复述时不允许只念术语，必须带一个例子。例子说不出来，就举手，我再用更土的话讲一遍。</w:t>
+      </w:r>
+    </w:p>
+    <w:p>
+      <w:pPr>
+        <w:spacing w:after="80" w:line="324" w:lineRule="auto"/>
+      </w:pPr>
+      <w:r>
+        <w:rPr>
+          <w:rFonts w:ascii="微软雅黑" w:hAnsi="微软雅黑" w:eastAsia="微软雅黑"/>
+          <w:b/>
+          <w:sz w:val="24"/>
+        </w:rPr>
+        <w:t>情景 3</w:t>
+      </w:r>
+    </w:p>
+    <w:p>
+      <w:pPr>
+        <w:spacing w:after="80" w:line="324" w:lineRule="auto"/>
+      </w:pPr>
+      <w:r>
+        <w:rPr>
+          <w:rFonts w:ascii="微软雅黑" w:hAnsi="微软雅黑" w:eastAsia="微软雅黑"/>
+          <w:b w:val="0"/>
+          <w:sz w:val="22"/>
+        </w:rPr>
+        <w:t>加宽网络直到测试掉点，展示过拟合。早停想象成「验证集说停就停」。</w:t>
+      </w:r>
+    </w:p>
+    <w:p>
+      <w:pPr>
+        <w:spacing w:after="80" w:line="324" w:lineRule="auto"/>
+      </w:pPr>
+      <w:r>
+        <w:rPr>
+          <w:rFonts w:ascii="微软雅黑" w:hAnsi="微软雅黑" w:eastAsia="微软雅黑"/>
+          <w:b w:val="0"/>
+          <w:sz w:val="22"/>
+        </w:rPr>
+        <w:t>停一下。请邻座互相用二十秒复述这一点。复述时不允许只念术语，必须带一个例子。例子说不出来，就举手，我再用更土的话讲一遍。</w:t>
+      </w:r>
+    </w:p>
+    <w:p>
+      <w:pPr>
+        <w:spacing w:after="80" w:line="324" w:lineRule="auto"/>
+      </w:pPr>
+      <w:r>
+        <w:rPr>
+          <w:rFonts w:ascii="微软雅黑" w:hAnsi="微软雅黑" w:eastAsia="微软雅黑"/>
+          <w:b/>
+          <w:sz w:val="24"/>
+        </w:rPr>
+        <w:t>情景 4</w:t>
+      </w:r>
+    </w:p>
+    <w:p>
+      <w:pPr>
+        <w:spacing w:after="80" w:line="324" w:lineRule="auto"/>
+      </w:pPr>
+      <w:r>
+        <w:rPr>
+          <w:rFonts w:ascii="微软雅黑" w:hAnsi="微软雅黑" w:eastAsia="微软雅黑"/>
+          <w:b w:val="0"/>
+          <w:sz w:val="22"/>
+        </w:rPr>
+        <w:t>手算神经元：两输入一权重一偏置，过 ReLU。交纸质计算，消除神秘感。</w:t>
+      </w:r>
+    </w:p>
+    <w:p>
+      <w:pPr>
+        <w:spacing w:after="80" w:line="324" w:lineRule="auto"/>
+      </w:pPr>
+      <w:r>
+        <w:rPr>
+          <w:rFonts w:ascii="微软雅黑" w:hAnsi="微软雅黑" w:eastAsia="微软雅黑"/>
+          <w:b w:val="0"/>
+          <w:sz w:val="22"/>
+        </w:rPr>
+        <w:t>停一下。请邻座互相用二十秒复述这一点。复述时不允许只念术语，必须带一个例子。例子说不出来，就举手，我再用更土的话讲一遍。</w:t>
+      </w:r>
+    </w:p>
+    <w:p>
+      <w:pPr>
+        <w:spacing w:after="80" w:line="324" w:lineRule="auto"/>
+      </w:pPr>
+      <w:r>
+        <w:rPr>
+          <w:rFonts w:ascii="微软雅黑" w:hAnsi="微软雅黑" w:eastAsia="微软雅黑"/>
+          <w:b w:val="0"/>
+          <w:sz w:val="22"/>
+        </w:rPr>
+        <w:t>情景口述收束：把刚才每个情景对应到你的作业检查清单上。下一次卡住时，先翻清单，再问老师。能自己定位问题，比多听一个名词更值钱。</w:t>
+      </w:r>
+    </w:p>
+    <w:p>
+      <w:pPr>
         <w:spacing w:after="200" w:line="324" w:lineRule="auto"/>
       </w:pPr>
       <w:r>
@@ -15420,6 +17240,188 @@
           <w:sz w:val="22"/>
         </w:rPr>
         <w:t>错例三分类：否定没处理好、分词切错、标注本身吵。每类写一条改法。没有错例的准确率，我不当真。向量化只 fit 火车，再念一遍，和预处理红线对齐。</w:t>
+      </w:r>
+    </w:p>
+    <w:p>
+      <w:pPr>
+        <w:spacing w:after="120" w:line="324" w:lineRule="auto"/>
+      </w:pPr>
+      <w:r>
+        <w:rPr>
+          <w:rFonts w:ascii="微软雅黑" w:hAnsi="微软雅黑" w:eastAsia="微软雅黑"/>
+          <w:b/>
+          <w:sz w:val="26"/>
+        </w:rPr>
+        <w:t>课堂情景口述：文本错例诊所</w:t>
+      </w:r>
+    </w:p>
+    <w:p>
+      <w:pPr>
+        <w:spacing w:after="80" w:line="324" w:lineRule="auto"/>
+      </w:pPr>
+      <w:r>
+        <w:rPr>
+          <w:rFonts w:ascii="微软雅黑" w:hAnsi="微软雅黑" w:eastAsia="微软雅黑"/>
+          <w:b/>
+          <w:sz w:val="24"/>
+        </w:rPr>
+        <w:t>情景 1</w:t>
+      </w:r>
+    </w:p>
+    <w:p>
+      <w:pPr>
+        <w:spacing w:after="80" w:line="324" w:lineRule="auto"/>
+      </w:pPr>
+      <w:r>
+        <w:rPr>
+          <w:rFonts w:ascii="微软雅黑" w:hAnsi="微软雅黑" w:eastAsia="微软雅黑"/>
+          <w:b w:val="0"/>
+          <w:sz w:val="22"/>
+        </w:rPr>
+        <w:t>句子「不喜欢这课」被判正向。分析词袋缺陷，试 bigram。否定诊所第一例。</w:t>
+      </w:r>
+    </w:p>
+    <w:p>
+      <w:pPr>
+        <w:spacing w:after="80" w:line="324" w:lineRule="auto"/>
+      </w:pPr>
+      <w:r>
+        <w:rPr>
+          <w:rFonts w:ascii="微软雅黑" w:hAnsi="微软雅黑" w:eastAsia="微软雅黑"/>
+          <w:b w:val="0"/>
+          <w:sz w:val="22"/>
+        </w:rPr>
+        <w:t>停一下。请邻座互相用二十秒复述这一点。复述时不允许只念术语，必须带一个例子。例子说不出来，就举手，我再用更土的话讲一遍。</w:t>
+      </w:r>
+    </w:p>
+    <w:p>
+      <w:pPr>
+        <w:spacing w:after="80" w:line="324" w:lineRule="auto"/>
+      </w:pPr>
+      <w:r>
+        <w:rPr>
+          <w:rFonts w:ascii="微软雅黑" w:hAnsi="微软雅黑" w:eastAsia="微软雅黑"/>
+          <w:b/>
+          <w:sz w:val="24"/>
+        </w:rPr>
+        <w:t>情景 2</w:t>
+      </w:r>
+    </w:p>
+    <w:p>
+      <w:pPr>
+        <w:spacing w:after="80" w:line="324" w:lineRule="auto"/>
+      </w:pPr>
+      <w:r>
+        <w:rPr>
+          <w:rFonts w:ascii="微软雅黑" w:hAnsi="微软雅黑" w:eastAsia="微软雅黑"/>
+          <w:b w:val="0"/>
+          <w:sz w:val="22"/>
+        </w:rPr>
+        <w:t>分词把专有课名切开，特征碎掉。加自定义词后再跑，对比。</w:t>
+      </w:r>
+    </w:p>
+    <w:p>
+      <w:pPr>
+        <w:spacing w:after="80" w:line="324" w:lineRule="auto"/>
+      </w:pPr>
+      <w:r>
+        <w:rPr>
+          <w:rFonts w:ascii="微软雅黑" w:hAnsi="微软雅黑" w:eastAsia="微软雅黑"/>
+          <w:b w:val="0"/>
+          <w:sz w:val="22"/>
+        </w:rPr>
+        <w:t>停一下。请邻座互相用二十秒复述这一点。复述时不允许只念术语，必须带一个例子。例子说不出来，就举手，我再用更土的话讲一遍。</w:t>
+      </w:r>
+    </w:p>
+    <w:p>
+      <w:pPr>
+        <w:spacing w:after="80" w:line="324" w:lineRule="auto"/>
+      </w:pPr>
+      <w:r>
+        <w:rPr>
+          <w:rFonts w:ascii="微软雅黑" w:hAnsi="微软雅黑" w:eastAsia="微软雅黑"/>
+          <w:b/>
+          <w:sz w:val="24"/>
+        </w:rPr>
+        <w:t>情景 3</w:t>
+      </w:r>
+    </w:p>
+    <w:p>
+      <w:pPr>
+        <w:spacing w:after="80" w:line="324" w:lineRule="auto"/>
+      </w:pPr>
+      <w:r>
+        <w:rPr>
+          <w:rFonts w:ascii="微软雅黑" w:hAnsi="微软雅黑" w:eastAsia="微软雅黑"/>
+          <w:b w:val="0"/>
+          <w:sz w:val="22"/>
+        </w:rPr>
+        <w:t>向量化全语料先 fit 的错误流程 vs Pipeline 正确流程，分数对比，泄漏再提醒。</w:t>
+      </w:r>
+    </w:p>
+    <w:p>
+      <w:pPr>
+        <w:spacing w:after="80" w:line="324" w:lineRule="auto"/>
+      </w:pPr>
+      <w:r>
+        <w:rPr>
+          <w:rFonts w:ascii="微软雅黑" w:hAnsi="微软雅黑" w:eastAsia="微软雅黑"/>
+          <w:b w:val="0"/>
+          <w:sz w:val="22"/>
+        </w:rPr>
+        <w:t>停一下。请邻座互相用二十秒复述这一点。复述时不允许只念术语，必须带一个例子。例子说不出来，就举手，我再用更土的话讲一遍。</w:t>
+      </w:r>
+    </w:p>
+    <w:p>
+      <w:pPr>
+        <w:spacing w:after="80" w:line="324" w:lineRule="auto"/>
+      </w:pPr>
+      <w:r>
+        <w:rPr>
+          <w:rFonts w:ascii="微软雅黑" w:hAnsi="微软雅黑" w:eastAsia="微软雅黑"/>
+          <w:b/>
+          <w:sz w:val="24"/>
+        </w:rPr>
+        <w:t>情景 4</w:t>
+      </w:r>
+    </w:p>
+    <w:p>
+      <w:pPr>
+        <w:spacing w:after="80" w:line="324" w:lineRule="auto"/>
+      </w:pPr>
+      <w:r>
+        <w:rPr>
+          <w:rFonts w:ascii="微软雅黑" w:hAnsi="微软雅黑" w:eastAsia="微软雅黑"/>
+          <w:b w:val="0"/>
+          <w:sz w:val="22"/>
+        </w:rPr>
+        <w:t>作业会审：缺错例的报告当场打回。准确率只是开门，错例才是看病。</w:t>
+      </w:r>
+    </w:p>
+    <w:p>
+      <w:pPr>
+        <w:spacing w:after="80" w:line="324" w:lineRule="auto"/>
+      </w:pPr>
+      <w:r>
+        <w:rPr>
+          <w:rFonts w:ascii="微软雅黑" w:hAnsi="微软雅黑" w:eastAsia="微软雅黑"/>
+          <w:b w:val="0"/>
+          <w:sz w:val="22"/>
+        </w:rPr>
+        <w:t>停一下。请邻座互相用二十秒复述这一点。复述时不允许只念术语，必须带一个例子。例子说不出来，就举手，我再用更土的话讲一遍。</w:t>
+      </w:r>
+    </w:p>
+    <w:p>
+      <w:pPr>
+        <w:spacing w:after="80" w:line="324" w:lineRule="auto"/>
+      </w:pPr>
+      <w:r>
+        <w:rPr>
+          <w:rFonts w:ascii="微软雅黑" w:hAnsi="微软雅黑" w:eastAsia="微软雅黑"/>
+          <w:b w:val="0"/>
+          <w:sz w:val="22"/>
+        </w:rPr>
+        <w:t>情景口述收束：把刚才每个情景对应到你的作业检查清单上。下一次卡住时，先翻清单，再问老师。能自己定位问题，比多听一个名词更值钱。</w:t>
       </w:r>
     </w:p>
     <w:sectPr>

</xml_diff>